<commit_message>
Ticket giveaway (Brit Floyd) and promos in Oct 8 landscape script; ticket sheet and rules
</commit_message>
<xml_diff>
--- a/outputs/recon/2026-10-08/Library Show Final Show Script 2026-10-08 (Landscape Tables).docx
+++ b/outputs/recon/2026-10-08/Library Show Final Show Script 2026-10-08 (Landscape Tables).docx
@@ -2185,6 +2185,79 @@
           </w:p>
         </w:tc>
       </w:tr>
+      <w:tr>
+        <w:trPr>
+          <w:cantSplit/>
+        </w:trPr>
+        <w:tc>
+          <w:tcPr>
+            <w:tcW w:type="dxa" w:w="2600"/>
+            <w:tcBorders>
+              <w:top w:val="single" w:color="B7B7B7" w:sz="4"/>
+              <w:left w:val="single" w:color="B7B7B7" w:sz="4"/>
+              <w:bottom w:val="single" w:color="B7B7B7" w:sz="4"/>
+              <w:right w:val="single" w:color="B7B7B7" w:sz="4"/>
+            </w:tcBorders>
+            <w:shd w:fill="F5F7FA" w:color="auto" w:val="clear"/>
+            <w:tcMar>
+              <w:top w:type="dxa" w:w="50"/>
+              <w:left w:type="dxa" w:w="90"/>
+              <w:bottom w:type="dxa" w:w="50"/>
+              <w:right w:type="dxa" w:w="90"/>
+            </w:tcMar>
+            <w:vAlign w:val="center"/>
+          </w:tcPr>
+          <w:p>
+            <w:pPr>
+              <w:spacing w:after="0" w:before="0"/>
+            </w:pPr>
+            <w:r>
+              <w:rPr>
+                <w:rFonts w:ascii="Arial" w:cs="Arial" w:eastAsia="Arial" w:hAnsi="Arial"/>
+                <w:b/>
+                <w:bCs/>
+                <w:sz w:val="18"/>
+                <w:szCs w:val="18"/>
+              </w:rPr>
+              <w:t xml:space="preserve">Ticket giveaway (new)</w:t>
+            </w:r>
+          </w:p>
+        </w:tc>
+        <w:tc>
+          <w:tcPr>
+            <w:tcW w:type="dxa" w:w="11800"/>
+            <w:tcBorders>
+              <w:top w:val="single" w:color="B7B7B7" w:sz="4"/>
+              <w:left w:val="single" w:color="B7B7B7" w:sz="4"/>
+              <w:bottom w:val="single" w:color="B7B7B7" w:sz="4"/>
+              <w:right w:val="single" w:color="B7B7B7" w:sz="4"/>
+            </w:tcBorders>
+            <w:shd w:fill="F5F7FA" w:color="auto" w:val="clear"/>
+            <w:tcMar>
+              <w:top w:type="dxa" w:w="50"/>
+              <w:left w:type="dxa" w:w="90"/>
+              <w:bottom w:type="dxa" w:w="50"/>
+              <w:right w:type="dxa" w:w="90"/>
+            </w:tcMar>
+            <w:vAlign w:val="center"/>
+          </w:tcPr>
+          <w:p>
+            <w:pPr>
+              <w:spacing w:after="0" w:before="0"/>
+            </w:pPr>
+            <w:r>
+              <w:rPr>
+                <w:rFonts w:ascii="Arial" w:cs="Arial" w:eastAsia="Arial" w:hAnsi="Arial"/>
+                <w:b/>
+                <w:bCs/>
+                <w:sz w:val="18"/>
+                <w:szCs w:val="18"/>
+              </w:rPr>
+              <w:t xml:space="preserve">Brit Floyd, Fox Theater, Oakland, Wed. Oct. 14. 1 ticket. Giveaway after Set 4 in Hour 2. Promo teasers at the opening break, the end of Hour 1 and after the Triple Shot.</w:t>
+            </w:r>
+          </w:p>
+        </w:tc>
+      </w:tr>
     </w:tbl>
     <w:p>
       <w:pPr>
@@ -4464,13 +4537,104 @@
       </w:r>
     </w:p>
     <w:p>
-      <w:r>
-        <w:br w:type="page"/>
-      </w:r>
+      <w:pPr>
+        <w:spacing w:after="120"/>
+      </w:pPr>
     </w:p>
+    <w:tbl>
+      <w:tblPr>
+        <w:tblW w:type="dxa" w:w="14400"/>
+        <w:tblBorders>
+          <w:top w:val="single" w:color="auto" w:sz="4"/>
+          <w:left w:val="single" w:color="auto" w:sz="4"/>
+          <w:bottom w:val="single" w:color="auto" w:sz="4"/>
+          <w:right w:val="single" w:color="auto" w:sz="4"/>
+          <w:insideH w:val="single" w:color="auto" w:sz="4"/>
+          <w:insideV w:val="single" w:color="auto" w:sz="4"/>
+        </w:tblBorders>
+      </w:tblPr>
+      <w:tblGrid>
+        <w:gridCol w:w="2600"/>
+        <w:gridCol w:w="11800"/>
+      </w:tblGrid>
+      <w:tr>
+        <w:trPr>
+          <w:cantSplit/>
+        </w:trPr>
+        <w:tc>
+          <w:tcPr>
+            <w:tcW w:type="dxa" w:w="2600"/>
+            <w:tcBorders>
+              <w:top w:val="single" w:color="B7B7B7" w:sz="4"/>
+              <w:left w:val="single" w:color="B7B7B7" w:sz="4"/>
+              <w:bottom w:val="single" w:color="B7B7B7" w:sz="4"/>
+              <w:right w:val="single" w:color="B7B7B7" w:sz="4"/>
+            </w:tcBorders>
+            <w:shd w:fill="E2F0D9" w:color="auto" w:val="clear"/>
+            <w:tcMar>
+              <w:top w:type="dxa" w:w="50"/>
+              <w:left w:type="dxa" w:w="90"/>
+              <w:bottom w:type="dxa" w:w="50"/>
+              <w:right w:type="dxa" w:w="90"/>
+            </w:tcMar>
+            <w:vAlign w:val="center"/>
+          </w:tcPr>
+          <w:p>
+            <w:pPr>
+              <w:keepNext w:val="false"/>
+              <w:spacing w:after="0" w:before="0"/>
+            </w:pPr>
+            <w:r>
+              <w:rPr>
+                <w:rFonts w:ascii="Arial" w:cs="Arial" w:eastAsia="Arial" w:hAnsi="Arial"/>
+                <w:b/>
+                <w:bCs/>
+                <w:sz w:val="18"/>
+                <w:szCs w:val="18"/>
+              </w:rPr>
+              <w:t xml:space="preserve">MIC BREAK: PROMO</w:t>
+            </w:r>
+          </w:p>
+        </w:tc>
+        <w:tc>
+          <w:tcPr>
+            <w:tcW w:type="dxa" w:w="11800"/>
+            <w:tcBorders>
+              <w:top w:val="single" w:color="B7B7B7" w:sz="4"/>
+              <w:left w:val="single" w:color="B7B7B7" w:sz="4"/>
+              <w:bottom w:val="single" w:color="B7B7B7" w:sz="4"/>
+              <w:right w:val="single" w:color="B7B7B7" w:sz="4"/>
+            </w:tcBorders>
+            <w:shd w:fill="E2F0D9" w:color="auto" w:val="clear"/>
+            <w:tcMar>
+              <w:top w:type="dxa" w:w="50"/>
+              <w:left w:type="dxa" w:w="90"/>
+              <w:bottom w:type="dxa" w:w="50"/>
+              <w:right w:type="dxa" w:w="90"/>
+            </w:tcMar>
+            <w:vAlign w:val="center"/>
+          </w:tcPr>
+          <w:p>
+            <w:pPr>
+              <w:keepNext w:val="false"/>
+              <w:spacing w:after="0" w:before="0"/>
+            </w:pPr>
+            <w:r>
+              <w:rPr>
+                <w:rFonts w:ascii="Arial" w:cs="Arial" w:eastAsia="Arial" w:hAnsi="Arial"/>
+                <w:sz w:val="20"/>
+                <w:szCs w:val="20"/>
+              </w:rPr>
+              <w:t xml:space="preserve">Promo 1 (opening break): "We have a ticket to give away to Brit Floyd at the Fox Theater in Oakland on Wednesday, Oct. 14. That giveaway is in the second hour."</w:t>
+            </w:r>
+          </w:p>
+        </w:tc>
+      </w:tr>
+    </w:tbl>
     <w:p>
       <w:pPr>
         <w:keepNext/>
+        <w:pageBreakBefore/>
         <w:spacing w:after="80" w:before="0"/>
       </w:pPr>
       <w:r>
@@ -9058,14 +9222,100 @@
         <w:spacing w:after="120"/>
       </w:pPr>
     </w:p>
-    <w:p>
-      <w:r>
-        <w:br w:type="page"/>
-      </w:r>
-    </w:p>
+    <w:tbl>
+      <w:tblPr>
+        <w:tblW w:type="dxa" w:w="14400"/>
+        <w:tblBorders>
+          <w:top w:val="single" w:color="auto" w:sz="4"/>
+          <w:left w:val="single" w:color="auto" w:sz="4"/>
+          <w:bottom w:val="single" w:color="auto" w:sz="4"/>
+          <w:right w:val="single" w:color="auto" w:sz="4"/>
+          <w:insideH w:val="single" w:color="auto" w:sz="4"/>
+          <w:insideV w:val="single" w:color="auto" w:sz="4"/>
+        </w:tblBorders>
+      </w:tblPr>
+      <w:tblGrid>
+        <w:gridCol w:w="2600"/>
+        <w:gridCol w:w="11800"/>
+      </w:tblGrid>
+      <w:tr>
+        <w:trPr>
+          <w:cantSplit/>
+        </w:trPr>
+        <w:tc>
+          <w:tcPr>
+            <w:tcW w:type="dxa" w:w="2600"/>
+            <w:tcBorders>
+              <w:top w:val="single" w:color="B7B7B7" w:sz="4"/>
+              <w:left w:val="single" w:color="B7B7B7" w:sz="4"/>
+              <w:bottom w:val="single" w:color="B7B7B7" w:sz="4"/>
+              <w:right w:val="single" w:color="B7B7B7" w:sz="4"/>
+            </w:tcBorders>
+            <w:shd w:fill="E2F0D9" w:color="auto" w:val="clear"/>
+            <w:tcMar>
+              <w:top w:type="dxa" w:w="50"/>
+              <w:left w:type="dxa" w:w="90"/>
+              <w:bottom w:type="dxa" w:w="50"/>
+              <w:right w:type="dxa" w:w="90"/>
+            </w:tcMar>
+            <w:vAlign w:val="center"/>
+          </w:tcPr>
+          <w:p>
+            <w:pPr>
+              <w:keepNext w:val="false"/>
+              <w:spacing w:after="0" w:before="0"/>
+            </w:pPr>
+            <w:r>
+              <w:rPr>
+                <w:rFonts w:ascii="Arial" w:cs="Arial" w:eastAsia="Arial" w:hAnsi="Arial"/>
+                <w:b/>
+                <w:bCs/>
+                <w:sz w:val="18"/>
+                <w:szCs w:val="18"/>
+              </w:rPr>
+              <w:t xml:space="preserve">MIC BREAK: END OF HOUR 1</w:t>
+            </w:r>
+          </w:p>
+        </w:tc>
+        <w:tc>
+          <w:tcPr>
+            <w:tcW w:type="dxa" w:w="11800"/>
+            <w:tcBorders>
+              <w:top w:val="single" w:color="B7B7B7" w:sz="4"/>
+              <w:left w:val="single" w:color="B7B7B7" w:sz="4"/>
+              <w:bottom w:val="single" w:color="B7B7B7" w:sz="4"/>
+              <w:right w:val="single" w:color="B7B7B7" w:sz="4"/>
+            </w:tcBorders>
+            <w:shd w:fill="E2F0D9" w:color="auto" w:val="clear"/>
+            <w:tcMar>
+              <w:top w:type="dxa" w:w="50"/>
+              <w:left w:type="dxa" w:w="90"/>
+              <w:bottom w:type="dxa" w:w="50"/>
+              <w:right w:type="dxa" w:w="90"/>
+            </w:tcMar>
+            <w:vAlign w:val="center"/>
+          </w:tcPr>
+          <w:p>
+            <w:pPr>
+              <w:keepNext w:val="false"/>
+              <w:spacing w:after="0" w:before="0"/>
+            </w:pPr>
+            <w:r>
+              <w:rPr>
+                <w:rFonts w:ascii="Arial" w:cs="Arial" w:eastAsia="Arial" w:hAnsi="Arial"/>
+                <w:sz w:val="20"/>
+                <w:szCs w:val="20"/>
+              </w:rPr>
+              <w:t xml:space="preserve">Promo 2 (end of Hour 1): "Second hour is next, with the Thursday Triple Shot. Later in the hour, one ticket to Brit Floyd at the Fox in Oakland, Wednesday, Oct. 14."</w:t>
+            </w:r>
+          </w:p>
+        </w:tc>
+      </w:tr>
+    </w:tbl>
     <w:p>
       <w:pPr>
         <w:keepNext/>
+        <w:pageBreakBefore/>
         <w:spacing w:after="80" w:before="0"/>
       </w:pPr>
       <w:r>
@@ -10426,6 +10676,101 @@
                 <w:szCs w:val="16"/>
               </w:rPr>
               <w:t xml:space="preserve">New single. Album Do Not Dare to Dream out Fri. Oct. 9 on Merge (track confirmed on the album). Closes the Triple Shot.</w:t>
+            </w:r>
+          </w:p>
+        </w:tc>
+      </w:tr>
+    </w:tbl>
+    <w:p>
+      <w:pPr>
+        <w:spacing w:after="120"/>
+      </w:pPr>
+    </w:p>
+    <w:tbl>
+      <w:tblPr>
+        <w:tblW w:type="dxa" w:w="14400"/>
+        <w:tblBorders>
+          <w:top w:val="single" w:color="auto" w:sz="4"/>
+          <w:left w:val="single" w:color="auto" w:sz="4"/>
+          <w:bottom w:val="single" w:color="auto" w:sz="4"/>
+          <w:right w:val="single" w:color="auto" w:sz="4"/>
+          <w:insideH w:val="single" w:color="auto" w:sz="4"/>
+          <w:insideV w:val="single" w:color="auto" w:sz="4"/>
+        </w:tblBorders>
+      </w:tblPr>
+      <w:tblGrid>
+        <w:gridCol w:w="2600"/>
+        <w:gridCol w:w="11800"/>
+      </w:tblGrid>
+      <w:tr>
+        <w:trPr>
+          <w:cantSplit/>
+        </w:trPr>
+        <w:tc>
+          <w:tcPr>
+            <w:tcW w:type="dxa" w:w="2600"/>
+            <w:tcBorders>
+              <w:top w:val="single" w:color="B7B7B7" w:sz="4"/>
+              <w:left w:val="single" w:color="B7B7B7" w:sz="4"/>
+              <w:bottom w:val="single" w:color="B7B7B7" w:sz="4"/>
+              <w:right w:val="single" w:color="B7B7B7" w:sz="4"/>
+            </w:tcBorders>
+            <w:shd w:fill="E2F0D9" w:color="auto" w:val="clear"/>
+            <w:tcMar>
+              <w:top w:type="dxa" w:w="50"/>
+              <w:left w:type="dxa" w:w="90"/>
+              <w:bottom w:type="dxa" w:w="50"/>
+              <w:right w:type="dxa" w:w="90"/>
+            </w:tcMar>
+            <w:vAlign w:val="center"/>
+          </w:tcPr>
+          <w:p>
+            <w:pPr>
+              <w:keepNext w:val="false"/>
+              <w:spacing w:after="0" w:before="0"/>
+            </w:pPr>
+            <w:r>
+              <w:rPr>
+                <w:rFonts w:ascii="Arial" w:cs="Arial" w:eastAsia="Arial" w:hAnsi="Arial"/>
+                <w:b/>
+                <w:bCs/>
+                <w:sz w:val="18"/>
+                <w:szCs w:val="18"/>
+              </w:rPr>
+              <w:t xml:space="preserve">MIC BREAK: PROMO</w:t>
+            </w:r>
+          </w:p>
+        </w:tc>
+        <w:tc>
+          <w:tcPr>
+            <w:tcW w:type="dxa" w:w="11800"/>
+            <w:tcBorders>
+              <w:top w:val="single" w:color="B7B7B7" w:sz="4"/>
+              <w:left w:val="single" w:color="B7B7B7" w:sz="4"/>
+              <w:bottom w:val="single" w:color="B7B7B7" w:sz="4"/>
+              <w:right w:val="single" w:color="B7B7B7" w:sz="4"/>
+            </w:tcBorders>
+            <w:shd w:fill="E2F0D9" w:color="auto" w:val="clear"/>
+            <w:tcMar>
+              <w:top w:type="dxa" w:w="50"/>
+              <w:left w:type="dxa" w:w="90"/>
+              <w:bottom w:type="dxa" w:w="50"/>
+              <w:right w:type="dxa" w:w="90"/>
+            </w:tcMar>
+            <w:vAlign w:val="center"/>
+          </w:tcPr>
+          <w:p>
+            <w:pPr>
+              <w:keepNext w:val="false"/>
+              <w:spacing w:after="0" w:before="0"/>
+            </w:pPr>
+            <w:r>
+              <w:rPr>
+                <w:rFonts w:ascii="Arial" w:cs="Arial" w:eastAsia="Arial" w:hAnsi="Arial"/>
+                <w:sz w:val="20"/>
+                <w:szCs w:val="20"/>
+              </w:rPr>
+              <w:t xml:space="preserve">Promo 3 (after the Triple Shot): "Coming up after the next set: the ticket giveaway. Brit Floyd, Fox Theater, Oakland, Wednesday, Oct. 14."</w:t>
             </w:r>
           </w:p>
         </w:tc>
@@ -12427,6 +12772,7 @@
           </w:tcPr>
           <w:p>
             <w:pPr>
+              <w:keepNext/>
               <w:spacing w:after="0" w:before="0"/>
             </w:pPr>
             <w:r>
@@ -12462,6 +12808,7 @@
           </w:tcPr>
           <w:p>
             <w:pPr>
+              <w:keepNext/>
               <w:spacing w:after="0" w:before="0"/>
             </w:pPr>
             <w:r>
@@ -12497,6 +12844,7 @@
           </w:tcPr>
           <w:p>
             <w:pPr>
+              <w:keepNext/>
               <w:spacing w:after="0" w:before="0"/>
             </w:pPr>
             <w:r>
@@ -12532,6 +12880,7 @@
           </w:tcPr>
           <w:p>
             <w:pPr>
+              <w:keepNext/>
               <w:spacing w:after="0" w:before="0"/>
             </w:pPr>
             <w:r>
@@ -12567,6 +12916,7 @@
           </w:tcPr>
           <w:p>
             <w:pPr>
+              <w:keepNext/>
               <w:spacing w:after="0" w:before="0"/>
             </w:pPr>
             <w:r>
@@ -12606,6 +12956,7 @@
           </w:tcPr>
           <w:p>
             <w:pPr>
+              <w:keepNext/>
               <w:spacing w:after="0" w:before="0"/>
             </w:pPr>
             <w:r>
@@ -12637,6 +12988,7 @@
           </w:tcPr>
           <w:p>
             <w:pPr>
+              <w:keepNext/>
               <w:spacing w:after="0" w:before="0"/>
             </w:pPr>
             <w:r>
@@ -12668,6 +13020,7 @@
           </w:tcPr>
           <w:p>
             <w:pPr>
+              <w:keepNext/>
               <w:spacing w:after="0" w:before="0"/>
             </w:pPr>
             <w:r>
@@ -12699,6 +13052,7 @@
           </w:tcPr>
           <w:p>
             <w:pPr>
+              <w:keepNext/>
               <w:spacing w:after="0" w:before="0"/>
             </w:pPr>
             <w:r>
@@ -12730,6 +13084,7 @@
           </w:tcPr>
           <w:p>
             <w:pPr>
+              <w:keepNext/>
               <w:spacing w:after="0" w:before="0"/>
             </w:pPr>
             <w:r>
@@ -12767,6 +13122,7 @@
           </w:tcPr>
           <w:p>
             <w:pPr>
+              <w:keepNext/>
               <w:spacing w:after="0" w:before="0"/>
             </w:pPr>
             <w:r>
@@ -12801,6 +13157,7 @@
           </w:tcPr>
           <w:p>
             <w:pPr>
+              <w:keepNext/>
               <w:spacing w:after="0" w:before="0"/>
             </w:pPr>
             <w:r>
@@ -12833,6 +13190,7 @@
           </w:tcPr>
           <w:p>
             <w:pPr>
+              <w:keepNext/>
               <w:spacing w:after="0" w:before="0"/>
             </w:pPr>
             <w:r>
@@ -12865,6 +13223,7 @@
           </w:tcPr>
           <w:p>
             <w:pPr>
+              <w:keepNext/>
               <w:spacing w:after="0" w:before="0"/>
             </w:pPr>
             <w:r>
@@ -12897,6 +13256,7 @@
           </w:tcPr>
           <w:p>
             <w:pPr>
+              <w:keepNext/>
               <w:spacing w:after="0" w:before="0"/>
             </w:pPr>
             <w:r>
@@ -12933,6 +13293,7 @@
           </w:tcPr>
           <w:p>
             <w:pPr>
+              <w:keepNext/>
               <w:spacing w:after="0" w:before="0"/>
             </w:pPr>
             <w:r>
@@ -12964,6 +13325,7 @@
           </w:tcPr>
           <w:p>
             <w:pPr>
+              <w:keepNext/>
               <w:spacing w:after="0" w:before="0"/>
             </w:pPr>
             <w:r>
@@ -12995,6 +13357,7 @@
           </w:tcPr>
           <w:p>
             <w:pPr>
+              <w:keepNext/>
               <w:spacing w:after="0" w:before="0"/>
             </w:pPr>
             <w:r>
@@ -13026,6 +13389,7 @@
           </w:tcPr>
           <w:p>
             <w:pPr>
+              <w:keepNext/>
               <w:spacing w:after="0" w:before="0"/>
             </w:pPr>
             <w:r>
@@ -13058,6 +13422,7 @@
           </w:tcPr>
           <w:p>
             <w:pPr>
+              <w:keepNext/>
               <w:spacing w:after="0" w:before="0"/>
             </w:pPr>
             <w:r>
@@ -13095,6 +13460,7 @@
           </w:tcPr>
           <w:p>
             <w:pPr>
+              <w:keepNext/>
               <w:spacing w:after="0" w:before="0"/>
             </w:pPr>
             <w:r>
@@ -13127,6 +13493,7 @@
           </w:tcPr>
           <w:p>
             <w:pPr>
+              <w:keepNext/>
               <w:spacing w:after="0" w:before="0"/>
             </w:pPr>
             <w:r>
@@ -13159,6 +13526,7 @@
           </w:tcPr>
           <w:p>
             <w:pPr>
+              <w:keepNext/>
               <w:spacing w:after="0" w:before="0"/>
             </w:pPr>
             <w:r>
@@ -13191,6 +13559,7 @@
           </w:tcPr>
           <w:p>
             <w:pPr>
+              <w:keepNext/>
               <w:spacing w:after="0" w:before="0"/>
             </w:pPr>
             <w:r>
@@ -13223,6 +13592,7 @@
           </w:tcPr>
           <w:p>
             <w:pPr>
+              <w:keepNext/>
               <w:spacing w:after="0" w:before="0"/>
             </w:pPr>
             <w:r>
@@ -13259,6 +13629,7 @@
           </w:tcPr>
           <w:p>
             <w:pPr>
+              <w:keepNext/>
               <w:spacing w:after="0" w:before="0"/>
             </w:pPr>
             <w:r>
@@ -13290,6 +13661,7 @@
           </w:tcPr>
           <w:p>
             <w:pPr>
+              <w:keepNext/>
               <w:spacing w:after="0" w:before="0"/>
             </w:pPr>
             <w:r>
@@ -13321,6 +13693,7 @@
           </w:tcPr>
           <w:p>
             <w:pPr>
+              <w:keepNext/>
               <w:spacing w:after="0" w:before="0"/>
             </w:pPr>
             <w:r>
@@ -13352,6 +13725,7 @@
           </w:tcPr>
           <w:p>
             <w:pPr>
+              <w:keepNext/>
               <w:spacing w:after="0" w:before="0"/>
             </w:pPr>
             <w:r>
@@ -13383,6 +13757,7 @@
           </w:tcPr>
           <w:p>
             <w:pPr>
+              <w:keepNext/>
               <w:spacing w:after="0" w:before="0"/>
             </w:pPr>
             <w:r>
@@ -13420,6 +13795,7 @@
           </w:tcPr>
           <w:p>
             <w:pPr>
+              <w:keepNext/>
               <w:spacing w:after="0" w:before="0"/>
             </w:pPr>
             <w:r>
@@ -13452,6 +13828,7 @@
           </w:tcPr>
           <w:p>
             <w:pPr>
+              <w:keepNext/>
               <w:spacing w:after="0" w:before="0"/>
             </w:pPr>
             <w:r>
@@ -13484,6 +13861,7 @@
           </w:tcPr>
           <w:p>
             <w:pPr>
+              <w:keepNext/>
               <w:spacing w:after="0" w:before="0"/>
             </w:pPr>
             <w:r>
@@ -13516,6 +13894,7 @@
           </w:tcPr>
           <w:p>
             <w:pPr>
+              <w:keepNext/>
               <w:spacing w:after="0" w:before="0"/>
             </w:pPr>
             <w:r>
@@ -13549,6 +13928,7 @@
           </w:tcPr>
           <w:p>
             <w:pPr>
+              <w:keepNext/>
               <w:spacing w:after="0" w:before="0"/>
             </w:pPr>
             <w:r>
@@ -13585,6 +13965,7 @@
           </w:tcPr>
           <w:p>
             <w:pPr>
+              <w:keepNext w:val="false"/>
               <w:spacing w:after="0" w:before="0"/>
             </w:pPr>
             <w:r>
@@ -13616,6 +13997,7 @@
           </w:tcPr>
           <w:p>
             <w:pPr>
+              <w:keepNext w:val="false"/>
               <w:spacing w:after="0" w:before="0"/>
             </w:pPr>
             <w:r>
@@ -13647,6 +14029,7 @@
           </w:tcPr>
           <w:p>
             <w:pPr>
+              <w:keepNext w:val="false"/>
               <w:spacing w:after="0" w:before="0"/>
             </w:pPr>
             <w:r>
@@ -13678,6 +14061,7 @@
           </w:tcPr>
           <w:p>
             <w:pPr>
+              <w:keepNext w:val="false"/>
               <w:spacing w:after="0" w:before="0"/>
             </w:pPr>
             <w:r>
@@ -13709,6 +14093,7 @@
           </w:tcPr>
           <w:p>
             <w:pPr>
+              <w:keepNext w:val="false"/>
               <w:spacing w:after="0" w:before="0"/>
             </w:pPr>
             <w:r>
@@ -13718,6 +14103,783 @@
                 <w:szCs w:val="18"/>
               </w:rPr>
               <w:t xml:space="preserve">Not in set</w:t>
+            </w:r>
+          </w:p>
+        </w:tc>
+      </w:tr>
+    </w:tbl>
+    <w:p>
+      <w:pPr>
+        <w:spacing w:after="120"/>
+      </w:pPr>
+    </w:p>
+    <w:p>
+      <w:pPr>
+        <w:keepNext/>
+        <w:spacing w:after="80" w:before="0"/>
+      </w:pPr>
+      <w:r>
+        <w:rPr>
+          <w:rFonts w:ascii="Arial" w:cs="Arial" w:eastAsia="Arial" w:hAnsi="Arial"/>
+          <w:b/>
+          <w:bCs/>
+          <w:color w:val="1F3864"/>
+          <w:sz w:val="22"/>
+          <w:szCs w:val="22"/>
+        </w:rPr>
+        <w:t xml:space="preserve">TICKET GIVEAWAY (after the Bay Area shows break)</w:t>
+      </w:r>
+    </w:p>
+    <w:tbl>
+      <w:tblPr>
+        <w:tblW w:type="dxa" w:w="14400"/>
+        <w:tblBorders>
+          <w:top w:val="single" w:color="auto" w:sz="4"/>
+          <w:left w:val="single" w:color="auto" w:sz="4"/>
+          <w:bottom w:val="single" w:color="auto" w:sz="4"/>
+          <w:right w:val="single" w:color="auto" w:sz="4"/>
+          <w:insideH w:val="single" w:color="auto" w:sz="4"/>
+          <w:insideV w:val="single" w:color="auto" w:sz="4"/>
+        </w:tblBorders>
+      </w:tblPr>
+      <w:tblGrid>
+        <w:gridCol w:w="2300"/>
+        <w:gridCol w:w="3000"/>
+        <w:gridCol w:w="2800"/>
+        <w:gridCol w:w="2000"/>
+        <w:gridCol w:w="1000"/>
+        <w:gridCol w:w="3300"/>
+      </w:tblGrid>
+      <w:tr>
+        <w:trPr>
+          <w:cantSplit/>
+          <w:tblHeader/>
+        </w:trPr>
+        <w:tc>
+          <w:tcPr>
+            <w:tcW w:type="dxa" w:w="2300"/>
+            <w:tcBorders>
+              <w:top w:val="single" w:color="B7B7B7" w:sz="4"/>
+              <w:left w:val="single" w:color="B7B7B7" w:sz="4"/>
+              <w:bottom w:val="single" w:color="B7B7B7" w:sz="4"/>
+              <w:right w:val="single" w:color="B7B7B7" w:sz="4"/>
+            </w:tcBorders>
+            <w:shd w:fill="1F3864" w:color="auto" w:val="clear"/>
+            <w:tcMar>
+              <w:top w:type="dxa" w:w="50"/>
+              <w:left w:type="dxa" w:w="90"/>
+              <w:bottom w:type="dxa" w:w="50"/>
+              <w:right w:type="dxa" w:w="90"/>
+            </w:tcMar>
+            <w:vAlign w:val="center"/>
+          </w:tcPr>
+          <w:p>
+            <w:pPr>
+              <w:keepNext/>
+              <w:spacing w:after="0" w:before="0"/>
+            </w:pPr>
+            <w:r>
+              <w:rPr>
+                <w:rFonts w:ascii="Arial" w:cs="Arial" w:eastAsia="Arial" w:hAnsi="Arial"/>
+                <w:b/>
+                <w:bCs/>
+                <w:color w:val="FFFFFF"/>
+                <w:sz w:val="18"/>
+                <w:szCs w:val="18"/>
+              </w:rPr>
+              <w:t xml:space="preserve">Act</w:t>
+            </w:r>
+          </w:p>
+        </w:tc>
+        <w:tc>
+          <w:tcPr>
+            <w:tcW w:type="dxa" w:w="3000"/>
+            <w:tcBorders>
+              <w:top w:val="single" w:color="B7B7B7" w:sz="4"/>
+              <w:left w:val="single" w:color="B7B7B7" w:sz="4"/>
+              <w:bottom w:val="single" w:color="B7B7B7" w:sz="4"/>
+              <w:right w:val="single" w:color="B7B7B7" w:sz="4"/>
+            </w:tcBorders>
+            <w:shd w:fill="1F3864" w:color="auto" w:val="clear"/>
+            <w:tcMar>
+              <w:top w:type="dxa" w:w="50"/>
+              <w:left w:type="dxa" w:w="90"/>
+              <w:bottom w:type="dxa" w:w="50"/>
+              <w:right w:type="dxa" w:w="90"/>
+            </w:tcMar>
+            <w:vAlign w:val="center"/>
+          </w:tcPr>
+          <w:p>
+            <w:pPr>
+              <w:keepNext/>
+              <w:spacing w:after="0" w:before="0"/>
+            </w:pPr>
+            <w:r>
+              <w:rPr>
+                <w:rFonts w:ascii="Arial" w:cs="Arial" w:eastAsia="Arial" w:hAnsi="Arial"/>
+                <w:b/>
+                <w:bCs/>
+                <w:color w:val="FFFFFF"/>
+                <w:sz w:val="18"/>
+                <w:szCs w:val="18"/>
+              </w:rPr>
+              <w:t xml:space="preserve">Type</w:t>
+            </w:r>
+          </w:p>
+        </w:tc>
+        <w:tc>
+          <w:tcPr>
+            <w:tcW w:type="dxa" w:w="2800"/>
+            <w:tcBorders>
+              <w:top w:val="single" w:color="B7B7B7" w:sz="4"/>
+              <w:left w:val="single" w:color="B7B7B7" w:sz="4"/>
+              <w:bottom w:val="single" w:color="B7B7B7" w:sz="4"/>
+              <w:right w:val="single" w:color="B7B7B7" w:sz="4"/>
+            </w:tcBorders>
+            <w:shd w:fill="1F3864" w:color="auto" w:val="clear"/>
+            <w:tcMar>
+              <w:top w:type="dxa" w:w="50"/>
+              <w:left w:type="dxa" w:w="90"/>
+              <w:bottom w:type="dxa" w:w="50"/>
+              <w:right w:type="dxa" w:w="90"/>
+            </w:tcMar>
+            <w:vAlign w:val="center"/>
+          </w:tcPr>
+          <w:p>
+            <w:pPr>
+              <w:keepNext/>
+              <w:spacing w:after="0" w:before="0"/>
+            </w:pPr>
+            <w:r>
+              <w:rPr>
+                <w:rFonts w:ascii="Arial" w:cs="Arial" w:eastAsia="Arial" w:hAnsi="Arial"/>
+                <w:b/>
+                <w:bCs/>
+                <w:color w:val="FFFFFF"/>
+                <w:sz w:val="18"/>
+                <w:szCs w:val="18"/>
+              </w:rPr>
+              <w:t xml:space="preserve">Venue</w:t>
+            </w:r>
+          </w:p>
+        </w:tc>
+        <w:tc>
+          <w:tcPr>
+            <w:tcW w:type="dxa" w:w="2000"/>
+            <w:tcBorders>
+              <w:top w:val="single" w:color="B7B7B7" w:sz="4"/>
+              <w:left w:val="single" w:color="B7B7B7" w:sz="4"/>
+              <w:bottom w:val="single" w:color="B7B7B7" w:sz="4"/>
+              <w:right w:val="single" w:color="B7B7B7" w:sz="4"/>
+            </w:tcBorders>
+            <w:shd w:fill="1F3864" w:color="auto" w:val="clear"/>
+            <w:tcMar>
+              <w:top w:type="dxa" w:w="50"/>
+              <w:left w:type="dxa" w:w="90"/>
+              <w:bottom w:type="dxa" w:w="50"/>
+              <w:right w:type="dxa" w:w="90"/>
+            </w:tcMar>
+            <w:vAlign w:val="center"/>
+          </w:tcPr>
+          <w:p>
+            <w:pPr>
+              <w:keepNext/>
+              <w:spacing w:after="0" w:before="0"/>
+            </w:pPr>
+            <w:r>
+              <w:rPr>
+                <w:rFonts w:ascii="Arial" w:cs="Arial" w:eastAsia="Arial" w:hAnsi="Arial"/>
+                <w:b/>
+                <w:bCs/>
+                <w:color w:val="FFFFFF"/>
+                <w:sz w:val="18"/>
+                <w:szCs w:val="18"/>
+              </w:rPr>
+              <w:t xml:space="preserve">Date</w:t>
+            </w:r>
+          </w:p>
+        </w:tc>
+        <w:tc>
+          <w:tcPr>
+            <w:tcW w:type="dxa" w:w="1000"/>
+            <w:tcBorders>
+              <w:top w:val="single" w:color="B7B7B7" w:sz="4"/>
+              <w:left w:val="single" w:color="B7B7B7" w:sz="4"/>
+              <w:bottom w:val="single" w:color="B7B7B7" w:sz="4"/>
+              <w:right w:val="single" w:color="B7B7B7" w:sz="4"/>
+            </w:tcBorders>
+            <w:shd w:fill="1F3864" w:color="auto" w:val="clear"/>
+            <w:tcMar>
+              <w:top w:type="dxa" w:w="50"/>
+              <w:left w:type="dxa" w:w="90"/>
+              <w:bottom w:type="dxa" w:w="50"/>
+              <w:right w:type="dxa" w:w="90"/>
+            </w:tcMar>
+            <w:vAlign w:val="center"/>
+          </w:tcPr>
+          <w:p>
+            <w:pPr>
+              <w:keepNext/>
+              <w:spacing w:after="0" w:before="0"/>
+            </w:pPr>
+            <w:r>
+              <w:rPr>
+                <w:rFonts w:ascii="Arial" w:cs="Arial" w:eastAsia="Arial" w:hAnsi="Arial"/>
+                <w:b/>
+                <w:bCs/>
+                <w:color w:val="FFFFFF"/>
+                <w:sz w:val="18"/>
+                <w:szCs w:val="18"/>
+              </w:rPr>
+              <w:t xml:space="preserve">Tickets</w:t>
+            </w:r>
+          </w:p>
+        </w:tc>
+        <w:tc>
+          <w:tcPr>
+            <w:tcW w:type="dxa" w:w="3300"/>
+            <w:tcBorders>
+              <w:top w:val="single" w:color="B7B7B7" w:sz="4"/>
+              <w:left w:val="single" w:color="B7B7B7" w:sz="4"/>
+              <w:bottom w:val="single" w:color="B7B7B7" w:sz="4"/>
+              <w:right w:val="single" w:color="B7B7B7" w:sz="4"/>
+            </w:tcBorders>
+            <w:shd w:fill="1F3864" w:color="auto" w:val="clear"/>
+            <w:tcMar>
+              <w:top w:type="dxa" w:w="50"/>
+              <w:left w:type="dxa" w:w="90"/>
+              <w:bottom w:type="dxa" w:w="50"/>
+              <w:right w:type="dxa" w:w="90"/>
+            </w:tcMar>
+            <w:vAlign w:val="center"/>
+          </w:tcPr>
+          <w:p>
+            <w:pPr>
+              <w:keepNext/>
+              <w:spacing w:after="0" w:before="0"/>
+            </w:pPr>
+            <w:r>
+              <w:rPr>
+                <w:rFonts w:ascii="Arial" w:cs="Arial" w:eastAsia="Arial" w:hAnsi="Arial"/>
+                <w:b/>
+                <w:bCs/>
+                <w:color w:val="FFFFFF"/>
+                <w:sz w:val="18"/>
+                <w:szCs w:val="18"/>
+              </w:rPr>
+              <w:t xml:space="preserve">Give by</w:t>
+            </w:r>
+          </w:p>
+        </w:tc>
+      </w:tr>
+      <w:tr>
+        <w:trPr>
+          <w:cantSplit/>
+        </w:trPr>
+        <w:tc>
+          <w:tcPr>
+            <w:tcW w:type="dxa" w:w="2300"/>
+            <w:tcBorders>
+              <w:top w:val="single" w:color="B7B7B7" w:sz="4"/>
+              <w:left w:val="single" w:color="B7B7B7" w:sz="4"/>
+              <w:bottom w:val="single" w:color="B7B7B7" w:sz="4"/>
+              <w:right w:val="single" w:color="B7B7B7" w:sz="4"/>
+            </w:tcBorders>
+            <w:tcMar>
+              <w:top w:type="dxa" w:w="50"/>
+              <w:left w:type="dxa" w:w="90"/>
+              <w:bottom w:type="dxa" w:w="50"/>
+              <w:right w:type="dxa" w:w="90"/>
+            </w:tcMar>
+            <w:vAlign w:val="center"/>
+          </w:tcPr>
+          <w:p>
+            <w:pPr>
+              <w:keepNext w:val="false"/>
+              <w:spacing w:after="0" w:before="0"/>
+            </w:pPr>
+            <w:r>
+              <w:rPr>
+                <w:rFonts w:ascii="Arial" w:cs="Arial" w:eastAsia="Arial" w:hAnsi="Arial"/>
+                <w:b/>
+                <w:bCs/>
+                <w:sz w:val="18"/>
+                <w:szCs w:val="18"/>
+              </w:rPr>
+              <w:t xml:space="preserve">Brit Floyd</w:t>
+            </w:r>
+          </w:p>
+        </w:tc>
+        <w:tc>
+          <w:tcPr>
+            <w:tcW w:type="dxa" w:w="3000"/>
+            <w:tcBorders>
+              <w:top w:val="single" w:color="B7B7B7" w:sz="4"/>
+              <w:left w:val="single" w:color="B7B7B7" w:sz="4"/>
+              <w:bottom w:val="single" w:color="B7B7B7" w:sz="4"/>
+              <w:right w:val="single" w:color="B7B7B7" w:sz="4"/>
+            </w:tcBorders>
+            <w:tcMar>
+              <w:top w:type="dxa" w:w="50"/>
+              <w:left w:type="dxa" w:w="90"/>
+              <w:bottom w:type="dxa" w:w="50"/>
+              <w:right w:type="dxa" w:w="90"/>
+            </w:tcMar>
+            <w:vAlign w:val="center"/>
+          </w:tcPr>
+          <w:p>
+            <w:pPr>
+              <w:keepNext w:val="false"/>
+              <w:spacing w:after="0" w:before="0"/>
+            </w:pPr>
+            <w:r>
+              <w:rPr>
+                <w:rFonts w:ascii="Arial" w:cs="Arial" w:eastAsia="Arial" w:hAnsi="Arial"/>
+                <w:sz w:val="18"/>
+                <w:szCs w:val="18"/>
+              </w:rPr>
+              <w:t xml:space="preserve">classic rock cover band (Pink Floyd tribute)</w:t>
+            </w:r>
+          </w:p>
+        </w:tc>
+        <w:tc>
+          <w:tcPr>
+            <w:tcW w:type="dxa" w:w="2800"/>
+            <w:tcBorders>
+              <w:top w:val="single" w:color="B7B7B7" w:sz="4"/>
+              <w:left w:val="single" w:color="B7B7B7" w:sz="4"/>
+              <w:bottom w:val="single" w:color="B7B7B7" w:sz="4"/>
+              <w:right w:val="single" w:color="B7B7B7" w:sz="4"/>
+            </w:tcBorders>
+            <w:tcMar>
+              <w:top w:type="dxa" w:w="50"/>
+              <w:left w:type="dxa" w:w="90"/>
+              <w:bottom w:type="dxa" w:w="50"/>
+              <w:right w:type="dxa" w:w="90"/>
+            </w:tcMar>
+            <w:vAlign w:val="center"/>
+          </w:tcPr>
+          <w:p>
+            <w:pPr>
+              <w:keepNext w:val="false"/>
+              <w:spacing w:after="0" w:before="0"/>
+            </w:pPr>
+            <w:r>
+              <w:rPr>
+                <w:rFonts w:ascii="Arial" w:cs="Arial" w:eastAsia="Arial" w:hAnsi="Arial"/>
+                <w:sz w:val="18"/>
+                <w:szCs w:val="18"/>
+              </w:rPr>
+              <w:t xml:space="preserve">Fox Theater, Oakland</w:t>
+            </w:r>
+          </w:p>
+        </w:tc>
+        <w:tc>
+          <w:tcPr>
+            <w:tcW w:type="dxa" w:w="2000"/>
+            <w:tcBorders>
+              <w:top w:val="single" w:color="B7B7B7" w:sz="4"/>
+              <w:left w:val="single" w:color="B7B7B7" w:sz="4"/>
+              <w:bottom w:val="single" w:color="B7B7B7" w:sz="4"/>
+              <w:right w:val="single" w:color="B7B7B7" w:sz="4"/>
+            </w:tcBorders>
+            <w:tcMar>
+              <w:top w:type="dxa" w:w="50"/>
+              <w:left w:type="dxa" w:w="90"/>
+              <w:bottom w:type="dxa" w:w="50"/>
+              <w:right w:type="dxa" w:w="90"/>
+            </w:tcMar>
+            <w:vAlign w:val="center"/>
+          </w:tcPr>
+          <w:p>
+            <w:pPr>
+              <w:keepNext w:val="false"/>
+              <w:spacing w:after="0" w:before="0"/>
+            </w:pPr>
+            <w:r>
+              <w:rPr>
+                <w:rFonts w:ascii="Arial" w:cs="Arial" w:eastAsia="Arial" w:hAnsi="Arial"/>
+                <w:b/>
+                <w:bCs/>
+                <w:sz w:val="18"/>
+                <w:szCs w:val="18"/>
+              </w:rPr>
+              <w:t xml:space="preserve">Wed. Oct. 14, 2026</w:t>
+            </w:r>
+          </w:p>
+        </w:tc>
+        <w:tc>
+          <w:tcPr>
+            <w:tcW w:type="dxa" w:w="1000"/>
+            <w:tcBorders>
+              <w:top w:val="single" w:color="B7B7B7" w:sz="4"/>
+              <w:left w:val="single" w:color="B7B7B7" w:sz="4"/>
+              <w:bottom w:val="single" w:color="B7B7B7" w:sz="4"/>
+              <w:right w:val="single" w:color="B7B7B7" w:sz="4"/>
+            </w:tcBorders>
+            <w:tcMar>
+              <w:top w:type="dxa" w:w="50"/>
+              <w:left w:type="dxa" w:w="90"/>
+              <w:bottom w:type="dxa" w:w="50"/>
+              <w:right w:type="dxa" w:w="90"/>
+            </w:tcMar>
+            <w:vAlign w:val="center"/>
+          </w:tcPr>
+          <w:p>
+            <w:pPr>
+              <w:keepNext w:val="false"/>
+              <w:spacing w:after="0" w:before="0"/>
+            </w:pPr>
+            <w:r>
+              <w:rPr>
+                <w:rFonts w:ascii="Arial" w:cs="Arial" w:eastAsia="Arial" w:hAnsi="Arial"/>
+                <w:sz w:val="18"/>
+                <w:szCs w:val="18"/>
+              </w:rPr>
+              <w:t xml:space="preserve">1</w:t>
+            </w:r>
+          </w:p>
+        </w:tc>
+        <w:tc>
+          <w:tcPr>
+            <w:tcW w:type="dxa" w:w="3300"/>
+            <w:tcBorders>
+              <w:top w:val="single" w:color="B7B7B7" w:sz="4"/>
+              <w:left w:val="single" w:color="B7B7B7" w:sz="4"/>
+              <w:bottom w:val="single" w:color="B7B7B7" w:sz="4"/>
+              <w:right w:val="single" w:color="B7B7B7" w:sz="4"/>
+            </w:tcBorders>
+            <w:tcMar>
+              <w:top w:type="dxa" w:w="50"/>
+              <w:left w:type="dxa" w:w="90"/>
+              <w:bottom w:type="dxa" w:w="50"/>
+              <w:right w:type="dxa" w:w="90"/>
+            </w:tcMar>
+            <w:vAlign w:val="center"/>
+          </w:tcPr>
+          <w:p>
+            <w:pPr>
+              <w:keepNext w:val="false"/>
+              <w:spacing w:after="0" w:before="0"/>
+            </w:pPr>
+            <w:r>
+              <w:rPr>
+                <w:rFonts w:ascii="Arial" w:cs="Arial" w:eastAsia="Arial" w:hAnsi="Arial"/>
+                <w:b/>
+                <w:bCs/>
+                <w:sz w:val="18"/>
+                <w:szCs w:val="18"/>
+              </w:rPr>
+              <w:t xml:space="preserve">Tue. Oct. 13 (winner picked by then)</w:t>
+            </w:r>
+          </w:p>
+        </w:tc>
+      </w:tr>
+    </w:tbl>
+    <w:tbl>
+      <w:tblPr>
+        <w:tblW w:type="dxa" w:w="14400"/>
+        <w:tblBorders>
+          <w:top w:val="single" w:color="auto" w:sz="4"/>
+          <w:left w:val="single" w:color="auto" w:sz="4"/>
+          <w:bottom w:val="single" w:color="auto" w:sz="4"/>
+          <w:right w:val="single" w:color="auto" w:sz="4"/>
+          <w:insideH w:val="single" w:color="auto" w:sz="4"/>
+          <w:insideV w:val="single" w:color="auto" w:sz="4"/>
+        </w:tblBorders>
+      </w:tblPr>
+      <w:tblGrid>
+        <w:gridCol w:w="2600"/>
+        <w:gridCol w:w="11800"/>
+      </w:tblGrid>
+      <w:tr>
+        <w:trPr>
+          <w:cantSplit/>
+        </w:trPr>
+        <w:tc>
+          <w:tcPr>
+            <w:tcW w:type="dxa" w:w="2600"/>
+            <w:tcBorders>
+              <w:top w:val="single" w:color="B7B7B7" w:sz="4"/>
+              <w:left w:val="single" w:color="B7B7B7" w:sz="4"/>
+              <w:bottom w:val="single" w:color="B7B7B7" w:sz="4"/>
+              <w:right w:val="single" w:color="B7B7B7" w:sz="4"/>
+            </w:tcBorders>
+            <w:shd w:fill="E2F0D9" w:color="auto" w:val="clear"/>
+            <w:tcMar>
+              <w:top w:type="dxa" w:w="50"/>
+              <w:left w:type="dxa" w:w="90"/>
+              <w:bottom w:type="dxa" w:w="50"/>
+              <w:right w:type="dxa" w:w="90"/>
+            </w:tcMar>
+            <w:vAlign w:val="center"/>
+          </w:tcPr>
+          <w:p>
+            <w:pPr>
+              <w:keepNext/>
+              <w:spacing w:after="0" w:before="0"/>
+            </w:pPr>
+            <w:r>
+              <w:rPr>
+                <w:rFonts w:ascii="Arial" w:cs="Arial" w:eastAsia="Arial" w:hAnsi="Arial"/>
+                <w:b/>
+                <w:bCs/>
+                <w:sz w:val="18"/>
+                <w:szCs w:val="18"/>
+              </w:rPr>
+              <w:t xml:space="preserve">MIC BREAK: GIVEAWAY</w:t>
+            </w:r>
+          </w:p>
+        </w:tc>
+        <w:tc>
+          <w:tcPr>
+            <w:tcW w:type="dxa" w:w="11800"/>
+            <w:tcBorders>
+              <w:top w:val="single" w:color="B7B7B7" w:sz="4"/>
+              <w:left w:val="single" w:color="B7B7B7" w:sz="4"/>
+              <w:bottom w:val="single" w:color="B7B7B7" w:sz="4"/>
+              <w:right w:val="single" w:color="B7B7B7" w:sz="4"/>
+            </w:tcBorders>
+            <w:shd w:fill="E2F0D9" w:color="auto" w:val="clear"/>
+            <w:tcMar>
+              <w:top w:type="dxa" w:w="50"/>
+              <w:left w:type="dxa" w:w="90"/>
+              <w:bottom w:type="dxa" w:w="50"/>
+              <w:right w:type="dxa" w:w="90"/>
+            </w:tcMar>
+            <w:vAlign w:val="center"/>
+          </w:tcPr>
+          <w:p>
+            <w:pPr>
+              <w:keepNext/>
+              <w:spacing w:after="0" w:before="0"/>
+            </w:pPr>
+            <w:r>
+              <w:rPr>
+                <w:rFonts w:ascii="Arial" w:cs="Arial" w:eastAsia="Arial" w:hAnsi="Arial"/>
+                <w:sz w:val="20"/>
+                <w:szCs w:val="20"/>
+              </w:rPr>
+              <w:t xml:space="preserve">Read: "Brit Floyd plays the Fox Theater in Oakland on Wednesday, Oct. 14. We have 1 ticket to give away."</w:t>
+            </w:r>
+          </w:p>
+        </w:tc>
+      </w:tr>
+      <w:tr>
+        <w:trPr>
+          <w:cantSplit/>
+        </w:trPr>
+        <w:tc>
+          <w:tcPr>
+            <w:tcW w:type="dxa" w:w="2600"/>
+            <w:tcBorders>
+              <w:top w:val="single" w:color="B7B7B7" w:sz="4"/>
+              <w:left w:val="single" w:color="B7B7B7" w:sz="4"/>
+              <w:bottom w:val="single" w:color="B7B7B7" w:sz="4"/>
+              <w:right w:val="single" w:color="B7B7B7" w:sz="4"/>
+            </w:tcBorders>
+            <w:shd w:fill="E2F0D9" w:color="auto" w:val="clear"/>
+            <w:tcMar>
+              <w:top w:type="dxa" w:w="50"/>
+              <w:left w:type="dxa" w:w="90"/>
+              <w:bottom w:type="dxa" w:w="50"/>
+              <w:right w:type="dxa" w:w="90"/>
+            </w:tcMar>
+            <w:vAlign w:val="center"/>
+          </w:tcPr>
+          <w:p>
+            <w:pPr>
+              <w:keepNext/>
+              <w:spacing w:after="0" w:before="0"/>
+            </w:pPr>
+            <w:r>
+              <w:rPr>
+                <w:rFonts w:ascii="Arial" w:cs="Arial" w:eastAsia="Arial" w:hAnsi="Arial"/>
+                <w:b/>
+                <w:bCs/>
+                <w:sz w:val="18"/>
+                <w:szCs w:val="18"/>
+              </w:rPr>
+              <w:t xml:space="preserve"/>
+            </w:r>
+          </w:p>
+        </w:tc>
+        <w:tc>
+          <w:tcPr>
+            <w:tcW w:type="dxa" w:w="11800"/>
+            <w:tcBorders>
+              <w:top w:val="single" w:color="B7B7B7" w:sz="4"/>
+              <w:left w:val="single" w:color="B7B7B7" w:sz="4"/>
+              <w:bottom w:val="single" w:color="B7B7B7" w:sz="4"/>
+              <w:right w:val="single" w:color="B7B7B7" w:sz="4"/>
+            </w:tcBorders>
+            <w:shd w:fill="E2F0D9" w:color="auto" w:val="clear"/>
+            <w:tcMar>
+              <w:top w:type="dxa" w:w="50"/>
+              <w:left w:type="dxa" w:w="90"/>
+              <w:bottom w:type="dxa" w:w="50"/>
+              <w:right w:type="dxa" w:w="90"/>
+            </w:tcMar>
+            <w:vAlign w:val="center"/>
+          </w:tcPr>
+          <w:p>
+            <w:pPr>
+              <w:keepNext/>
+              <w:spacing w:after="0" w:before="0"/>
+            </w:pPr>
+            <w:r>
+              <w:rPr>
+                <w:rFonts w:ascii="Arial" w:cs="Arial" w:eastAsia="Arial" w:hAnsi="Arial"/>
+                <w:sz w:val="20"/>
+                <w:szCs w:val="20"/>
+              </w:rPr>
+              <w:t xml:space="preserve">Contest method and call-in number: use the KZSU contest procedure (not on the ticket sheet).</w:t>
+            </w:r>
+          </w:p>
+        </w:tc>
+      </w:tr>
+      <w:tr>
+        <w:trPr>
+          <w:cantSplit/>
+        </w:trPr>
+        <w:tc>
+          <w:tcPr>
+            <w:tcW w:type="dxa" w:w="2600"/>
+            <w:tcBorders>
+              <w:top w:val="single" w:color="B7B7B7" w:sz="4"/>
+              <w:left w:val="single" w:color="B7B7B7" w:sz="4"/>
+              <w:bottom w:val="single" w:color="B7B7B7" w:sz="4"/>
+              <w:right w:val="single" w:color="B7B7B7" w:sz="4"/>
+            </w:tcBorders>
+            <w:shd w:fill="E2F0D9" w:color="auto" w:val="clear"/>
+            <w:tcMar>
+              <w:top w:type="dxa" w:w="50"/>
+              <w:left w:type="dxa" w:w="90"/>
+              <w:bottom w:type="dxa" w:w="50"/>
+              <w:right w:type="dxa" w:w="90"/>
+            </w:tcMar>
+            <w:vAlign w:val="center"/>
+          </w:tcPr>
+          <w:p>
+            <w:pPr>
+              <w:keepNext/>
+              <w:spacing w:after="0" w:before="0"/>
+            </w:pPr>
+            <w:r>
+              <w:rPr>
+                <w:rFonts w:ascii="Arial" w:cs="Arial" w:eastAsia="Arial" w:hAnsi="Arial"/>
+                <w:b/>
+                <w:bCs/>
+                <w:sz w:val="18"/>
+                <w:szCs w:val="18"/>
+              </w:rPr>
+              <w:t xml:space="preserve"/>
+            </w:r>
+          </w:p>
+        </w:tc>
+        <w:tc>
+          <w:tcPr>
+            <w:tcW w:type="dxa" w:w="11800"/>
+            <w:tcBorders>
+              <w:top w:val="single" w:color="B7B7B7" w:sz="4"/>
+              <w:left w:val="single" w:color="B7B7B7" w:sz="4"/>
+              <w:bottom w:val="single" w:color="B7B7B7" w:sz="4"/>
+              <w:right w:val="single" w:color="B7B7B7" w:sz="4"/>
+            </w:tcBorders>
+            <w:shd w:fill="E2F0D9" w:color="auto" w:val="clear"/>
+            <w:tcMar>
+              <w:top w:type="dxa" w:w="50"/>
+              <w:left w:type="dxa" w:w="90"/>
+              <w:bottom w:type="dxa" w:w="50"/>
+              <w:right w:type="dxa" w:w="90"/>
+            </w:tcMar>
+            <w:vAlign w:val="center"/>
+          </w:tcPr>
+          <w:p>
+            <w:pPr>
+              <w:keepNext/>
+              <w:spacing w:after="0" w:before="0"/>
+            </w:pPr>
+            <w:r>
+              <w:rPr>
+                <w:rFonts w:ascii="Arial" w:cs="Arial" w:eastAsia="Arial" w:hAnsi="Arial"/>
+                <w:sz w:val="20"/>
+                <w:szCs w:val="20"/>
+              </w:rPr>
+              <w:t xml:space="preserve">Show time: Not on the sheet. Confirm before air.</w:t>
+            </w:r>
+          </w:p>
+        </w:tc>
+      </w:tr>
+      <w:tr>
+        <w:trPr>
+          <w:cantSplit/>
+        </w:trPr>
+        <w:tc>
+          <w:tcPr>
+            <w:tcW w:type="dxa" w:w="2600"/>
+            <w:tcBorders>
+              <w:top w:val="single" w:color="B7B7B7" w:sz="4"/>
+              <w:left w:val="single" w:color="B7B7B7" w:sz="4"/>
+              <w:bottom w:val="single" w:color="B7B7B7" w:sz="4"/>
+              <w:right w:val="single" w:color="B7B7B7" w:sz="4"/>
+            </w:tcBorders>
+            <w:shd w:fill="E2F0D9" w:color="auto" w:val="clear"/>
+            <w:tcMar>
+              <w:top w:type="dxa" w:w="50"/>
+              <w:left w:type="dxa" w:w="90"/>
+              <w:bottom w:type="dxa" w:w="50"/>
+              <w:right w:type="dxa" w:w="90"/>
+            </w:tcMar>
+            <w:vAlign w:val="center"/>
+          </w:tcPr>
+          <w:p>
+            <w:pPr>
+              <w:keepNext w:val="false"/>
+              <w:spacing w:after="0" w:before="0"/>
+            </w:pPr>
+            <w:r>
+              <w:rPr>
+                <w:rFonts w:ascii="Arial" w:cs="Arial" w:eastAsia="Arial" w:hAnsi="Arial"/>
+                <w:b/>
+                <w:bCs/>
+                <w:sz w:val="18"/>
+                <w:szCs w:val="18"/>
+              </w:rPr>
+              <w:t xml:space="preserve"/>
+            </w:r>
+          </w:p>
+        </w:tc>
+        <w:tc>
+          <w:tcPr>
+            <w:tcW w:type="dxa" w:w="11800"/>
+            <w:tcBorders>
+              <w:top w:val="single" w:color="B7B7B7" w:sz="4"/>
+              <w:left w:val="single" w:color="B7B7B7" w:sz="4"/>
+              <w:bottom w:val="single" w:color="B7B7B7" w:sz="4"/>
+              <w:right w:val="single" w:color="B7B7B7" w:sz="4"/>
+            </w:tcBorders>
+            <w:shd w:fill="E2F0D9" w:color="auto" w:val="clear"/>
+            <w:tcMar>
+              <w:top w:type="dxa" w:w="50"/>
+              <w:left w:type="dxa" w:w="90"/>
+              <w:bottom w:type="dxa" w:w="50"/>
+              <w:right w:type="dxa" w:w="90"/>
+            </w:tcMar>
+            <w:vAlign w:val="center"/>
+          </w:tcPr>
+          <w:p>
+            <w:pPr>
+              <w:keepNext w:val="false"/>
+              <w:spacing w:after="0" w:before="0"/>
+            </w:pPr>
+            <w:r>
+              <w:rPr>
+                <w:rFonts w:ascii="Arial" w:cs="Arial" w:eastAsia="Arial" w:hAnsi="Arial"/>
+                <w:sz w:val="20"/>
+                <w:szCs w:val="20"/>
+              </w:rPr>
+              <w:t xml:space="preserve">After the winner: follow the usual KZSU steps for logging the giveaway and ticket pickup.</w:t>
             </w:r>
           </w:p>
         </w:tc>
@@ -19430,13 +20592,9 @@
       </w:pPr>
     </w:p>
     <w:p>
-      <w:r>
-        <w:br w:type="page"/>
-      </w:r>
-    </w:p>
-    <w:p>
       <w:pPr>
         <w:keepNext/>
+        <w:pageBreakBefore/>
         <w:spacing w:after="80" w:before="0"/>
       </w:pPr>
       <w:r>

</xml_diff>

<commit_message>
Thursday show sync Oct. 8: Autumn Sweater moved to Set 6, Working rebuilt (43, reversed), CSV and Notes Sheet redeployed
</commit_message>
<xml_diff>
--- a/outputs/recon/2026-10-08/Library Show Final Show Script 2026-10-08 (Landscape Tables).docx
+++ b/outputs/recon/2026-10-08/Library Show Final Show Script 2026-10-08 (Landscape Tables).docx
@@ -1123,7 +1123,7 @@
                 <w:sz w:val="18"/>
                 <w:szCs w:val="18"/>
               </w:rPr>
-              <w:t xml:space="preserve">11</w:t>
+              <w:t xml:space="preserve">10</w:t>
             </w:r>
           </w:p>
         </w:tc>
@@ -1155,7 +1155,7 @@
                 <w:sz w:val="18"/>
                 <w:szCs w:val="18"/>
               </w:rPr>
-              <w:t xml:space="preserve">44:11</w:t>
+              <w:t xml:space="preserve">38:52</w:t>
             </w:r>
           </w:p>
         </w:tc>
@@ -1187,7 +1187,7 @@
                 <w:sz w:val="18"/>
                 <w:szCs w:val="18"/>
               </w:rPr>
-              <w:t xml:space="preserve">20-30</w:t>
+              <w:t xml:space="preserve">20-29</w:t>
             </w:r>
           </w:p>
         </w:tc>
@@ -1219,7 +1219,7 @@
                 <w:sz w:val="18"/>
                 <w:szCs w:val="18"/>
               </w:rPr>
-              <w:t xml:space="preserve">2:01:33</w:t>
+              <w:t xml:space="preserve">1:56:14</w:t>
             </w:r>
           </w:p>
         </w:tc>
@@ -1286,7 +1286,7 @@
                 <w:sz w:val="18"/>
                 <w:szCs w:val="18"/>
               </w:rPr>
-              <w:t xml:space="preserve">5</w:t>
+              <w:t xml:space="preserve">6</w:t>
             </w:r>
           </w:p>
         </w:tc>
@@ -1317,7 +1317,7 @@
                 <w:sz w:val="18"/>
                 <w:szCs w:val="18"/>
               </w:rPr>
-              <w:t xml:space="preserve">22:20</w:t>
+              <w:t xml:space="preserve">27:39</w:t>
             </w:r>
           </w:p>
         </w:tc>
@@ -1348,7 +1348,7 @@
                 <w:sz w:val="18"/>
                 <w:szCs w:val="18"/>
               </w:rPr>
-              <w:t xml:space="preserve">31-35</w:t>
+              <w:t xml:space="preserve">30-35</w:t>
             </w:r>
           </w:p>
         </w:tc>
@@ -2078,7 +2078,7 @@
                 <w:sz w:val="18"/>
                 <w:szCs w:val="18"/>
               </w:rPr>
-              <w:t xml:space="preserve">Held out</w:t>
+              <w:t xml:space="preserve">Moved (Air Order, Oct. 8)</w:t>
             </w:r>
           </w:p>
         </w:tc>
@@ -2107,13 +2107,10 @@
             <w:r>
               <w:rPr>
                 <w:rFonts w:ascii="Arial" w:cs="Arial" w:eastAsia="Arial" w:hAnsi="Arial"/>
-                <w:b/>
-                <w:bCs/>
-                <w:color w:val="B00020"/>
-                <w:sz w:val="18"/>
-                <w:szCs w:val="18"/>
-              </w:rPr>
-              <w:t xml:space="preserve">Sex Pistols, "Anarchy in the U.K.": FCC "piss" x1 (Outro). In the Air Order, not in the CSV. Needs a radio edit or a swap.</w:t>
+                <w:sz w:val="18"/>
+                <w:szCs w:val="18"/>
+              </w:rPr>
+              <w:t xml:space="preserve">Yo La Tengo, "Autumn Sweater" (5:19) moved from Set 5 to Set 6, after Dead Meadow. Now track 32. Set 5 has 10 tracks, Set 6 has 6.</w:t>
             </w:r>
           </w:p>
         </w:tc>
@@ -2149,7 +2146,7 @@
                 <w:sz w:val="18"/>
                 <w:szCs w:val="18"/>
               </w:rPr>
-              <w:t xml:space="preserve">Metadata fix</w:t>
+              <w:t xml:space="preserve">Held out</w:t>
             </w:r>
           </w:p>
         </w:tc>
@@ -2177,10 +2174,13 @@
             <w:r>
               <w:rPr>
                 <w:rFonts w:ascii="Arial" w:cs="Arial" w:eastAsia="Arial" w:hAnsi="Arial"/>
-                <w:sz w:val="18"/>
-                <w:szCs w:val="18"/>
-              </w:rPr>
-              <w:t xml:space="preserve">Dinosaur Jr. "Feel the Pain" is on Without a Sound (tag 187859).</w:t>
+                <w:b/>
+                <w:bCs/>
+                <w:color w:val="B00020"/>
+                <w:sz w:val="18"/>
+                <w:szCs w:val="18"/>
+              </w:rPr>
+              <w:t xml:space="preserve">Sex Pistols, "Anarchy in the U.K.": FCC "piss" x1 (Outro). In the Air Order, not in the CSV. Needs a radio edit or a swap.</w:t>
             </w:r>
           </w:p>
         </w:tc>
@@ -2214,6 +2214,74 @@
             <w:r>
               <w:rPr>
                 <w:rFonts w:ascii="Arial" w:cs="Arial" w:eastAsia="Arial" w:hAnsi="Arial"/>
+                <w:sz w:val="18"/>
+                <w:szCs w:val="18"/>
+              </w:rPr>
+              <w:t xml:space="preserve">Metadata fix</w:t>
+            </w:r>
+          </w:p>
+        </w:tc>
+        <w:tc>
+          <w:tcPr>
+            <w:tcW w:type="dxa" w:w="11800"/>
+            <w:tcBorders>
+              <w:top w:val="single" w:color="B7B7B7" w:sz="4"/>
+              <w:left w:val="single" w:color="B7B7B7" w:sz="4"/>
+              <w:bottom w:val="single" w:color="B7B7B7" w:sz="4"/>
+              <w:right w:val="single" w:color="B7B7B7" w:sz="4"/>
+            </w:tcBorders>
+            <w:shd w:fill="F5F7FA" w:color="auto" w:val="clear"/>
+            <w:tcMar>
+              <w:top w:type="dxa" w:w="50"/>
+              <w:left w:type="dxa" w:w="90"/>
+              <w:bottom w:type="dxa" w:w="50"/>
+              <w:right w:type="dxa" w:w="90"/>
+            </w:tcMar>
+            <w:vAlign w:val="center"/>
+          </w:tcPr>
+          <w:p>
+            <w:pPr>
+              <w:spacing w:after="0" w:before="0"/>
+            </w:pPr>
+            <w:r>
+              <w:rPr>
+                <w:rFonts w:ascii="Arial" w:cs="Arial" w:eastAsia="Arial" w:hAnsi="Arial"/>
+                <w:sz w:val="18"/>
+                <w:szCs w:val="18"/>
+              </w:rPr>
+              <w:t xml:space="preserve">Dinosaur Jr. "Feel the Pain" is on Without a Sound (tag 187859).</w:t>
+            </w:r>
+          </w:p>
+        </w:tc>
+      </w:tr>
+      <w:tr>
+        <w:trPr>
+          <w:cantSplit/>
+        </w:trPr>
+        <w:tc>
+          <w:tcPr>
+            <w:tcW w:type="dxa" w:w="2600"/>
+            <w:tcBorders>
+              <w:top w:val="single" w:color="B7B7B7" w:sz="4"/>
+              <w:left w:val="single" w:color="B7B7B7" w:sz="4"/>
+              <w:bottom w:val="single" w:color="B7B7B7" w:sz="4"/>
+              <w:right w:val="single" w:color="B7B7B7" w:sz="4"/>
+            </w:tcBorders>
+            <w:tcMar>
+              <w:top w:type="dxa" w:w="50"/>
+              <w:left w:type="dxa" w:w="90"/>
+              <w:bottom w:type="dxa" w:w="50"/>
+              <w:right w:type="dxa" w:w="90"/>
+            </w:tcMar>
+            <w:vAlign w:val="center"/>
+          </w:tcPr>
+          <w:p>
+            <w:pPr>
+              <w:spacing w:after="0" w:before="0"/>
+            </w:pPr>
+            <w:r>
+              <w:rPr>
+                <w:rFonts w:ascii="Arial" w:cs="Arial" w:eastAsia="Arial" w:hAnsi="Arial"/>
                 <w:b/>
                 <w:bCs/>
                 <w:sz w:val="18"/>
@@ -2232,7 +2300,6 @@
               <w:bottom w:val="single" w:color="B7B7B7" w:sz="4"/>
               <w:right w:val="single" w:color="B7B7B7" w:sz="4"/>
             </w:tcBorders>
-            <w:shd w:fill="F5F7FA" w:color="auto" w:val="clear"/>
             <w:tcMar>
               <w:top w:type="dxa" w:w="50"/>
               <w:left w:type="dxa" w:w="90"/>
@@ -4675,7 +4742,7 @@
       <w:tr>
         <w:trPr>
           <w:cantSplit/>
-          <w:tblHeader w:val="false"/>
+          <w:tblHeader w:val="off"/>
         </w:trPr>
         <w:tc>
           <w:tcPr>
@@ -5992,7 +6059,7 @@
       <w:tr>
         <w:trPr>
           <w:cantSplit/>
-          <w:tblHeader w:val="false"/>
+          <w:tblHeader w:val="off"/>
         </w:trPr>
         <w:tc>
           <w:tcPr>
@@ -7007,7 +7074,7 @@
       <w:tr>
         <w:trPr>
           <w:cantSplit/>
-          <w:tblHeader w:val="false"/>
+          <w:tblHeader w:val="off"/>
         </w:trPr>
         <w:tc>
           <w:tcPr>
@@ -9356,7 +9423,7 @@
       <w:tr>
         <w:trPr>
           <w:cantSplit/>
-          <w:tblHeader w:val="false"/>
+          <w:tblHeader w:val="off"/>
         </w:trPr>
         <w:tc>
           <w:tcPr>
@@ -10807,7 +10874,7 @@
       <w:tr>
         <w:trPr>
           <w:cantSplit/>
-          <w:tblHeader w:val="false"/>
+          <w:tblHeader w:val="off"/>
         </w:trPr>
         <w:tc>
           <w:tcPr>
@@ -14313,7 +14380,7 @@
       <w:tr>
         <w:trPr>
           <w:cantSplit/>
-          <w:tblHeader w:val="false"/>
+          <w:tblHeader w:val="off"/>
         </w:trPr>
         <w:tc>
           <w:tcPr>
@@ -14348,7 +14415,7 @@
                 <w:sz w:val="22"/>
                 <w:szCs w:val="22"/>
               </w:rPr>
-              <w:t xml:space="preserve">Hour 2, Set 5: Songwriters   |   11 tracks   |   44:11   |   on air through 2:01:33</w:t>
+              <w:t xml:space="preserve">Hour 2, Set 5: Songwriters   |   10 tracks   |   38:52   |   on air through 1:56:14</w:t>
             </w:r>
           </w:p>
         </w:tc>
@@ -17462,7 +17529,7 @@
           </w:tcPr>
           <w:p>
             <w:pPr>
-              <w:keepNext/>
+              <w:keepNext w:val="false"/>
               <w:spacing w:after="0" w:before="0"/>
             </w:pPr>
             <w:r>
@@ -17497,18 +17564,18 @@
           </w:tcPr>
           <w:p>
             <w:pPr>
-              <w:keepNext/>
-              <w:spacing w:after="0" w:before="0"/>
-            </w:pPr>
-            <w:r>
-              <w:rPr>
-                <w:rFonts w:ascii="Arial" w:cs="Arial" w:eastAsia="Arial" w:hAnsi="Arial"/>
-                <w:b/>
-                <w:bCs/>
-                <w:sz w:val="18"/>
-                <w:szCs w:val="18"/>
-              </w:rPr>
-              <w:t xml:space="preserve">Yo La Tengo</w:t>
+              <w:keepNext w:val="false"/>
+              <w:spacing w:after="0" w:before="0"/>
+            </w:pPr>
+            <w:r>
+              <w:rPr>
+                <w:rFonts w:ascii="Arial" w:cs="Arial" w:eastAsia="Arial" w:hAnsi="Arial"/>
+                <w:b/>
+                <w:bCs/>
+                <w:sz w:val="18"/>
+                <w:szCs w:val="18"/>
+              </w:rPr>
+              <w:t xml:space="preserve">Perfume Genius</w:t>
             </w:r>
           </w:p>
         </w:tc>
@@ -17532,7 +17599,7 @@
           </w:tcPr>
           <w:p>
             <w:pPr>
-              <w:keepNext/>
+              <w:keepNext w:val="false"/>
               <w:spacing w:after="0" w:before="0"/>
             </w:pPr>
             <w:r>
@@ -17543,7 +17610,7 @@
                 <w:sz w:val="20"/>
                 <w:szCs w:val="20"/>
               </w:rPr>
-              <w:t xml:space="preserve">Autumn Sweater</w:t>
+              <w:t xml:space="preserve">Queen</w:t>
             </w:r>
           </w:p>
         </w:tc>
@@ -17567,16 +17634,16 @@
           </w:tcPr>
           <w:p>
             <w:pPr>
-              <w:keepNext/>
-              <w:spacing w:after="0" w:before="0"/>
-            </w:pPr>
-            <w:r>
-              <w:rPr>
-                <w:rFonts w:ascii="Arial" w:cs="Arial" w:eastAsia="Arial" w:hAnsi="Arial"/>
-                <w:sz w:val="18"/>
-                <w:szCs w:val="18"/>
-              </w:rPr>
-              <w:t xml:space="preserve">Autumn Sweater</w:t>
+              <w:keepNext w:val="false"/>
+              <w:spacing w:after="0" w:before="0"/>
+            </w:pPr>
+            <w:r>
+              <w:rPr>
+                <w:rFonts w:ascii="Arial" w:cs="Arial" w:eastAsia="Arial" w:hAnsi="Arial"/>
+                <w:sz w:val="18"/>
+                <w:szCs w:val="18"/>
+              </w:rPr>
+              <w:t xml:space="preserve">Too Bright</w:t>
             </w:r>
           </w:p>
         </w:tc>
@@ -17600,7 +17667,7 @@
           </w:tcPr>
           <w:p>
             <w:pPr>
-              <w:keepNext/>
+              <w:keepNext w:val="false"/>
               <w:spacing w:after="0" w:before="0"/>
             </w:pPr>
             <w:r>
@@ -17633,16 +17700,16 @@
           </w:tcPr>
           <w:p>
             <w:pPr>
-              <w:keepNext/>
-              <w:spacing w:after="0" w:before="0"/>
-            </w:pPr>
-            <w:r>
-              <w:rPr>
-                <w:rFonts w:ascii="Arial" w:cs="Arial" w:eastAsia="Arial" w:hAnsi="Arial"/>
-                <w:sz w:val="18"/>
-                <w:szCs w:val="18"/>
-              </w:rPr>
-              <w:t xml:space="preserve">376770</w:t>
+              <w:keepNext w:val="false"/>
+              <w:spacing w:after="0" w:before="0"/>
+            </w:pPr>
+            <w:r>
+              <w:rPr>
+                <w:rFonts w:ascii="Arial" w:cs="Arial" w:eastAsia="Arial" w:hAnsi="Arial"/>
+                <w:sz w:val="18"/>
+                <w:szCs w:val="18"/>
+              </w:rPr>
+              <w:t xml:space="preserve">1063022</w:t>
             </w:r>
           </w:p>
         </w:tc>
@@ -17666,16 +17733,16 @@
           </w:tcPr>
           <w:p>
             <w:pPr>
-              <w:keepNext/>
-              <w:spacing w:after="0" w:before="0"/>
-            </w:pPr>
-            <w:r>
-              <w:rPr>
-                <w:rFonts w:ascii="Arial" w:cs="Arial" w:eastAsia="Arial" w:hAnsi="Arial"/>
-                <w:sz w:val="18"/>
-                <w:szCs w:val="18"/>
-              </w:rPr>
-              <w:t xml:space="preserve">5:19</w:t>
+              <w:keepNext w:val="false"/>
+              <w:spacing w:after="0" w:before="0"/>
+            </w:pPr>
+            <w:r>
+              <w:rPr>
+                <w:rFonts w:ascii="Arial" w:cs="Arial" w:eastAsia="Arial" w:hAnsi="Arial"/>
+                <w:sz w:val="18"/>
+                <w:szCs w:val="18"/>
+              </w:rPr>
+              <w:t xml:space="preserve">3:51</w:t>
             </w:r>
           </w:p>
         </w:tc>
@@ -17699,7 +17766,7 @@
           </w:tcPr>
           <w:p>
             <w:pPr>
-              <w:keepNext/>
+              <w:keepNext w:val="false"/>
               <w:spacing w:after="0" w:before="0"/>
             </w:pPr>
             <w:r>
@@ -17725,308 +17792,6 @@
               <w:right w:val="single" w:color="B7B7B7" w:sz="4"/>
             </w:tcBorders>
             <w:shd w:fill="F5F7FA" w:color="auto" w:val="clear"/>
-            <w:tcMar>
-              <w:top w:type="dxa" w:w="50"/>
-              <w:left w:type="dxa" w:w="90"/>
-              <w:bottom w:type="dxa" w:w="50"/>
-              <w:right w:type="dxa" w:w="90"/>
-            </w:tcMar>
-            <w:vAlign w:val="center"/>
-          </w:tcPr>
-          <w:p>
-            <w:pPr>
-              <w:keepNext/>
-              <w:spacing w:after="0" w:before="0"/>
-            </w:pPr>
-            <w:r>
-              <w:rPr>
-                <w:rFonts w:ascii="Arial" w:cs="Arial" w:eastAsia="Arial" w:hAnsi="Arial"/>
-                <w:sz w:val="16"/>
-                <w:szCs w:val="16"/>
-              </w:rPr>
-              <w:t xml:space="preserve">Weekly Playlist pick.</w:t>
-            </w:r>
-          </w:p>
-        </w:tc>
-      </w:tr>
-      <w:tr>
-        <w:trPr>
-          <w:cantSplit/>
-        </w:trPr>
-        <w:tc>
-          <w:tcPr>
-            <w:tcW w:type="dxa" w:w="450"/>
-            <w:tcBorders>
-              <w:top w:val="single" w:color="B7B7B7" w:sz="4"/>
-              <w:left w:val="single" w:color="B7B7B7" w:sz="4"/>
-              <w:bottom w:val="single" w:color="B7B7B7" w:sz="4"/>
-              <w:right w:val="single" w:color="B7B7B7" w:sz="4"/>
-            </w:tcBorders>
-            <w:tcMar>
-              <w:top w:type="dxa" w:w="50"/>
-              <w:left w:type="dxa" w:w="90"/>
-              <w:bottom w:type="dxa" w:w="50"/>
-              <w:right w:type="dxa" w:w="90"/>
-            </w:tcMar>
-            <w:vAlign w:val="center"/>
-          </w:tcPr>
-          <w:p>
-            <w:pPr>
-              <w:keepNext w:val="false"/>
-              <w:spacing w:after="0" w:before="0"/>
-            </w:pPr>
-            <w:r>
-              <w:rPr>
-                <w:rFonts w:ascii="Arial" w:cs="Arial" w:eastAsia="Arial" w:hAnsi="Arial"/>
-                <w:b/>
-                <w:bCs/>
-                <w:sz w:val="18"/>
-                <w:szCs w:val="18"/>
-              </w:rPr>
-              <w:t xml:space="preserve">30</w:t>
-            </w:r>
-          </w:p>
-        </w:tc>
-        <w:tc>
-          <w:tcPr>
-            <w:tcW w:type="dxa" w:w="1800"/>
-            <w:tcBorders>
-              <w:top w:val="single" w:color="B7B7B7" w:sz="4"/>
-              <w:left w:val="single" w:color="B7B7B7" w:sz="4"/>
-              <w:bottom w:val="single" w:color="B7B7B7" w:sz="4"/>
-              <w:right w:val="single" w:color="B7B7B7" w:sz="4"/>
-            </w:tcBorders>
-            <w:tcMar>
-              <w:top w:type="dxa" w:w="50"/>
-              <w:left w:type="dxa" w:w="90"/>
-              <w:bottom w:type="dxa" w:w="50"/>
-              <w:right w:type="dxa" w:w="90"/>
-            </w:tcMar>
-            <w:vAlign w:val="center"/>
-          </w:tcPr>
-          <w:p>
-            <w:pPr>
-              <w:keepNext w:val="false"/>
-              <w:spacing w:after="0" w:before="0"/>
-            </w:pPr>
-            <w:r>
-              <w:rPr>
-                <w:rFonts w:ascii="Arial" w:cs="Arial" w:eastAsia="Arial" w:hAnsi="Arial"/>
-                <w:b/>
-                <w:bCs/>
-                <w:sz w:val="18"/>
-                <w:szCs w:val="18"/>
-              </w:rPr>
-              <w:t xml:space="preserve">Perfume Genius</w:t>
-            </w:r>
-          </w:p>
-        </w:tc>
-        <w:tc>
-          <w:tcPr>
-            <w:tcW w:type="dxa" w:w="2600"/>
-            <w:tcBorders>
-              <w:top w:val="single" w:color="B7B7B7" w:sz="4"/>
-              <w:left w:val="single" w:color="B7B7B7" w:sz="4"/>
-              <w:bottom w:val="single" w:color="B7B7B7" w:sz="4"/>
-              <w:right w:val="single" w:color="B7B7B7" w:sz="4"/>
-            </w:tcBorders>
-            <w:tcMar>
-              <w:top w:type="dxa" w:w="50"/>
-              <w:left w:type="dxa" w:w="90"/>
-              <w:bottom w:type="dxa" w:w="50"/>
-              <w:right w:type="dxa" w:w="90"/>
-            </w:tcMar>
-            <w:vAlign w:val="center"/>
-          </w:tcPr>
-          <w:p>
-            <w:pPr>
-              <w:keepNext w:val="false"/>
-              <w:spacing w:after="0" w:before="0"/>
-            </w:pPr>
-            <w:r>
-              <w:rPr>
-                <w:rFonts w:ascii="Arial" w:cs="Arial" w:eastAsia="Arial" w:hAnsi="Arial"/>
-                <w:b/>
-                <w:bCs/>
-                <w:sz w:val="20"/>
-                <w:szCs w:val="20"/>
-              </w:rPr>
-              <w:t xml:space="preserve">Queen</w:t>
-            </w:r>
-          </w:p>
-        </w:tc>
-        <w:tc>
-          <w:tcPr>
-            <w:tcW w:type="dxa" w:w="2100"/>
-            <w:tcBorders>
-              <w:top w:val="single" w:color="B7B7B7" w:sz="4"/>
-              <w:left w:val="single" w:color="B7B7B7" w:sz="4"/>
-              <w:bottom w:val="single" w:color="B7B7B7" w:sz="4"/>
-              <w:right w:val="single" w:color="B7B7B7" w:sz="4"/>
-            </w:tcBorders>
-            <w:tcMar>
-              <w:top w:type="dxa" w:w="50"/>
-              <w:left w:type="dxa" w:w="90"/>
-              <w:bottom w:type="dxa" w:w="50"/>
-              <w:right w:type="dxa" w:w="90"/>
-            </w:tcMar>
-            <w:vAlign w:val="center"/>
-          </w:tcPr>
-          <w:p>
-            <w:pPr>
-              <w:keepNext w:val="false"/>
-              <w:spacing w:after="0" w:before="0"/>
-            </w:pPr>
-            <w:r>
-              <w:rPr>
-                <w:rFonts w:ascii="Arial" w:cs="Arial" w:eastAsia="Arial" w:hAnsi="Arial"/>
-                <w:sz w:val="18"/>
-                <w:szCs w:val="18"/>
-              </w:rPr>
-              <w:t xml:space="preserve">Too Bright</w:t>
-            </w:r>
-          </w:p>
-        </w:tc>
-        <w:tc>
-          <w:tcPr>
-            <w:tcW w:type="dxa" w:w="1600"/>
-            <w:tcBorders>
-              <w:top w:val="single" w:color="B7B7B7" w:sz="4"/>
-              <w:left w:val="single" w:color="B7B7B7" w:sz="4"/>
-              <w:bottom w:val="single" w:color="B7B7B7" w:sz="4"/>
-              <w:right w:val="single" w:color="B7B7B7" w:sz="4"/>
-            </w:tcBorders>
-            <w:tcMar>
-              <w:top w:type="dxa" w:w="50"/>
-              <w:left w:type="dxa" w:w="90"/>
-              <w:bottom w:type="dxa" w:w="50"/>
-              <w:right w:type="dxa" w:w="90"/>
-            </w:tcMar>
-            <w:vAlign w:val="center"/>
-          </w:tcPr>
-          <w:p>
-            <w:pPr>
-              <w:keepNext w:val="false"/>
-              <w:spacing w:after="0" w:before="0"/>
-            </w:pPr>
-            <w:r>
-              <w:rPr>
-                <w:rFonts w:ascii="Arial" w:cs="Arial" w:eastAsia="Arial" w:hAnsi="Arial"/>
-                <w:sz w:val="18"/>
-                <w:szCs w:val="18"/>
-              </w:rPr>
-              <w:t xml:space="preserve">Matador Records</w:t>
-            </w:r>
-          </w:p>
-        </w:tc>
-        <w:tc>
-          <w:tcPr>
-            <w:tcW w:type="dxa" w:w="900"/>
-            <w:tcBorders>
-              <w:top w:val="single" w:color="B7B7B7" w:sz="4"/>
-              <w:left w:val="single" w:color="B7B7B7" w:sz="4"/>
-              <w:bottom w:val="single" w:color="B7B7B7" w:sz="4"/>
-              <w:right w:val="single" w:color="B7B7B7" w:sz="4"/>
-            </w:tcBorders>
-            <w:tcMar>
-              <w:top w:type="dxa" w:w="50"/>
-              <w:left w:type="dxa" w:w="90"/>
-              <w:bottom w:type="dxa" w:w="50"/>
-              <w:right w:type="dxa" w:w="90"/>
-            </w:tcMar>
-            <w:vAlign w:val="center"/>
-          </w:tcPr>
-          <w:p>
-            <w:pPr>
-              <w:keepNext w:val="false"/>
-              <w:spacing w:after="0" w:before="0"/>
-            </w:pPr>
-            <w:r>
-              <w:rPr>
-                <w:rFonts w:ascii="Arial" w:cs="Arial" w:eastAsia="Arial" w:hAnsi="Arial"/>
-                <w:sz w:val="18"/>
-                <w:szCs w:val="18"/>
-              </w:rPr>
-              <w:t xml:space="preserve">1063022</w:t>
-            </w:r>
-          </w:p>
-        </w:tc>
-        <w:tc>
-          <w:tcPr>
-            <w:tcW w:type="dxa" w:w="650"/>
-            <w:tcBorders>
-              <w:top w:val="single" w:color="B7B7B7" w:sz="4"/>
-              <w:left w:val="single" w:color="B7B7B7" w:sz="4"/>
-              <w:bottom w:val="single" w:color="B7B7B7" w:sz="4"/>
-              <w:right w:val="single" w:color="B7B7B7" w:sz="4"/>
-            </w:tcBorders>
-            <w:tcMar>
-              <w:top w:type="dxa" w:w="50"/>
-              <w:left w:type="dxa" w:w="90"/>
-              <w:bottom w:type="dxa" w:w="50"/>
-              <w:right w:type="dxa" w:w="90"/>
-            </w:tcMar>
-            <w:vAlign w:val="center"/>
-          </w:tcPr>
-          <w:p>
-            <w:pPr>
-              <w:keepNext w:val="false"/>
-              <w:spacing w:after="0" w:before="0"/>
-            </w:pPr>
-            <w:r>
-              <w:rPr>
-                <w:rFonts w:ascii="Arial" w:cs="Arial" w:eastAsia="Arial" w:hAnsi="Arial"/>
-                <w:sz w:val="18"/>
-                <w:szCs w:val="18"/>
-              </w:rPr>
-              <w:t xml:space="preserve">3:51</w:t>
-            </w:r>
-          </w:p>
-        </w:tc>
-        <w:tc>
-          <w:tcPr>
-            <w:tcW w:type="dxa" w:w="1300"/>
-            <w:tcBorders>
-              <w:top w:val="single" w:color="B7B7B7" w:sz="4"/>
-              <w:left w:val="single" w:color="B7B7B7" w:sz="4"/>
-              <w:bottom w:val="single" w:color="B7B7B7" w:sz="4"/>
-              <w:right w:val="single" w:color="B7B7B7" w:sz="4"/>
-            </w:tcBorders>
-            <w:tcMar>
-              <w:top w:type="dxa" w:w="50"/>
-              <w:left w:type="dxa" w:w="90"/>
-              <w:bottom w:type="dxa" w:w="50"/>
-              <w:right w:type="dxa" w:w="90"/>
-            </w:tcMar>
-            <w:vAlign w:val="center"/>
-          </w:tcPr>
-          <w:p>
-            <w:pPr>
-              <w:keepNext w:val="false"/>
-              <w:spacing w:after="0" w:before="0"/>
-            </w:pPr>
-            <w:r>
-              <w:rPr>
-                <w:rFonts w:ascii="Arial" w:cs="Arial" w:eastAsia="Arial" w:hAnsi="Arial"/>
-                <w:b/>
-                <w:bCs/>
-                <w:color w:val="1B7F3B"/>
-                <w:sz w:val="18"/>
-                <w:szCs w:val="18"/>
-              </w:rPr>
-              <w:t xml:space="preserve">CLEAN</w:t>
-            </w:r>
-          </w:p>
-        </w:tc>
-        <w:tc>
-          <w:tcPr>
-            <w:tcW w:type="dxa" w:w="3000"/>
-            <w:tcBorders>
-              <w:top w:val="single" w:color="B7B7B7" w:sz="4"/>
-              <w:left w:val="single" w:color="B7B7B7" w:sz="4"/>
-              <w:bottom w:val="single" w:color="B7B7B7" w:sz="4"/>
-              <w:right w:val="single" w:color="B7B7B7" w:sz="4"/>
-            </w:tcBorders>
             <w:tcMar>
               <w:top w:type="dxa" w:w="50"/>
               <w:left w:type="dxa" w:w="90"/>
@@ -18933,7 +18698,7 @@
       <w:tr>
         <w:trPr>
           <w:cantSplit/>
-          <w:tblHeader w:val="false"/>
+          <w:tblHeader w:val="off"/>
         </w:trPr>
         <w:tc>
           <w:tcPr>
@@ -18968,7 +18733,7 @@
                 <w:sz w:val="22"/>
                 <w:szCs w:val="22"/>
               </w:rPr>
-              <w:t xml:space="preserve">Hour 2, Set 6: Heavy, psych and close   |   5 tracks   |   22:20   |   on air through 2:23:53</w:t>
+              <w:t xml:space="preserve">Hour 2, Set 6: Heavy, psych and close   |   6 tracks   |   27:39   |   on air through 2:23:53</w:t>
             </w:r>
           </w:p>
         </w:tc>
@@ -19337,7 +19102,7 @@
                 <w:sz w:val="18"/>
                 <w:szCs w:val="18"/>
               </w:rPr>
-              <w:t xml:space="preserve">31</w:t>
+              <w:t xml:space="preserve">30</w:t>
             </w:r>
           </w:p>
         </w:tc>
@@ -19640,7 +19405,7 @@
                 <w:sz w:val="18"/>
                 <w:szCs w:val="18"/>
               </w:rPr>
-              <w:t xml:space="preserve">32</w:t>
+              <w:t xml:space="preserve">31</w:t>
             </w:r>
           </w:p>
         </w:tc>
@@ -19950,7 +19715,7 @@
                 <w:sz w:val="18"/>
                 <w:szCs w:val="18"/>
               </w:rPr>
-              <w:t xml:space="preserve">33</w:t>
+              <w:t xml:space="preserve">32</w:t>
             </w:r>
           </w:p>
         </w:tc>
@@ -19984,7 +19749,7 @@
                 <w:sz w:val="18"/>
                 <w:szCs w:val="18"/>
               </w:rPr>
-              <w:t xml:space="preserve">Mandrake Handshake</w:t>
+              <w:t xml:space="preserve">Yo La Tengo</w:t>
             </w:r>
           </w:p>
         </w:tc>
@@ -20018,7 +19783,7 @@
                 <w:sz w:val="20"/>
                 <w:szCs w:val="20"/>
               </w:rPr>
-              <w:t xml:space="preserve">The Tether / Modulo 5</w:t>
+              <w:t xml:space="preserve">Autumn Sweater</w:t>
             </w:r>
           </w:p>
         </w:tc>
@@ -20050,7 +19815,7 @@
                 <w:sz w:val="18"/>
                 <w:szCs w:val="18"/>
               </w:rPr>
-              <w:t xml:space="preserve">-</w:t>
+              <w:t xml:space="preserve">Autumn Sweater</w:t>
             </w:r>
           </w:p>
         </w:tc>
@@ -20082,7 +19847,7 @@
                 <w:sz w:val="18"/>
                 <w:szCs w:val="18"/>
               </w:rPr>
-              <w:t xml:space="preserve">Tip Top Recordings</w:t>
+              <w:t xml:space="preserve">Matador Records</w:t>
             </w:r>
           </w:p>
         </w:tc>
@@ -20114,7 +19879,7 @@
                 <w:sz w:val="18"/>
                 <w:szCs w:val="18"/>
               </w:rPr>
-              <w:t xml:space="preserve">-</w:t>
+              <w:t xml:space="preserve">376770</w:t>
             </w:r>
           </w:p>
         </w:tc>
@@ -20146,7 +19911,7 @@
                 <w:sz w:val="18"/>
                 <w:szCs w:val="18"/>
               </w:rPr>
-              <w:t xml:space="preserve">5:12</w:t>
+              <w:t xml:space="preserve">5:19</w:t>
             </w:r>
           </w:p>
         </w:tc>
@@ -20159,30 +19924,29 @@
               <w:bottom w:val="single" w:color="B7B7B7" w:sz="4"/>
               <w:right w:val="single" w:color="B7B7B7" w:sz="4"/>
             </w:tcBorders>
-            <w:shd w:fill="FFF3CD" w:color="auto" w:val="clear"/>
-            <w:tcMar>
-              <w:top w:type="dxa" w:w="50"/>
-              <w:left w:type="dxa" w:w="90"/>
-              <w:bottom w:type="dxa" w:w="50"/>
-              <w:right w:type="dxa" w:w="90"/>
-            </w:tcMar>
-            <w:vAlign w:val="center"/>
-          </w:tcPr>
-          <w:p>
-            <w:pPr>
-              <w:keepNext/>
-              <w:spacing w:after="0" w:before="0"/>
-            </w:pPr>
-            <w:r>
-              <w:rPr>
-                <w:rFonts w:ascii="Arial" w:cs="Arial" w:eastAsia="Arial" w:hAnsi="Arial"/>
-                <w:b/>
-                <w:bCs/>
-                <w:color w:val="8A6100"/>
-                <w:sz w:val="18"/>
-                <w:szCs w:val="18"/>
-              </w:rPr>
-              <w:t xml:space="preserve">LISTEN FIRST</w:t>
+            <w:tcMar>
+              <w:top w:type="dxa" w:w="50"/>
+              <w:left w:type="dxa" w:w="90"/>
+              <w:bottom w:type="dxa" w:w="50"/>
+              <w:right w:type="dxa" w:w="90"/>
+            </w:tcMar>
+            <w:vAlign w:val="center"/>
+          </w:tcPr>
+          <w:p>
+            <w:pPr>
+              <w:keepNext/>
+              <w:spacing w:after="0" w:before="0"/>
+            </w:pPr>
+            <w:r>
+              <w:rPr>
+                <w:rFonts w:ascii="Arial" w:cs="Arial" w:eastAsia="Arial" w:hAnsi="Arial"/>
+                <w:b/>
+                <w:bCs/>
+                <w:color w:val="1B7F3B"/>
+                <w:sz w:val="18"/>
+                <w:szCs w:val="18"/>
+              </w:rPr>
+              <w:t xml:space="preserve">CLEAN</w:t>
             </w:r>
           </w:p>
         </w:tc>
@@ -20214,7 +19978,7 @@
                 <w:sz w:val="16"/>
                 <w:szCs w:val="16"/>
               </w:rPr>
-              <w:t xml:space="preserve">Carried over. Likely instrumental.</w:t>
+              <w:t xml:space="preserve">Weekly Playlist pick.</w:t>
             </w:r>
           </w:p>
         </w:tc>
@@ -20254,7 +20018,7 @@
                 <w:sz w:val="18"/>
                 <w:szCs w:val="18"/>
               </w:rPr>
-              <w:t xml:space="preserve">34</w:t>
+              <w:t xml:space="preserve">33</w:t>
             </w:r>
           </w:p>
         </w:tc>
@@ -20289,7 +20053,7 @@
                 <w:sz w:val="18"/>
                 <w:szCs w:val="18"/>
               </w:rPr>
-              <w:t xml:space="preserve">Stereolab</w:t>
+              <w:t xml:space="preserve">Mandrake Handshake</w:t>
             </w:r>
           </w:p>
         </w:tc>
@@ -20324,7 +20088,7 @@
                 <w:sz w:val="20"/>
                 <w:szCs w:val="20"/>
               </w:rPr>
-              <w:t xml:space="preserve">Flashes In The Afternoon</w:t>
+              <w:t xml:space="preserve">The Tether / Modulo 5</w:t>
             </w:r>
           </w:p>
         </w:tc>
@@ -20357,7 +20121,7 @@
                 <w:sz w:val="18"/>
                 <w:szCs w:val="18"/>
               </w:rPr>
-              <w:t xml:space="preserve">Cloud Land / Flashes In The Afternoon</w:t>
+              <w:t xml:space="preserve">-</w:t>
             </w:r>
           </w:p>
         </w:tc>
@@ -20390,7 +20154,7 @@
                 <w:sz w:val="18"/>
                 <w:szCs w:val="18"/>
               </w:rPr>
-              <w:t xml:space="preserve">Duophonic Ultra High Fs</w:t>
+              <w:t xml:space="preserve">Tip Top Recordings</w:t>
             </w:r>
           </w:p>
         </w:tc>
@@ -20456,7 +20220,7 @@
                 <w:sz w:val="18"/>
                 <w:szCs w:val="18"/>
               </w:rPr>
-              <w:t xml:space="preserve">6:15</w:t>
+              <w:t xml:space="preserve">5:12</w:t>
             </w:r>
           </w:p>
         </w:tc>
@@ -20469,30 +20233,30 @@
               <w:bottom w:val="single" w:color="B7B7B7" w:sz="4"/>
               <w:right w:val="single" w:color="B7B7B7" w:sz="4"/>
             </w:tcBorders>
-            <w:shd w:fill="F5F7FA" w:color="auto" w:val="clear"/>
-            <w:tcMar>
-              <w:top w:type="dxa" w:w="50"/>
-              <w:left w:type="dxa" w:w="90"/>
-              <w:bottom w:type="dxa" w:w="50"/>
-              <w:right w:type="dxa" w:w="90"/>
-            </w:tcMar>
-            <w:vAlign w:val="center"/>
-          </w:tcPr>
-          <w:p>
-            <w:pPr>
-              <w:keepNext/>
-              <w:spacing w:after="0" w:before="0"/>
-            </w:pPr>
-            <w:r>
-              <w:rPr>
-                <w:rFonts w:ascii="Arial" w:cs="Arial" w:eastAsia="Arial" w:hAnsi="Arial"/>
-                <w:b/>
-                <w:bCs/>
-                <w:color w:val="1B7F3B"/>
-                <w:sz w:val="18"/>
-                <w:szCs w:val="18"/>
-              </w:rPr>
-              <w:t xml:space="preserve">CLEAN</w:t>
+            <w:shd w:fill="FFF3CD" w:color="auto" w:val="clear"/>
+            <w:tcMar>
+              <w:top w:type="dxa" w:w="50"/>
+              <w:left w:type="dxa" w:w="90"/>
+              <w:bottom w:type="dxa" w:w="50"/>
+              <w:right w:type="dxa" w:w="90"/>
+            </w:tcMar>
+            <w:vAlign w:val="center"/>
+          </w:tcPr>
+          <w:p>
+            <w:pPr>
+              <w:keepNext/>
+              <w:spacing w:after="0" w:before="0"/>
+            </w:pPr>
+            <w:r>
+              <w:rPr>
+                <w:rFonts w:ascii="Arial" w:cs="Arial" w:eastAsia="Arial" w:hAnsi="Arial"/>
+                <w:b/>
+                <w:bCs/>
+                <w:color w:val="8A6100"/>
+                <w:sz w:val="18"/>
+                <w:szCs w:val="18"/>
+              </w:rPr>
+              <w:t xml:space="preserve">LISTEN FIRST</w:t>
             </w:r>
           </w:p>
         </w:tc>
@@ -20525,7 +20289,7 @@
                 <w:sz w:val="16"/>
                 <w:szCs w:val="16"/>
               </w:rPr>
-              <w:t xml:space="preserve">Stace's pick. Instrumental B-side of a once tour-only 7-inch, out Feb. 13 on the band's Duophonic label.</w:t>
+              <w:t xml:space="preserve">Carried over. Likely instrumental.</w:t>
             </w:r>
           </w:p>
         </w:tc>
@@ -20553,18 +20317,18 @@
           </w:tcPr>
           <w:p>
             <w:pPr>
-              <w:keepNext w:val="false"/>
-              <w:spacing w:after="0" w:before="0"/>
-            </w:pPr>
-            <w:r>
-              <w:rPr>
-                <w:rFonts w:ascii="Arial" w:cs="Arial" w:eastAsia="Arial" w:hAnsi="Arial"/>
-                <w:b/>
-                <w:bCs/>
-                <w:sz w:val="18"/>
-                <w:szCs w:val="18"/>
-              </w:rPr>
-              <w:t xml:space="preserve">35</w:t>
+              <w:keepNext/>
+              <w:spacing w:after="0" w:before="0"/>
+            </w:pPr>
+            <w:r>
+              <w:rPr>
+                <w:rFonts w:ascii="Arial" w:cs="Arial" w:eastAsia="Arial" w:hAnsi="Arial"/>
+                <w:b/>
+                <w:bCs/>
+                <w:sz w:val="18"/>
+                <w:szCs w:val="18"/>
+              </w:rPr>
+              <w:t xml:space="preserve">34</w:t>
             </w:r>
           </w:p>
         </w:tc>
@@ -20587,18 +20351,18 @@
           </w:tcPr>
           <w:p>
             <w:pPr>
-              <w:keepNext w:val="false"/>
-              <w:spacing w:after="0" w:before="0"/>
-            </w:pPr>
-            <w:r>
-              <w:rPr>
-                <w:rFonts w:ascii="Arial" w:cs="Arial" w:eastAsia="Arial" w:hAnsi="Arial"/>
-                <w:b/>
-                <w:bCs/>
-                <w:sz w:val="18"/>
-                <w:szCs w:val="18"/>
-              </w:rPr>
-              <w:t xml:space="preserve">Morphine</w:t>
+              <w:keepNext/>
+              <w:spacing w:after="0" w:before="0"/>
+            </w:pPr>
+            <w:r>
+              <w:rPr>
+                <w:rFonts w:ascii="Arial" w:cs="Arial" w:eastAsia="Arial" w:hAnsi="Arial"/>
+                <w:b/>
+                <w:bCs/>
+                <w:sz w:val="18"/>
+                <w:szCs w:val="18"/>
+              </w:rPr>
+              <w:t xml:space="preserve">Stereolab</w:t>
             </w:r>
           </w:p>
         </w:tc>
@@ -20621,7 +20385,7 @@
           </w:tcPr>
           <w:p>
             <w:pPr>
-              <w:keepNext w:val="false"/>
+              <w:keepNext/>
               <w:spacing w:after="0" w:before="0"/>
             </w:pPr>
             <w:r>
@@ -20632,6 +20396,311 @@
                 <w:sz w:val="20"/>
                 <w:szCs w:val="20"/>
               </w:rPr>
+              <w:t xml:space="preserve">Flashes In The Afternoon</w:t>
+            </w:r>
+          </w:p>
+        </w:tc>
+        <w:tc>
+          <w:tcPr>
+            <w:tcW w:type="dxa" w:w="2100"/>
+            <w:tcBorders>
+              <w:top w:val="single" w:color="B7B7B7" w:sz="4"/>
+              <w:left w:val="single" w:color="B7B7B7" w:sz="4"/>
+              <w:bottom w:val="single" w:color="B7B7B7" w:sz="4"/>
+              <w:right w:val="single" w:color="B7B7B7" w:sz="4"/>
+            </w:tcBorders>
+            <w:tcMar>
+              <w:top w:type="dxa" w:w="50"/>
+              <w:left w:type="dxa" w:w="90"/>
+              <w:bottom w:type="dxa" w:w="50"/>
+              <w:right w:type="dxa" w:w="90"/>
+            </w:tcMar>
+            <w:vAlign w:val="center"/>
+          </w:tcPr>
+          <w:p>
+            <w:pPr>
+              <w:keepNext/>
+              <w:spacing w:after="0" w:before="0"/>
+            </w:pPr>
+            <w:r>
+              <w:rPr>
+                <w:rFonts w:ascii="Arial" w:cs="Arial" w:eastAsia="Arial" w:hAnsi="Arial"/>
+                <w:sz w:val="18"/>
+                <w:szCs w:val="18"/>
+              </w:rPr>
+              <w:t xml:space="preserve">Cloud Land / Flashes In The Afternoon</w:t>
+            </w:r>
+          </w:p>
+        </w:tc>
+        <w:tc>
+          <w:tcPr>
+            <w:tcW w:type="dxa" w:w="1600"/>
+            <w:tcBorders>
+              <w:top w:val="single" w:color="B7B7B7" w:sz="4"/>
+              <w:left w:val="single" w:color="B7B7B7" w:sz="4"/>
+              <w:bottom w:val="single" w:color="B7B7B7" w:sz="4"/>
+              <w:right w:val="single" w:color="B7B7B7" w:sz="4"/>
+            </w:tcBorders>
+            <w:tcMar>
+              <w:top w:type="dxa" w:w="50"/>
+              <w:left w:type="dxa" w:w="90"/>
+              <w:bottom w:type="dxa" w:w="50"/>
+              <w:right w:type="dxa" w:w="90"/>
+            </w:tcMar>
+            <w:vAlign w:val="center"/>
+          </w:tcPr>
+          <w:p>
+            <w:pPr>
+              <w:keepNext/>
+              <w:spacing w:after="0" w:before="0"/>
+            </w:pPr>
+            <w:r>
+              <w:rPr>
+                <w:rFonts w:ascii="Arial" w:cs="Arial" w:eastAsia="Arial" w:hAnsi="Arial"/>
+                <w:sz w:val="18"/>
+                <w:szCs w:val="18"/>
+              </w:rPr>
+              <w:t xml:space="preserve">Duophonic Ultra High Fs</w:t>
+            </w:r>
+          </w:p>
+        </w:tc>
+        <w:tc>
+          <w:tcPr>
+            <w:tcW w:type="dxa" w:w="900"/>
+            <w:tcBorders>
+              <w:top w:val="single" w:color="B7B7B7" w:sz="4"/>
+              <w:left w:val="single" w:color="B7B7B7" w:sz="4"/>
+              <w:bottom w:val="single" w:color="B7B7B7" w:sz="4"/>
+              <w:right w:val="single" w:color="B7B7B7" w:sz="4"/>
+            </w:tcBorders>
+            <w:tcMar>
+              <w:top w:type="dxa" w:w="50"/>
+              <w:left w:type="dxa" w:w="90"/>
+              <w:bottom w:type="dxa" w:w="50"/>
+              <w:right w:type="dxa" w:w="90"/>
+            </w:tcMar>
+            <w:vAlign w:val="center"/>
+          </w:tcPr>
+          <w:p>
+            <w:pPr>
+              <w:keepNext/>
+              <w:spacing w:after="0" w:before="0"/>
+            </w:pPr>
+            <w:r>
+              <w:rPr>
+                <w:rFonts w:ascii="Arial" w:cs="Arial" w:eastAsia="Arial" w:hAnsi="Arial"/>
+                <w:sz w:val="18"/>
+                <w:szCs w:val="18"/>
+              </w:rPr>
+              <w:t xml:space="preserve">-</w:t>
+            </w:r>
+          </w:p>
+        </w:tc>
+        <w:tc>
+          <w:tcPr>
+            <w:tcW w:type="dxa" w:w="650"/>
+            <w:tcBorders>
+              <w:top w:val="single" w:color="B7B7B7" w:sz="4"/>
+              <w:left w:val="single" w:color="B7B7B7" w:sz="4"/>
+              <w:bottom w:val="single" w:color="B7B7B7" w:sz="4"/>
+              <w:right w:val="single" w:color="B7B7B7" w:sz="4"/>
+            </w:tcBorders>
+            <w:tcMar>
+              <w:top w:type="dxa" w:w="50"/>
+              <w:left w:type="dxa" w:w="90"/>
+              <w:bottom w:type="dxa" w:w="50"/>
+              <w:right w:type="dxa" w:w="90"/>
+            </w:tcMar>
+            <w:vAlign w:val="center"/>
+          </w:tcPr>
+          <w:p>
+            <w:pPr>
+              <w:keepNext/>
+              <w:spacing w:after="0" w:before="0"/>
+            </w:pPr>
+            <w:r>
+              <w:rPr>
+                <w:rFonts w:ascii="Arial" w:cs="Arial" w:eastAsia="Arial" w:hAnsi="Arial"/>
+                <w:sz w:val="18"/>
+                <w:szCs w:val="18"/>
+              </w:rPr>
+              <w:t xml:space="preserve">6:15</w:t>
+            </w:r>
+          </w:p>
+        </w:tc>
+        <w:tc>
+          <w:tcPr>
+            <w:tcW w:type="dxa" w:w="1300"/>
+            <w:tcBorders>
+              <w:top w:val="single" w:color="B7B7B7" w:sz="4"/>
+              <w:left w:val="single" w:color="B7B7B7" w:sz="4"/>
+              <w:bottom w:val="single" w:color="B7B7B7" w:sz="4"/>
+              <w:right w:val="single" w:color="B7B7B7" w:sz="4"/>
+            </w:tcBorders>
+            <w:tcMar>
+              <w:top w:type="dxa" w:w="50"/>
+              <w:left w:type="dxa" w:w="90"/>
+              <w:bottom w:type="dxa" w:w="50"/>
+              <w:right w:type="dxa" w:w="90"/>
+            </w:tcMar>
+            <w:vAlign w:val="center"/>
+          </w:tcPr>
+          <w:p>
+            <w:pPr>
+              <w:keepNext/>
+              <w:spacing w:after="0" w:before="0"/>
+            </w:pPr>
+            <w:r>
+              <w:rPr>
+                <w:rFonts w:ascii="Arial" w:cs="Arial" w:eastAsia="Arial" w:hAnsi="Arial"/>
+                <w:b/>
+                <w:bCs/>
+                <w:color w:val="1B7F3B"/>
+                <w:sz w:val="18"/>
+                <w:szCs w:val="18"/>
+              </w:rPr>
+              <w:t xml:space="preserve">CLEAN</w:t>
+            </w:r>
+          </w:p>
+        </w:tc>
+        <w:tc>
+          <w:tcPr>
+            <w:tcW w:type="dxa" w:w="3000"/>
+            <w:tcBorders>
+              <w:top w:val="single" w:color="B7B7B7" w:sz="4"/>
+              <w:left w:val="single" w:color="B7B7B7" w:sz="4"/>
+              <w:bottom w:val="single" w:color="B7B7B7" w:sz="4"/>
+              <w:right w:val="single" w:color="B7B7B7" w:sz="4"/>
+            </w:tcBorders>
+            <w:tcMar>
+              <w:top w:type="dxa" w:w="50"/>
+              <w:left w:type="dxa" w:w="90"/>
+              <w:bottom w:type="dxa" w:w="50"/>
+              <w:right w:type="dxa" w:w="90"/>
+            </w:tcMar>
+            <w:vAlign w:val="center"/>
+          </w:tcPr>
+          <w:p>
+            <w:pPr>
+              <w:keepNext/>
+              <w:spacing w:after="0" w:before="0"/>
+            </w:pPr>
+            <w:r>
+              <w:rPr>
+                <w:rFonts w:ascii="Arial" w:cs="Arial" w:eastAsia="Arial" w:hAnsi="Arial"/>
+                <w:sz w:val="16"/>
+                <w:szCs w:val="16"/>
+              </w:rPr>
+              <w:t xml:space="preserve">Stace's pick. Instrumental B-side of a once tour-only 7-inch, out Feb. 13 on the band's Duophonic label.</w:t>
+            </w:r>
+          </w:p>
+        </w:tc>
+      </w:tr>
+      <w:tr>
+        <w:trPr>
+          <w:cantSplit/>
+        </w:trPr>
+        <w:tc>
+          <w:tcPr>
+            <w:tcW w:type="dxa" w:w="450"/>
+            <w:tcBorders>
+              <w:top w:val="single" w:color="B7B7B7" w:sz="4"/>
+              <w:left w:val="single" w:color="B7B7B7" w:sz="4"/>
+              <w:bottom w:val="single" w:color="B7B7B7" w:sz="4"/>
+              <w:right w:val="single" w:color="B7B7B7" w:sz="4"/>
+            </w:tcBorders>
+            <w:shd w:fill="F5F7FA" w:color="auto" w:val="clear"/>
+            <w:tcMar>
+              <w:top w:type="dxa" w:w="50"/>
+              <w:left w:type="dxa" w:w="90"/>
+              <w:bottom w:type="dxa" w:w="50"/>
+              <w:right w:type="dxa" w:w="90"/>
+            </w:tcMar>
+            <w:vAlign w:val="center"/>
+          </w:tcPr>
+          <w:p>
+            <w:pPr>
+              <w:keepNext w:val="false"/>
+              <w:spacing w:after="0" w:before="0"/>
+            </w:pPr>
+            <w:r>
+              <w:rPr>
+                <w:rFonts w:ascii="Arial" w:cs="Arial" w:eastAsia="Arial" w:hAnsi="Arial"/>
+                <w:b/>
+                <w:bCs/>
+                <w:sz w:val="18"/>
+                <w:szCs w:val="18"/>
+              </w:rPr>
+              <w:t xml:space="preserve">35</w:t>
+            </w:r>
+          </w:p>
+        </w:tc>
+        <w:tc>
+          <w:tcPr>
+            <w:tcW w:type="dxa" w:w="1800"/>
+            <w:tcBorders>
+              <w:top w:val="single" w:color="B7B7B7" w:sz="4"/>
+              <w:left w:val="single" w:color="B7B7B7" w:sz="4"/>
+              <w:bottom w:val="single" w:color="B7B7B7" w:sz="4"/>
+              <w:right w:val="single" w:color="B7B7B7" w:sz="4"/>
+            </w:tcBorders>
+            <w:shd w:fill="F5F7FA" w:color="auto" w:val="clear"/>
+            <w:tcMar>
+              <w:top w:type="dxa" w:w="50"/>
+              <w:left w:type="dxa" w:w="90"/>
+              <w:bottom w:type="dxa" w:w="50"/>
+              <w:right w:type="dxa" w:w="90"/>
+            </w:tcMar>
+            <w:vAlign w:val="center"/>
+          </w:tcPr>
+          <w:p>
+            <w:pPr>
+              <w:keepNext w:val="false"/>
+              <w:spacing w:after="0" w:before="0"/>
+            </w:pPr>
+            <w:r>
+              <w:rPr>
+                <w:rFonts w:ascii="Arial" w:cs="Arial" w:eastAsia="Arial" w:hAnsi="Arial"/>
+                <w:b/>
+                <w:bCs/>
+                <w:sz w:val="18"/>
+                <w:szCs w:val="18"/>
+              </w:rPr>
+              <w:t xml:space="preserve">Morphine</w:t>
+            </w:r>
+          </w:p>
+        </w:tc>
+        <w:tc>
+          <w:tcPr>
+            <w:tcW w:type="dxa" w:w="2600"/>
+            <w:tcBorders>
+              <w:top w:val="single" w:color="B7B7B7" w:sz="4"/>
+              <w:left w:val="single" w:color="B7B7B7" w:sz="4"/>
+              <w:bottom w:val="single" w:color="B7B7B7" w:sz="4"/>
+              <w:right w:val="single" w:color="B7B7B7" w:sz="4"/>
+            </w:tcBorders>
+            <w:shd w:fill="F5F7FA" w:color="auto" w:val="clear"/>
+            <w:tcMar>
+              <w:top w:type="dxa" w:w="50"/>
+              <w:left w:type="dxa" w:w="90"/>
+              <w:bottom w:type="dxa" w:w="50"/>
+              <w:right w:type="dxa" w:w="90"/>
+            </w:tcMar>
+            <w:vAlign w:val="center"/>
+          </w:tcPr>
+          <w:p>
+            <w:pPr>
+              <w:keepNext w:val="false"/>
+              <w:spacing w:after="0" w:before="0"/>
+            </w:pPr>
+            <w:r>
+              <w:rPr>
+                <w:rFonts w:ascii="Arial" w:cs="Arial" w:eastAsia="Arial" w:hAnsi="Arial"/>
+                <w:b/>
+                <w:bCs/>
+                <w:sz w:val="20"/>
+                <w:szCs w:val="20"/>
+              </w:rPr>
               <w:t xml:space="preserve">Cocoon</w:t>
             </w:r>
           </w:p>
@@ -20645,6 +20714,7 @@
               <w:bottom w:val="single" w:color="B7B7B7" w:sz="4"/>
               <w:right w:val="single" w:color="B7B7B7" w:sz="4"/>
             </w:tcBorders>
+            <w:shd w:fill="F5F7FA" w:color="auto" w:val="clear"/>
             <w:tcMar>
               <w:top w:type="dxa" w:w="50"/>
               <w:left w:type="dxa" w:w="90"/>
@@ -20677,6 +20747,7 @@
               <w:bottom w:val="single" w:color="B7B7B7" w:sz="4"/>
               <w:right w:val="single" w:color="B7B7B7" w:sz="4"/>
             </w:tcBorders>
+            <w:shd w:fill="F5F7FA" w:color="auto" w:val="clear"/>
             <w:tcMar>
               <w:top w:type="dxa" w:w="50"/>
               <w:left w:type="dxa" w:w="90"/>
@@ -20709,6 +20780,7 @@
               <w:bottom w:val="single" w:color="B7B7B7" w:sz="4"/>
               <w:right w:val="single" w:color="B7B7B7" w:sz="4"/>
             </w:tcBorders>
+            <w:shd w:fill="F5F7FA" w:color="auto" w:val="clear"/>
             <w:tcMar>
               <w:top w:type="dxa" w:w="50"/>
               <w:left w:type="dxa" w:w="90"/>
@@ -20741,6 +20813,7 @@
               <w:bottom w:val="single" w:color="B7B7B7" w:sz="4"/>
               <w:right w:val="single" w:color="B7B7B7" w:sz="4"/>
             </w:tcBorders>
+            <w:shd w:fill="F5F7FA" w:color="auto" w:val="clear"/>
             <w:tcMar>
               <w:top w:type="dxa" w:w="50"/>
               <w:left w:type="dxa" w:w="90"/>
@@ -20773,6 +20846,7 @@
               <w:bottom w:val="single" w:color="B7B7B7" w:sz="4"/>
               <w:right w:val="single" w:color="B7B7B7" w:sz="4"/>
             </w:tcBorders>
+            <w:shd w:fill="F5F7FA" w:color="auto" w:val="clear"/>
             <w:tcMar>
               <w:top w:type="dxa" w:w="50"/>
               <w:left w:type="dxa" w:w="90"/>
@@ -20808,6 +20882,7 @@
               <w:bottom w:val="single" w:color="B7B7B7" w:sz="4"/>
               <w:right w:val="single" w:color="B7B7B7" w:sz="4"/>
             </w:tcBorders>
+            <w:shd w:fill="F5F7FA" w:color="auto" w:val="clear"/>
             <w:tcMar>
               <w:top w:type="dxa" w:w="50"/>
               <w:left w:type="dxa" w:w="90"/>
@@ -22383,7 +22458,7 @@
       <w:tr>
         <w:trPr>
           <w:cantSplit/>
-          <w:tblHeader w:val="false"/>
+          <w:tblHeader w:val="off"/>
         </w:trPr>
         <w:tc>
           <w:tcPr>
@@ -32229,7 +32304,7 @@
       </w:r>
     </w:p>
     <w:sectPr>
-      <w:footerReference w:type="default" r:id="rId7"/>
+      <w:footerReference w:type="default" r:id="rId6"/>
       <w:pgSz w:w="15840" w:h="12240" w:orient="landscape"/>
       <w:pgMar w:top="720" w:right="720" w:bottom="720" w:left="720" w:header="708" w:footer="708" w:gutter="0"/>
       <w:pgNumType/>
@@ -32237,10 +32312,6 @@
     </w:sectPr>
   </w:body>
 </w:document>
-</file>
-
-<file path=word/comments.xml><?xml version="1.0" encoding="utf-8"?>
-<w:comments xmlns:cx="http://schemas.microsoft.com/office/drawing/2014/chartex" xmlns:cx1="http://schemas.microsoft.com/office/drawing/2015/9/8/chartex" xmlns:cx2="http://schemas.microsoft.com/office/drawing/2015/10/21/chartex" xmlns:cx3="http://schemas.microsoft.com/office/drawing/2016/5/9/chartex" xmlns:cx4="http://schemas.microsoft.com/office/drawing/2016/5/10/chartex" xmlns:cx5="http://schemas.microsoft.com/office/drawing/2016/5/11/chartex" xmlns:cx6="http://schemas.microsoft.com/office/drawing/2016/5/12/chartex" xmlns:cx7="http://schemas.microsoft.com/office/drawing/2016/5/13/chartex" xmlns:cx8="http://schemas.microsoft.com/office/drawing/2016/5/14/chartex" xmlns:mc="http://schemas.openxmlformats.org/markup-compatibility/2006" xmlns:aink="http://schemas.microsoft.com/office/drawing/2016/ink" xmlns:am3d="http://schemas.microsoft.com/office/drawing/2017/model3d" xmlns:o="urn:schemas-microsoft-com:office:office" xmlns:r="http://schemas.openxmlformats.org/officeDocument/2006/relationships" xmlns:m="http://schemas.openxmlformats.org/officeDocument/2006/math" xmlns:v="urn:schemas-microsoft-com:vml" xmlns:wp14="http://schemas.microsoft.com/office/word/2010/wordprocessingDrawing" xmlns:wp="http://schemas.openxmlformats.org/drawingml/2006/wordprocessingDrawing" xmlns:w10="urn:schemas-microsoft-com:office:word" xmlns:w="http://schemas.openxmlformats.org/wordprocessingml/2006/main" xmlns:w14="http://schemas.microsoft.com/office/word/2010/wordml" xmlns:w15="http://schemas.microsoft.com/office/word/2012/wordml" xmlns:w16cex="http://schemas.microsoft.com/office/word/2018/wordml/cex" xmlns:w16cid="http://schemas.microsoft.com/office/word/2016/wordml/cid" xmlns:w16="http://schemas.microsoft.com/office/word/2018/wordml" xmlns:w16sdtdh="http://schemas.microsoft.com/office/word/2020/wordml/sdtdatahash" xmlns:w16se="http://schemas.microsoft.com/office/word/2015/wordml/symex" xmlns:wpg="http://schemas.microsoft.com/office/word/2010/wordprocessingGroup" xmlns:wpi="http://schemas.microsoft.com/office/word/2010/wordprocessingInk" xmlns:wne="http://schemas.microsoft.com/office/word/2006/wordml" xmlns:wps="http://schemas.microsoft.com/office/word/2010/wordprocessingShape"/>
 </file>
 
 <file path=word/endnotes.xml><?xml version="1.0" encoding="utf-8"?>
@@ -32352,7 +32423,7 @@
 <w:numbering xmlns:wpc="http://schemas.microsoft.com/office/word/2010/wordprocessingCanvas" xmlns:mc="http://schemas.openxmlformats.org/markup-compatibility/2006" xmlns:o="urn:schemas-microsoft-com:office:office" xmlns:r="http://schemas.openxmlformats.org/officeDocument/2006/relationships" xmlns:m="http://schemas.openxmlformats.org/officeDocument/2006/math" xmlns:v="urn:schemas-microsoft-com:vml" xmlns:wp14="http://schemas.microsoft.com/office/word/2010/wordprocessingDrawing" xmlns:wp="http://schemas.openxmlformats.org/drawingml/2006/wordprocessingDrawing" xmlns:w10="urn:schemas-microsoft-com:office:word" xmlns:w="http://schemas.openxmlformats.org/wordprocessingml/2006/main" xmlns:w14="http://schemas.microsoft.com/office/word/2010/wordml" xmlns:w15="http://schemas.microsoft.com/office/word/2012/wordml" xmlns:wpg="http://schemas.microsoft.com/office/word/2010/wordprocessingGroup" xmlns:wpi="http://schemas.microsoft.com/office/word/2010/wordprocessingInk" xmlns:wne="http://schemas.microsoft.com/office/word/2006/wordml" xmlns:wps="http://schemas.microsoft.com/office/word/2010/wordprocessingShape" mc:Ignorable="w14 w15 wp14">
   <w:abstractNum w:abstractNumId="1" w15:restartNumberingAfterBreak="0">
     <w:multiLevelType w:val="hybridMultilevel"/>
-    <w:lvl w:ilvl="0" w15:tentative="1">
+    <w:lvl w:ilvl="0" w:tentative="1">
       <w:start w:val="1"/>
       <w:numFmt w:val="bullet"/>
       <w:lvlText w:val="●"/>
@@ -32361,7 +32432,7 @@
         <w:ind w:left="720" w:hanging="360"/>
       </w:pPr>
     </w:lvl>
-    <w:lvl w:ilvl="1" w15:tentative="1">
+    <w:lvl w:ilvl="1" w:tentative="1">
       <w:start w:val="1"/>
       <w:numFmt w:val="bullet"/>
       <w:lvlText w:val="○"/>
@@ -32370,7 +32441,7 @@
         <w:ind w:left="1440" w:hanging="360"/>
       </w:pPr>
     </w:lvl>
-    <w:lvl w:ilvl="2" w15:tentative="1">
+    <w:lvl w:ilvl="2" w:tentative="1">
       <w:start w:val="1"/>
       <w:numFmt w:val="bullet"/>
       <w:lvlText w:val="■"/>
@@ -32379,7 +32450,7 @@
         <w:ind w:left="2160" w:hanging="360"/>
       </w:pPr>
     </w:lvl>
-    <w:lvl w:ilvl="3" w15:tentative="1">
+    <w:lvl w:ilvl="3" w:tentative="1">
       <w:start w:val="1"/>
       <w:numFmt w:val="bullet"/>
       <w:lvlText w:val="●"/>
@@ -32388,7 +32459,7 @@
         <w:ind w:left="2880" w:hanging="360"/>
       </w:pPr>
     </w:lvl>
-    <w:lvl w:ilvl="4" w15:tentative="1">
+    <w:lvl w:ilvl="4" w:tentative="1">
       <w:start w:val="1"/>
       <w:numFmt w:val="bullet"/>
       <w:lvlText w:val="○"/>
@@ -32397,7 +32468,7 @@
         <w:ind w:left="3600" w:hanging="360"/>
       </w:pPr>
     </w:lvl>
-    <w:lvl w:ilvl="5" w15:tentative="1">
+    <w:lvl w:ilvl="5" w:tentative="1">
       <w:start w:val="1"/>
       <w:numFmt w:val="bullet"/>
       <w:lvlText w:val="■"/>
@@ -32406,7 +32477,7 @@
         <w:ind w:left="4320" w:hanging="360"/>
       </w:pPr>
     </w:lvl>
-    <w:lvl w:ilvl="6" w15:tentative="1">
+    <w:lvl w:ilvl="6" w:tentative="1">
       <w:start w:val="1"/>
       <w:numFmt w:val="bullet"/>
       <w:lvlText w:val="●"/>
@@ -32415,7 +32486,7 @@
         <w:ind w:left="5040" w:hanging="360"/>
       </w:pPr>
     </w:lvl>
-    <w:lvl w:ilvl="7" w15:tentative="1">
+    <w:lvl w:ilvl="7" w:tentative="1">
       <w:start w:val="1"/>
       <w:numFmt w:val="bullet"/>
       <w:lvlText w:val="●"/>
@@ -32424,7 +32495,7 @@
         <w:ind w:left="5760" w:hanging="360"/>
       </w:pPr>
     </w:lvl>
-    <w:lvl w:ilvl="8" w15:tentative="1">
+    <w:lvl w:ilvl="8" w:tentative="1">
       <w:start w:val="1"/>
       <w:numFmt w:val="bullet"/>
       <w:lvlText w:val="●"/>
@@ -32455,6 +32526,25 @@
     </w:rPrDefault>
     <w:pPrDefault/>
   </w:docDefaults>
+  <w:style w:type="paragraph" w:styleId="Normal" w:default="1">
+    <w:name w:val="Normal"/>
+    <w:qFormat/>
+  </w:style>
+  <w:style w:type="table" w:styleId="TableNormal" w:default="true">
+    <w:name w:val="Normal Table"/>
+    <w:uiPriority w:val="99"/>
+    <w:semiHidden/>
+    <w:unhideWhenUsed/>
+    <w:tblPr>
+      <w:tblInd w:type="dxa" w:w="0"/>
+      <w:tblCellMar>
+        <w:top w:type="dxa" w:w="0"/>
+        <w:left w:type="dxa" w:w="108"/>
+        <w:bottom w:type="dxa" w:w="0"/>
+        <w:right w:type="dxa" w:w="108"/>
+      </w:tblCellMar>
+    </w:tblPr>
+  </w:style>
   <w:style w:type="paragraph" w:styleId="Title">
     <w:name w:val="Title"/>
     <w:basedOn w:val="Normal"/>
@@ -32627,4 +32717,294 @@
     </w:rPr>
   </w:style>
 </w:styles>
+</file>
+
+<file path=word/theme/theme1.xml><?xml version="1.0" encoding="utf-8"?>
+<a:theme xmlns:a="http://schemas.openxmlformats.org/drawingml/2006/main" name="Office Theme">
+  <a:themeElements>
+    <a:clrScheme name="Office">
+      <a:dk1>
+        <a:sysClr val="windowText" lastClr="000000"/>
+      </a:dk1>
+      <a:lt1>
+        <a:sysClr val="window" lastClr="FFFFFF"/>
+      </a:lt1>
+      <a:dk2>
+        <a:srgbClr val="44546A"/>
+      </a:dk2>
+      <a:lt2>
+        <a:srgbClr val="E7E6E6"/>
+      </a:lt2>
+      <a:accent1>
+        <a:srgbClr val="4472C4"/>
+      </a:accent1>
+      <a:accent2>
+        <a:srgbClr val="ED7D31"/>
+      </a:accent2>
+      <a:accent3>
+        <a:srgbClr val="A5A5A5"/>
+      </a:accent3>
+      <a:accent4>
+        <a:srgbClr val="FFC000"/>
+      </a:accent4>
+      <a:accent5>
+        <a:srgbClr val="5B9BD5"/>
+      </a:accent5>
+      <a:accent6>
+        <a:srgbClr val="70AD47"/>
+      </a:accent6>
+      <a:hlink>
+        <a:srgbClr val="0563C1"/>
+      </a:hlink>
+      <a:folHlink>
+        <a:srgbClr val="954F72"/>
+      </a:folHlink>
+    </a:clrScheme>
+    <a:fontScheme name="Office">
+      <a:majorFont>
+        <a:latin typeface="Calibri Light" panose="020F0302020204030204"/>
+        <a:ea typeface=""/>
+        <a:cs typeface=""/>
+        <a:font script="Jpan" typeface="游ゴシック Light"/>
+        <a:font script="Hang" typeface="맑은 고딕"/>
+        <a:font script="Hans" typeface="等线 Light"/>
+        <a:font script="Hant" typeface="新細明體"/>
+        <a:font script="Arab" typeface="Times New Roman"/>
+        <a:font script="Hebr" typeface="Times New Roman"/>
+        <a:font script="Thai" typeface="Angsana New"/>
+        <a:font script="Ethi" typeface="Nyala"/>
+        <a:font script="Beng" typeface="Vrinda"/>
+        <a:font script="Gujr" typeface="Shruti"/>
+        <a:font script="Khmr" typeface="MoolBoran"/>
+        <a:font script="Knda" typeface="Tunga"/>
+        <a:font script="Guru" typeface="Raavi"/>
+        <a:font script="Cans" typeface="Euphemia"/>
+        <a:font script="Cher" typeface="Plantagenet Cherokee"/>
+        <a:font script="Yiii" typeface="Microsoft Yi Baiti"/>
+        <a:font script="Tibt" typeface="Microsoft Himalaya"/>
+        <a:font script="Thaa" typeface="MV Boli"/>
+        <a:font script="Deva" typeface="Mangal"/>
+        <a:font script="Telu" typeface="Gautami"/>
+        <a:font script="Taml" typeface="Latha"/>
+        <a:font script="Syrc" typeface="Estrangelo Edessa"/>
+        <a:font script="Orya" typeface="Kalinga"/>
+        <a:font script="Mlym" typeface="Kartika"/>
+        <a:font script="Laoo" typeface="DokChampa"/>
+        <a:font script="Sinh" typeface="Iskoola Pota"/>
+        <a:font script="Mong" typeface="Mongolian Baiti"/>
+        <a:font script="Viet" typeface="Times New Roman"/>
+        <a:font script="Uigh" typeface="Microsoft Uighur"/>
+        <a:font script="Geor" typeface="Sylfaen"/>
+        <a:font script="Armn" typeface="Arial"/>
+        <a:font script="Bugi" typeface="Leelawadee UI"/>
+        <a:font script="Bopo" typeface="Microsoft JhengHei"/>
+        <a:font script="Java" typeface="Javanese Text"/>
+        <a:font script="Lisu" typeface="Segoe UI"/>
+        <a:font script="Mymr" typeface="Myanmar Text"/>
+        <a:font script="Nkoo" typeface="Ebrima"/>
+        <a:font script="Olck" typeface="Nirmala UI"/>
+        <a:font script="Osma" typeface="Ebrima"/>
+        <a:font script="Phag" typeface="Phagspa"/>
+        <a:font script="Syrn" typeface="Estrangelo Edessa"/>
+        <a:font script="Syrj" typeface="Estrangelo Edessa"/>
+        <a:font script="Syre" typeface="Estrangelo Edessa"/>
+        <a:font script="Sora" typeface="Nirmala UI"/>
+        <a:font script="Tale" typeface="Microsoft Tai Le"/>
+        <a:font script="Talu" typeface="Microsoft New Tai Lue"/>
+        <a:font script="Tfng" typeface="Ebrima"/>
+      </a:majorFont>
+      <a:minorFont>
+        <a:latin typeface="Calibri" panose="020F0502020204030204"/>
+        <a:ea typeface=""/>
+        <a:cs typeface=""/>
+        <a:font script="Jpan" typeface="游明朝"/>
+        <a:font script="Hang" typeface="맑은 고딕"/>
+        <a:font script="Hans" typeface="等线"/>
+        <a:font script="Hant" typeface="新細明體"/>
+        <a:font script="Arab" typeface="Arial"/>
+        <a:font script="Hebr" typeface="Arial"/>
+        <a:font script="Thai" typeface="Cordia New"/>
+        <a:font script="Ethi" typeface="Nyala"/>
+        <a:font script="Beng" typeface="Vrinda"/>
+        <a:font script="Gujr" typeface="Shruti"/>
+        <a:font script="Khmr" typeface="DaunPenh"/>
+        <a:font script="Knda" typeface="Tunga"/>
+        <a:font script="Guru" typeface="Raavi"/>
+        <a:font script="Cans" typeface="Euphemia"/>
+        <a:font script="Cher" typeface="Plantagenet Cherokee"/>
+        <a:font script="Yiii" typeface="Microsoft Yi Baiti"/>
+        <a:font script="Tibt" typeface="Microsoft Himalaya"/>
+        <a:font script="Thaa" typeface="MV Boli"/>
+        <a:font script="Deva" typeface="Mangal"/>
+        <a:font script="Telu" typeface="Gautami"/>
+        <a:font script="Taml" typeface="Latha"/>
+        <a:font script="Syrc" typeface="Estrangelo Edessa"/>
+        <a:font script="Orya" typeface="Kalinga"/>
+        <a:font script="Mlym" typeface="Kartika"/>
+        <a:font script="Laoo" typeface="DokChampa"/>
+        <a:font script="Sinh" typeface="Iskoola Pota"/>
+        <a:font script="Mong" typeface="Mongolian Baiti"/>
+        <a:font script="Viet" typeface="Arial"/>
+        <a:font script="Uigh" typeface="Microsoft Uighur"/>
+        <a:font script="Geor" typeface="Sylfaen"/>
+        <a:font script="Armn" typeface="Arial"/>
+        <a:font script="Bugi" typeface="Leelawadee UI"/>
+        <a:font script="Bopo" typeface="Microsoft JhengHei"/>
+        <a:font script="Java" typeface="Javanese Text"/>
+        <a:font script="Lisu" typeface="Segoe UI"/>
+        <a:font script="Mymr" typeface="Myanmar Text"/>
+        <a:font script="Nkoo" typeface="Ebrima"/>
+        <a:font script="Olck" typeface="Nirmala UI"/>
+        <a:font script="Osma" typeface="Ebrima"/>
+        <a:font script="Phag" typeface="Phagspa"/>
+        <a:font script="Syrn" typeface="Estrangelo Edessa"/>
+        <a:font script="Syrj" typeface="Estrangelo Edessa"/>
+        <a:font script="Syre" typeface="Estrangelo Edessa"/>
+        <a:font script="Sora" typeface="Nirmala UI"/>
+        <a:font script="Tale" typeface="Microsoft Tai Le"/>
+        <a:font script="Talu" typeface="Microsoft New Tai Lue"/>
+        <a:font script="Tfng" typeface="Ebrima"/>
+      </a:minorFont>
+    </a:fontScheme>
+    <a:fmtScheme name="Office">
+      <a:fillStyleLst>
+        <a:solidFill>
+          <a:schemeClr val="phClr"/>
+        </a:solidFill>
+        <a:gradFill rotWithShape="true">
+          <a:gsLst>
+            <a:gs pos="0">
+              <a:schemeClr val="phClr">
+                <a:lumMod val="110000"/>
+                <a:satMod val="105000"/>
+                <a:tint val="67000"/>
+              </a:schemeClr>
+            </a:gs>
+            <a:gs pos="50000">
+              <a:schemeClr val="phClr">
+                <a:lumMod val="105000"/>
+                <a:satMod val="103000"/>
+                <a:tint val="73000"/>
+              </a:schemeClr>
+            </a:gs>
+            <a:gs pos="100000">
+              <a:schemeClr val="phClr">
+                <a:lumMod val="105000"/>
+                <a:satMod val="109000"/>
+                <a:tint val="81000"/>
+              </a:schemeClr>
+            </a:gs>
+          </a:gsLst>
+          <a:lin ang="5400000" scaled="false"/>
+        </a:gradFill>
+        <a:gradFill rotWithShape="true">
+          <a:gsLst>
+            <a:gs pos="0">
+              <a:schemeClr val="phClr">
+                <a:satMod val="103000"/>
+                <a:lumMod val="102000"/>
+                <a:tint val="94000"/>
+              </a:schemeClr>
+            </a:gs>
+            <a:gs pos="50000">
+              <a:schemeClr val="phClr">
+                <a:satMod val="110000"/>
+                <a:lumMod val="100000"/>
+                <a:shade val="100000"/>
+              </a:schemeClr>
+            </a:gs>
+            <a:gs pos="100000">
+              <a:schemeClr val="phClr">
+                <a:lumMod val="99000"/>
+                <a:satMod val="120000"/>
+                <a:shade val="78000"/>
+              </a:schemeClr>
+            </a:gs>
+          </a:gsLst>
+          <a:lin ang="5400000" scaled="false"/>
+        </a:gradFill>
+      </a:fillStyleLst>
+      <a:lnStyleLst>
+        <a:ln w="6350" cap="flat" cmpd="sng" algn="ctr">
+          <a:solidFill>
+            <a:schemeClr val="phClr"/>
+          </a:solidFill>
+          <a:prstDash val="solid"/>
+          <a:miter lim="800000"/>
+        </a:ln>
+        <a:ln w="12700" cap="flat" cmpd="sng" algn="ctr">
+          <a:solidFill>
+            <a:schemeClr val="phClr"/>
+          </a:solidFill>
+          <a:prstDash val="solid"/>
+          <a:miter lim="800000"/>
+        </a:ln>
+        <a:ln w="19050" cap="flat" cmpd="sng" algn="ctr">
+          <a:solidFill>
+            <a:schemeClr val="phClr"/>
+          </a:solidFill>
+          <a:prstDash val="solid"/>
+          <a:miter lim="800000"/>
+        </a:ln>
+      </a:lnStyleLst>
+      <a:effectStyleLst>
+        <a:effectStyle>
+          <a:effectLst/>
+        </a:effectStyle>
+        <a:effectStyle>
+          <a:effectLst/>
+        </a:effectStyle>
+        <a:effectStyle>
+          <a:effectLst>
+            <a:outerShdw blurRad="57150" dist="19050" dir="5400000" algn="ctr" rotWithShape="false">
+              <a:srgbClr val="000000">
+                <a:alpha val="63000"/>
+              </a:srgbClr>
+            </a:outerShdw>
+          </a:effectLst>
+        </a:effectStyle>
+      </a:effectStyleLst>
+      <a:bgFillStyleLst>
+        <a:solidFill>
+          <a:schemeClr val="phClr"/>
+        </a:solidFill>
+        <a:solidFill>
+          <a:schemeClr val="phClr">
+            <a:tint val="95000"/>
+            <a:satMod val="170000"/>
+          </a:schemeClr>
+        </a:solidFill>
+        <a:gradFill rotWithShape="true">
+          <a:gsLst>
+            <a:gs pos="0">
+              <a:schemeClr val="phClr">
+                <a:tint val="93000"/>
+                <a:satMod val="150000"/>
+                <a:shade val="98000"/>
+                <a:lumMod val="102000"/>
+              </a:schemeClr>
+            </a:gs>
+            <a:gs pos="50000">
+              <a:schemeClr val="phClr">
+                <a:tint val="98000"/>
+                <a:satMod val="130000"/>
+                <a:shade val="90000"/>
+                <a:lumMod val="103000"/>
+              </a:schemeClr>
+            </a:gs>
+            <a:gs pos="100000">
+              <a:schemeClr val="phClr">
+                <a:shade val="63000"/>
+                <a:satMod val="120000"/>
+              </a:schemeClr>
+            </a:gs>
+          </a:gsLst>
+          <a:lin ang="5400000" scaled="false"/>
+        </a:gradFill>
+      </a:bgFillStyleLst>
+    </a:fmtScheme>
+  </a:themeElements>
+  <a:objectDefaults/>
+  <a:extraClrSchemeLst/>
+</a:theme>
 </file>
</xml_diff>

<commit_message>
Oct. 8 show rebuild: Mahgeetah, Slow Train, Morphine fix, tags, new templates
</commit_message>
<xml_diff>
--- a/outputs/recon/2026-10-08/Library Show Final Show Script 2026-10-08 (Landscape Tables).docx
+++ b/outputs/recon/2026-10-08/Library Show Final Show Script 2026-10-08 (Landscape Tables).docx
@@ -29,7 +29,7 @@
           <w:sz w:val="18"/>
           <w:szCs w:val="18"/>
         </w:rPr>
-        <w:t xml:space="preserve">Thursday, Oct. 8, 2026  |  KZSU 90.1 FM  |  6-8 p.m. PT  |  Final build Wed. Oct. 7  |  Landscape table version</w:t>
+        <w:t xml:space="preserve">Thursday, Oct. 8, 2026  |  KZSU 90.1 FM  |  6-8 p.m. PT  |  Final build Wed. Oct. 7, updated Thu. Oct. 8  |  Landscape table version</w:t>
       </w:r>
     </w:p>
     <w:p>
@@ -667,7 +667,7 @@
                 <w:sz w:val="18"/>
                 <w:szCs w:val="18"/>
               </w:rPr>
-              <w:t xml:space="preserve">31:19</w:t>
+              <w:t xml:space="preserve">31:20</w:t>
             </w:r>
           </w:p>
         </w:tc>
@@ -729,7 +729,7 @@
                 <w:sz w:val="18"/>
                 <w:szCs w:val="18"/>
               </w:rPr>
-              <w:t xml:space="preserve">46:57</w:t>
+              <w:t xml:space="preserve">46:58</w:t>
             </w:r>
           </w:p>
         </w:tc>
@@ -894,7 +894,7 @@
                 <w:sz w:val="18"/>
                 <w:szCs w:val="18"/>
               </w:rPr>
-              <w:t xml:space="preserve">59:05</w:t>
+              <w:t xml:space="preserve">59:06</w:t>
             </w:r>
           </w:p>
         </w:tc>
@@ -1054,7 +1054,7 @@
                 <w:sz w:val="18"/>
                 <w:szCs w:val="18"/>
               </w:rPr>
-              <w:t xml:space="preserve">1:17:22</w:t>
+              <w:t xml:space="preserve">1:17:23</w:t>
             </w:r>
           </w:p>
         </w:tc>
@@ -1155,7 +1155,7 @@
                 <w:sz w:val="18"/>
                 <w:szCs w:val="18"/>
               </w:rPr>
-              <w:t xml:space="preserve">38:52</w:t>
+              <w:t xml:space="preserve">38:54</w:t>
             </w:r>
           </w:p>
         </w:tc>
@@ -1219,7 +1219,7 @@
                 <w:sz w:val="18"/>
                 <w:szCs w:val="18"/>
               </w:rPr>
-              <w:t xml:space="preserve">1:56:14</w:t>
+              <w:t xml:space="preserve">1:56:17</w:t>
             </w:r>
           </w:p>
         </w:tc>
@@ -1379,7 +1379,7 @@
                 <w:sz w:val="18"/>
                 <w:szCs w:val="18"/>
               </w:rPr>
-              <w:t xml:space="preserve">2:23:53</w:t>
+              <w:t xml:space="preserve">2:23:56</w:t>
             </w:r>
           </w:p>
         </w:tc>
@@ -1448,7 +1448,7 @@
                 <w:sz w:val="18"/>
                 <w:szCs w:val="18"/>
               </w:rPr>
-              <w:t xml:space="preserve">7</w:t>
+              <w:t xml:space="preserve">9</w:t>
             </w:r>
           </w:p>
         </w:tc>
@@ -1480,7 +1480,7 @@
                 <w:sz w:val="18"/>
                 <w:szCs w:val="18"/>
               </w:rPr>
-              <w:t xml:space="preserve">25:36</w:t>
+              <w:t xml:space="preserve">35:25</w:t>
             </w:r>
           </w:p>
         </w:tc>
@@ -1512,7 +1512,7 @@
                 <w:sz w:val="18"/>
                 <w:szCs w:val="18"/>
               </w:rPr>
-              <w:t xml:space="preserve">36-42</w:t>
+              <w:t xml:space="preserve">36-44</w:t>
             </w:r>
           </w:p>
         </w:tc>
@@ -1544,7 +1544,7 @@
                 <w:sz w:val="18"/>
                 <w:szCs w:val="18"/>
               </w:rPr>
-              <w:t xml:space="preserve">2:49:29</w:t>
+              <w:t xml:space="preserve">2:59:21</w:t>
             </w:r>
           </w:p>
         </w:tc>
@@ -1615,7 +1615,7 @@
                 <w:sz w:val="18"/>
                 <w:szCs w:val="18"/>
               </w:rPr>
-              <w:t xml:space="preserve">42</w:t>
+              <w:t xml:space="preserve">44</w:t>
             </w:r>
           </w:p>
         </w:tc>
@@ -1648,7 +1648,7 @@
                 <w:sz w:val="18"/>
                 <w:szCs w:val="18"/>
               </w:rPr>
-              <w:t xml:space="preserve">2:49:29</w:t>
+              <w:t xml:space="preserve">2:59:21</w:t>
             </w:r>
           </w:p>
         </w:tc>
@@ -2007,10 +2007,12 @@
             <w:r>
               <w:rPr>
                 <w:rFonts w:ascii="Arial" w:cs="Arial" w:eastAsia="Arial" w:hAnsi="Arial"/>
-                <w:sz w:val="18"/>
-                <w:szCs w:val="18"/>
-              </w:rPr>
-              <w:t xml:space="preserve">Added (Air Order)</w:t>
+                <w:b/>
+                <w:bCs/>
+                <w:sz w:val="18"/>
+                <w:szCs w:val="18"/>
+              </w:rPr>
+              <w:t xml:space="preserve">Added (Air Order, Oct. 8 midday)</w:t>
             </w:r>
           </w:p>
         </w:tc>
@@ -2038,10 +2040,12 @@
             <w:r>
               <w:rPr>
                 <w:rFonts w:ascii="Arial" w:cs="Arial" w:eastAsia="Arial" w:hAnsi="Arial"/>
-                <w:sz w:val="18"/>
-                <w:szCs w:val="18"/>
-              </w:rPr>
-              <w:t xml:space="preserve">Swans, "Can't Find My Way Home" (4:49), track 42. Tag 738020, The Burning World, Uni Distribution Corp. FCC clean on LRCLIB.</w:t>
+                <w:b/>
+                <w:bCs/>
+                <w:sz w:val="18"/>
+                <w:szCs w:val="18"/>
+              </w:rPr>
+              <w:t xml:space="preserve">My Morning Jacket, "Mahgeetah" (5:57), #43. Tag 722281, It Still Moves, Ato Records. Clean on Genius. BODEGA, "Slow Train" (3:52), #44. Cover of Bob Dylan's 1979 song, Chrysalis, album out Fri. Oct. 9. LISTEN FIRST: Dylan's lyrics are clean, BODEGA's are not posted.</w:t>
             </w:r>
           </w:p>
         </w:tc>
@@ -2078,7 +2082,7 @@
                 <w:sz w:val="18"/>
                 <w:szCs w:val="18"/>
               </w:rPr>
-              <w:t xml:space="preserve">Moved (Air Order, Oct. 8)</w:t>
+              <w:t xml:space="preserve">Earlier add (Oct. 7)</w:t>
             </w:r>
           </w:p>
         </w:tc>
@@ -2110,7 +2114,7 @@
                 <w:sz w:val="18"/>
                 <w:szCs w:val="18"/>
               </w:rPr>
-              <w:t xml:space="preserve">Yo La Tengo, "Autumn Sweater" (5:19) moved from Set 5 to Set 6, after Dead Meadow. Now track 32. Set 5 has 10 tracks, Set 6 has 6.</w:t>
+              <w:t xml:space="preserve">Swans, "Can't Find My Way Home" (4:49), #42. Tag 738020, The Burning World, Uni Distribution Corp. FCC clean on LRCLIB.</w:t>
             </w:r>
           </w:p>
         </w:tc>
@@ -2146,7 +2150,7 @@
                 <w:sz w:val="18"/>
                 <w:szCs w:val="18"/>
               </w:rPr>
-              <w:t xml:space="preserve">Held out</w:t>
+              <w:t xml:space="preserve">Moved (Air Order, Oct. 8 morning)</w:t>
             </w:r>
           </w:p>
         </w:tc>
@@ -2174,13 +2178,10 @@
             <w:r>
               <w:rPr>
                 <w:rFonts w:ascii="Arial" w:cs="Arial" w:eastAsia="Arial" w:hAnsi="Arial"/>
-                <w:b/>
-                <w:bCs/>
-                <w:color w:val="B00020"/>
-                <w:sz w:val="18"/>
-                <w:szCs w:val="18"/>
-              </w:rPr>
-              <w:t xml:space="preserve">Sex Pistols, "Anarchy in the U.K.": FCC "piss" x1 (Outro). In the Air Order, not in the CSV. Needs a radio edit or a swap.</w:t>
+                <w:sz w:val="18"/>
+                <w:szCs w:val="18"/>
+              </w:rPr>
+              <w:t xml:space="preserve">Yo La Tengo, "Autumn Sweater" (5:19) moved from Set 5 to Set 6, after Dead Meadow. Now track 32. Set 5 has 10 tracks, Set 6 has 6.</w:t>
             </w:r>
           </w:p>
         </w:tc>
@@ -2214,10 +2215,12 @@
             <w:r>
               <w:rPr>
                 <w:rFonts w:ascii="Arial" w:cs="Arial" w:eastAsia="Arial" w:hAnsi="Arial"/>
-                <w:sz w:val="18"/>
-                <w:szCs w:val="18"/>
-              </w:rPr>
-              <w:t xml:space="preserve">Metadata fix</w:t>
+                <w:b/>
+                <w:bCs/>
+                <w:sz w:val="18"/>
+                <w:szCs w:val="18"/>
+              </w:rPr>
+              <w:t xml:space="preserve">Correction</w:t>
             </w:r>
           </w:p>
         </w:tc>
@@ -2249,7 +2252,7 @@
                 <w:sz w:val="18"/>
                 <w:szCs w:val="18"/>
               </w:rPr>
-              <w:t xml:space="preserve">Dinosaur Jr. "Feel the Pain" is on Without a Sound (tag 187859).</w:t>
+              <w:t xml:space="preserve">Morphine, "Cocoon" (#35) is the new title track (a newly mixed 1998 recording, Partisan), not a Cure for Pain song. Album and label fixed. The mic break text is rewritten.</w:t>
             </w:r>
           </w:p>
         </w:tc>
@@ -2282,6 +2285,213 @@
             <w:r>
               <w:rPr>
                 <w:rFonts w:ascii="Arial" w:cs="Arial" w:eastAsia="Arial" w:hAnsi="Arial"/>
+                <w:sz w:val="18"/>
+                <w:szCs w:val="18"/>
+              </w:rPr>
+              <w:t xml:space="preserve">Library tags</w:t>
+            </w:r>
+          </w:p>
+        </w:tc>
+        <w:tc>
+          <w:tcPr>
+            <w:tcW w:type="dxa" w:w="11800"/>
+            <w:tcBorders>
+              <w:top w:val="single" w:color="B7B7B7" w:sz="4"/>
+              <w:left w:val="single" w:color="B7B7B7" w:sz="4"/>
+              <w:bottom w:val="single" w:color="B7B7B7" w:sz="4"/>
+              <w:right w:val="single" w:color="B7B7B7" w:sz="4"/>
+            </w:tcBorders>
+            <w:tcMar>
+              <w:top w:type="dxa" w:w="50"/>
+              <w:left w:type="dxa" w:w="90"/>
+              <w:bottom w:type="dxa" w:w="50"/>
+              <w:right w:type="dxa" w:w="90"/>
+            </w:tcMar>
+            <w:vAlign w:val="center"/>
+          </w:tcPr>
+          <w:p>
+            <w:pPr>
+              <w:spacing w:after="0" w:before="0"/>
+            </w:pPr>
+            <w:r>
+              <w:rPr>
+                <w:rFonts w:ascii="Arial" w:cs="Arial" w:eastAsia="Arial" w:hAnsi="Arial"/>
+                <w:sz w:val="18"/>
+                <w:szCs w:val="18"/>
+              </w:rPr>
+              <w:t xml:space="preserve">Tags matched for 24 of 44 tracks. The rest are not in the KZSU library or the track is not on the library album record.</w:t>
+            </w:r>
+          </w:p>
+        </w:tc>
+      </w:tr>
+      <w:tr>
+        <w:trPr>
+          <w:cantSplit/>
+        </w:trPr>
+        <w:tc>
+          <w:tcPr>
+            <w:tcW w:type="dxa" w:w="2600"/>
+            <w:tcBorders>
+              <w:top w:val="single" w:color="B7B7B7" w:sz="4"/>
+              <w:left w:val="single" w:color="B7B7B7" w:sz="4"/>
+              <w:bottom w:val="single" w:color="B7B7B7" w:sz="4"/>
+              <w:right w:val="single" w:color="B7B7B7" w:sz="4"/>
+            </w:tcBorders>
+            <w:shd w:fill="F5F7FA" w:color="auto" w:val="clear"/>
+            <w:tcMar>
+              <w:top w:type="dxa" w:w="50"/>
+              <w:left w:type="dxa" w:w="90"/>
+              <w:bottom w:type="dxa" w:w="50"/>
+              <w:right w:type="dxa" w:w="90"/>
+            </w:tcMar>
+            <w:vAlign w:val="center"/>
+          </w:tcPr>
+          <w:p>
+            <w:pPr>
+              <w:spacing w:after="0" w:before="0"/>
+            </w:pPr>
+            <w:r>
+              <w:rPr>
+                <w:rFonts w:ascii="Arial" w:cs="Arial" w:eastAsia="Arial" w:hAnsi="Arial"/>
+                <w:sz w:val="18"/>
+                <w:szCs w:val="18"/>
+              </w:rPr>
+              <w:t xml:space="preserve">Held out</w:t>
+            </w:r>
+          </w:p>
+        </w:tc>
+        <w:tc>
+          <w:tcPr>
+            <w:tcW w:type="dxa" w:w="11800"/>
+            <w:tcBorders>
+              <w:top w:val="single" w:color="B7B7B7" w:sz="4"/>
+              <w:left w:val="single" w:color="B7B7B7" w:sz="4"/>
+              <w:bottom w:val="single" w:color="B7B7B7" w:sz="4"/>
+              <w:right w:val="single" w:color="B7B7B7" w:sz="4"/>
+            </w:tcBorders>
+            <w:shd w:fill="F5F7FA" w:color="auto" w:val="clear"/>
+            <w:tcMar>
+              <w:top w:type="dxa" w:w="50"/>
+              <w:left w:type="dxa" w:w="90"/>
+              <w:bottom w:type="dxa" w:w="50"/>
+              <w:right w:type="dxa" w:w="90"/>
+            </w:tcMar>
+            <w:vAlign w:val="center"/>
+          </w:tcPr>
+          <w:p>
+            <w:pPr>
+              <w:spacing w:after="0" w:before="0"/>
+            </w:pPr>
+            <w:r>
+              <w:rPr>
+                <w:rFonts w:ascii="Arial" w:cs="Arial" w:eastAsia="Arial" w:hAnsi="Arial"/>
+                <w:b/>
+                <w:bCs/>
+                <w:color w:val="B00020"/>
+                <w:sz w:val="18"/>
+                <w:szCs w:val="18"/>
+              </w:rPr>
+              <w:t xml:space="preserve">Sex Pistols, "Anarchy in the U.K.": FCC "piss" x1 (Outro). In the Air Order, not in the CSV. Needs a radio edit or a swap.</w:t>
+            </w:r>
+          </w:p>
+        </w:tc>
+      </w:tr>
+      <w:tr>
+        <w:trPr>
+          <w:cantSplit/>
+        </w:trPr>
+        <w:tc>
+          <w:tcPr>
+            <w:tcW w:type="dxa" w:w="2600"/>
+            <w:tcBorders>
+              <w:top w:val="single" w:color="B7B7B7" w:sz="4"/>
+              <w:left w:val="single" w:color="B7B7B7" w:sz="4"/>
+              <w:bottom w:val="single" w:color="B7B7B7" w:sz="4"/>
+              <w:right w:val="single" w:color="B7B7B7" w:sz="4"/>
+            </w:tcBorders>
+            <w:tcMar>
+              <w:top w:type="dxa" w:w="50"/>
+              <w:left w:type="dxa" w:w="90"/>
+              <w:bottom w:type="dxa" w:w="50"/>
+              <w:right w:type="dxa" w:w="90"/>
+            </w:tcMar>
+            <w:vAlign w:val="center"/>
+          </w:tcPr>
+          <w:p>
+            <w:pPr>
+              <w:spacing w:after="0" w:before="0"/>
+            </w:pPr>
+            <w:r>
+              <w:rPr>
+                <w:rFonts w:ascii="Arial" w:cs="Arial" w:eastAsia="Arial" w:hAnsi="Arial"/>
+                <w:sz w:val="18"/>
+                <w:szCs w:val="18"/>
+              </w:rPr>
+              <w:t xml:space="preserve">Metadata fix</w:t>
+            </w:r>
+          </w:p>
+        </w:tc>
+        <w:tc>
+          <w:tcPr>
+            <w:tcW w:type="dxa" w:w="11800"/>
+            <w:tcBorders>
+              <w:top w:val="single" w:color="B7B7B7" w:sz="4"/>
+              <w:left w:val="single" w:color="B7B7B7" w:sz="4"/>
+              <w:bottom w:val="single" w:color="B7B7B7" w:sz="4"/>
+              <w:right w:val="single" w:color="B7B7B7" w:sz="4"/>
+            </w:tcBorders>
+            <w:tcMar>
+              <w:top w:type="dxa" w:w="50"/>
+              <w:left w:type="dxa" w:w="90"/>
+              <w:bottom w:type="dxa" w:w="50"/>
+              <w:right w:type="dxa" w:w="90"/>
+            </w:tcMar>
+            <w:vAlign w:val="center"/>
+          </w:tcPr>
+          <w:p>
+            <w:pPr>
+              <w:spacing w:after="0" w:before="0"/>
+            </w:pPr>
+            <w:r>
+              <w:rPr>
+                <w:rFonts w:ascii="Arial" w:cs="Arial" w:eastAsia="Arial" w:hAnsi="Arial"/>
+                <w:sz w:val="18"/>
+                <w:szCs w:val="18"/>
+              </w:rPr>
+              <w:t xml:space="preserve">Dinosaur Jr. "Feel the Pain" is on Without a Sound (tag 187859).</w:t>
+            </w:r>
+          </w:p>
+        </w:tc>
+      </w:tr>
+      <w:tr>
+        <w:trPr>
+          <w:cantSplit/>
+        </w:trPr>
+        <w:tc>
+          <w:tcPr>
+            <w:tcW w:type="dxa" w:w="2600"/>
+            <w:tcBorders>
+              <w:top w:val="single" w:color="B7B7B7" w:sz="4"/>
+              <w:left w:val="single" w:color="B7B7B7" w:sz="4"/>
+              <w:bottom w:val="single" w:color="B7B7B7" w:sz="4"/>
+              <w:right w:val="single" w:color="B7B7B7" w:sz="4"/>
+            </w:tcBorders>
+            <w:shd w:fill="F5F7FA" w:color="auto" w:val="clear"/>
+            <w:tcMar>
+              <w:top w:type="dxa" w:w="50"/>
+              <w:left w:type="dxa" w:w="90"/>
+              <w:bottom w:type="dxa" w:w="50"/>
+              <w:right w:type="dxa" w:w="90"/>
+            </w:tcMar>
+            <w:vAlign w:val="center"/>
+          </w:tcPr>
+          <w:p>
+            <w:pPr>
+              <w:spacing w:after="0" w:before="0"/>
+            </w:pPr>
+            <w:r>
+              <w:rPr>
+                <w:rFonts w:ascii="Arial" w:cs="Arial" w:eastAsia="Arial" w:hAnsi="Arial"/>
                 <w:b/>
                 <w:bCs/>
                 <w:sz w:val="18"/>
@@ -2300,6 +2510,7 @@
               <w:bottom w:val="single" w:color="B7B7B7" w:sz="4"/>
               <w:right w:val="single" w:color="B7B7B7" w:sz="4"/>
             </w:tcBorders>
+            <w:shd w:fill="F5F7FA" w:color="auto" w:val="clear"/>
             <w:tcMar>
               <w:top w:type="dxa" w:w="50"/>
               <w:left w:type="dxa" w:w="90"/>
@@ -3766,11 +3977,11 @@
             <w:r>
               <w:rPr>
                 <w:rFonts w:ascii="Arial" w:cs="Arial" w:eastAsia="Arial" w:hAnsi="Arial"/>
-                <w:color w:val="B00020"/>
-                <w:sz w:val="18"/>
-                <w:szCs w:val="18"/>
-              </w:rPr>
-              <w:t xml:space="preserve">Not airable: fuck x2 (FCC Edit Needed)</w:t>
+                <w:color w:val="8A6100"/>
+                <w:sz w:val="18"/>
+                <w:szCs w:val="18"/>
+              </w:rPr>
+              <w:t xml:space="preserve">#44 Slow Train (Bob Dylan cover). Listen first. Title track is not airable: fuck x2.</w:t>
             </w:r>
           </w:p>
         </w:tc>
@@ -4581,7 +4792,7 @@
                 <w:sz w:val="18"/>
                 <w:szCs w:val="18"/>
               </w:rPr>
-              <w:t xml:space="preserve">#35 Cocoon (1993 original). Full mic break after Set 6.</w:t>
+              <w:t xml:space="preserve">#35 Cocoon (the new title track). Full mic break after Set 6.</w:t>
             </w:r>
           </w:p>
         </w:tc>
@@ -6869,7 +7080,7 @@
                 <w:sz w:val="18"/>
                 <w:szCs w:val="18"/>
               </w:rPr>
-              <w:t xml:space="preserve">-</w:t>
+              <w:t xml:space="preserve">Thetans</w:t>
             </w:r>
           </w:p>
         </w:tc>
@@ -6935,7 +7146,7 @@
                 <w:sz w:val="18"/>
                 <w:szCs w:val="18"/>
               </w:rPr>
-              <w:t xml:space="preserve">-</w:t>
+              <w:t xml:space="preserve">1156474</w:t>
             </w:r>
           </w:p>
         </w:tc>
@@ -7109,7 +7320,7 @@
                 <w:sz w:val="22"/>
                 <w:szCs w:val="22"/>
               </w:rPr>
-              <w:t xml:space="preserve">Hour 1, Set 3: Oct. 8 anniversaries and canon   |   6 tracks   |   31:19   |   on air through 46:57</w:t>
+              <w:t xml:space="preserve">Hour 1, Set 3: Oct. 8 anniversaries and canon   |   6 tracks   |   31:20   |   on air through 46:58</w:t>
             </w:r>
           </w:p>
         </w:tc>
@@ -7674,7 +7885,7 @@
                 <w:sz w:val="18"/>
                 <w:szCs w:val="18"/>
               </w:rPr>
-              <w:t xml:space="preserve">6:56</w:t>
+              <w:t xml:space="preserve">6:57</w:t>
             </w:r>
           </w:p>
         </w:tc>
@@ -8255,7 +8466,7 @@
                 <w:sz w:val="18"/>
                 <w:szCs w:val="18"/>
               </w:rPr>
-              <w:t xml:space="preserve">-</w:t>
+              <w:t xml:space="preserve">826860</w:t>
             </w:r>
           </w:p>
         </w:tc>
@@ -8530,7 +8741,7 @@
                 <w:sz w:val="18"/>
                 <w:szCs w:val="18"/>
               </w:rPr>
-              <w:t xml:space="preserve">Aurora Records</w:t>
+              <w:t xml:space="preserve">Rykodisc</w:t>
             </w:r>
           </w:p>
         </w:tc>
@@ -8563,7 +8774,7 @@
                 <w:sz w:val="18"/>
                 <w:szCs w:val="18"/>
               </w:rPr>
-              <w:t xml:space="preserve">-</w:t>
+              <w:t xml:space="preserve">378727</w:t>
             </w:r>
           </w:p>
         </w:tc>
@@ -9176,7 +9387,7 @@
                 <w:sz w:val="18"/>
                 <w:szCs w:val="18"/>
               </w:rPr>
-              <w:t xml:space="preserve">-</w:t>
+              <w:t xml:space="preserve">1156508</w:t>
             </w:r>
           </w:p>
         </w:tc>
@@ -9458,7 +9669,7 @@
                 <w:sz w:val="22"/>
                 <w:szCs w:val="22"/>
               </w:rPr>
-              <w:t xml:space="preserve">Hour 2, Thursday Triple Shot: Teenage Fanclub   |   3 tracks   |   12:08   |   on air through 59:05</w:t>
+              <w:t xml:space="preserve">Hour 2, Thursday Triple Shot: Teenage Fanclub   |   3 tracks   |   12:08   |   on air through 59:06</w:t>
             </w:r>
           </w:p>
         </w:tc>
@@ -9998,7 +10209,7 @@
                 <w:sz w:val="18"/>
                 <w:szCs w:val="18"/>
               </w:rPr>
-              <w:t xml:space="preserve">Matador Records</w:t>
+              <w:t xml:space="preserve">Jetset Records</w:t>
             </w:r>
           </w:p>
         </w:tc>
@@ -10030,7 +10241,7 @@
                 <w:sz w:val="18"/>
                 <w:szCs w:val="18"/>
               </w:rPr>
-              <w:t xml:space="preserve">-</w:t>
+              <w:t xml:space="preserve">719074</w:t>
             </w:r>
           </w:p>
         </w:tc>
@@ -10305,7 +10516,7 @@
                 <w:sz w:val="18"/>
                 <w:szCs w:val="18"/>
               </w:rPr>
-              <w:t xml:space="preserve">Columbia Records</w:t>
+              <w:t xml:space="preserve">Creation Records</w:t>
             </w:r>
           </w:p>
         </w:tc>
@@ -10338,7 +10549,7 @@
                 <w:sz w:val="18"/>
                 <w:szCs w:val="18"/>
               </w:rPr>
-              <w:t xml:space="preserve">-</w:t>
+              <w:t xml:space="preserve">395502</w:t>
             </w:r>
           </w:p>
         </w:tc>
@@ -10909,7 +11120,7 @@
                 <w:sz w:val="22"/>
                 <w:szCs w:val="22"/>
               </w:rPr>
-              <w:t xml:space="preserve">Hour 2, Set 4: Bay Area this week and next   |   5 tracks   |   18:17   |   on air through 1:17:22</w:t>
+              <w:t xml:space="preserve">Hour 2, Set 4: Bay Area this week and next   |   5 tracks   |   18:17   |   on air through 1:17:23</w:t>
             </w:r>
           </w:p>
         </w:tc>
@@ -13160,7 +13371,7 @@
                 <w:sz w:val="18"/>
                 <w:szCs w:val="18"/>
               </w:rPr>
-              <w:t xml:space="preserve">#15 Wordless Chorus</w:t>
+              <w:t xml:space="preserve">#15 Wordless Chorus, #43 Mahgeetah</w:t>
             </w:r>
           </w:p>
         </w:tc>
@@ -14415,7 +14626,7 @@
                 <w:sz w:val="22"/>
                 <w:szCs w:val="22"/>
               </w:rPr>
-              <w:t xml:space="preserve">Hour 2, Set 5: Songwriters   |   10 tracks   |   38:52   |   on air through 1:56:14</w:t>
+              <w:t xml:space="preserve">Hour 2, Set 5: Songwriters   |   10 tracks   |   38:54   |   on air through 1:56:17</w:t>
             </w:r>
           </w:p>
         </w:tc>
@@ -16755,7 +16966,7 @@
                 <w:sz w:val="18"/>
                 <w:szCs w:val="18"/>
               </w:rPr>
-              <w:t xml:space="preserve">Mexican Summer (verify)</w:t>
+              <w:t xml:space="preserve">Mexican Summer</w:t>
             </w:r>
           </w:p>
         </w:tc>
@@ -16787,7 +16998,7 @@
                 <w:sz w:val="18"/>
                 <w:szCs w:val="18"/>
               </w:rPr>
-              <w:t xml:space="preserve">-</w:t>
+              <w:t xml:space="preserve">1135099</w:t>
             </w:r>
           </w:p>
         </w:tc>
@@ -17095,7 +17306,7 @@
                 <w:sz w:val="18"/>
                 <w:szCs w:val="18"/>
               </w:rPr>
-              <w:t xml:space="preserve">-</w:t>
+              <w:t xml:space="preserve">1156441</w:t>
             </w:r>
           </w:p>
         </w:tc>
@@ -17128,7 +17339,7 @@
                 <w:sz w:val="18"/>
                 <w:szCs w:val="18"/>
               </w:rPr>
-              <w:t xml:space="preserve">3:08</w:t>
+              <w:t xml:space="preserve">3:09</w:t>
             </w:r>
           </w:p>
         </w:tc>
@@ -17432,7 +17643,7 @@
                 <w:sz w:val="18"/>
                 <w:szCs w:val="18"/>
               </w:rPr>
-              <w:t xml:space="preserve">4:42</w:t>
+              <w:t xml:space="preserve">4:43</w:t>
             </w:r>
           </w:p>
         </w:tc>
@@ -18733,7 +18944,7 @@
                 <w:sz w:val="22"/>
                 <w:szCs w:val="22"/>
               </w:rPr>
-              <w:t xml:space="preserve">Hour 2, Set 6: Heavy, psych and close   |   6 tracks   |   27:39   |   on air through 2:23:53</w:t>
+              <w:t xml:space="preserve">Hour 2, Set 6: Heavy, psych and close   |   6 tracks   |   27:39   |   on air through 2:23:56</w:t>
             </w:r>
           </w:p>
         </w:tc>
@@ -19202,7 +19413,7 @@
                 <w:sz w:val="18"/>
                 <w:szCs w:val="18"/>
               </w:rPr>
-              <w:t xml:space="preserve">-</w:t>
+              <w:t xml:space="preserve">Requiem</w:t>
             </w:r>
           </w:p>
         </w:tc>
@@ -20734,7 +20945,7 @@
                 <w:sz w:val="18"/>
                 <w:szCs w:val="18"/>
               </w:rPr>
-              <w:t xml:space="preserve">Cure for Pain</w:t>
+              <w:t xml:space="preserve">Cocoon</w:t>
             </w:r>
           </w:p>
         </w:tc>
@@ -20767,7 +20978,7 @@
                 <w:sz w:val="18"/>
                 <w:szCs w:val="18"/>
               </w:rPr>
-              <w:t xml:space="preserve">Rykodisc</w:t>
+              <w:t xml:space="preserve">Partisan Records</w:t>
             </w:r>
           </w:p>
         </w:tc>
@@ -20902,7 +21113,7 @@
                 <w:sz w:val="16"/>
                 <w:szCs w:val="16"/>
               </w:rPr>
-              <w:t xml:space="preserve">Carried over. New Morphine release Cocoon (Partisan) is due Dec. 4, 2026.</w:t>
+              <w:t xml:space="preserve">Carried over. Title track of the new album Cocoon (Partisan, Dec. 4, 2026), a newly mixed 1998 recording. An earlier version is on Sandbox: The Music of Mark Sandman (2004).</w:t>
             </w:r>
           </w:p>
         </w:tc>
@@ -21014,7 +21225,7 @@
                 <w:sz w:val="20"/>
                 <w:szCs w:val="20"/>
               </w:rPr>
-              <w:t xml:space="preserve">"That was Morphine, Cocoon, from Cure for Pain in 1993. Morphine has a new album, also called Cocoon, out Dec. 4 on Partisan. It is their first full-length since The Night in 2000, which came out after singer Mark Sandman died of a heart attack on stage in Italy. The new record is built from sessions the band started and abandoned in 1998. Sandman's partner, Sabine Hrechdakian, worked with producer Paul Q. Kolderie to go through the old tapes. Kolderie, who made Morphine records with Sean Slade and also produced Pablo Honey and Live Through This, remixed them. Dana Colley added new baritone sax on three songs. There is piano and guitar, and more than one drummer. Hrechdakian says the title is about coming home, and she pictures the cocoon as a spaceship for two. The title track is out now, with an archival video."</w:t>
+              <w:t xml:space="preserve">"That was Morphine, Cocoon, the title track of a new album out Dec. 4 on Partisan. It is their first full-length since The Night in 2000, which came out after singer Mark Sandman died of a heart attack on stage in Italy. The new record is built from sessions the band started and abandoned in 1998. Sandman's partner, Sabine Hrechdakian, worked with producer Paul Q. Kolderie to go through the old tapes. Kolderie, who made Morphine records with Sean Slade and also produced Pablo Honey and Live Through This, remixed them. Dana Colley added new baritone sax on three songs. There is piano and guitar, and more than one drummer. Hrechdakian says the title is about coming home, and she pictures the cocoon as a spaceship for two. The title track is out now, with an archival video."</w:t>
             </w:r>
           </w:p>
         </w:tc>
@@ -22267,7 +22478,7 @@
                 <w:sz w:val="18"/>
                 <w:szCs w:val="18"/>
               </w:rPr>
-              <w:t xml:space="preserve">We played the 1993 song from Cure for Pain (Rykodisc), #35. The new album's title track is a newly mixed 1998 recording; the coverage does not say how it differs from the 1993 version. Do not call it a re-recording.</w:t>
+              <w:t xml:space="preserve">We played the new album's title track (3:54), a newly mixed 1998 recording, #35. It is not on Cure for Pain (1993). An earlier version is on Sandbox: The Music of Mark Sandman (2004). Do not call it a re-recording.</w:t>
             </w:r>
           </w:p>
         </w:tc>
@@ -22493,7 +22704,7 @@
                 <w:sz w:val="22"/>
                 <w:szCs w:val="22"/>
               </w:rPr>
-              <w:t xml:space="preserve">Closers and bench   |   7 tracks   |   25:36   |   on air through 2:49:29</w:t>
+              <w:t xml:space="preserve">Closers and bench   |   9 tracks   |   35:25   |   on air through 2:59:21</w:t>
             </w:r>
           </w:p>
         </w:tc>
@@ -23026,7 +23237,7 @@
                 <w:sz w:val="18"/>
                 <w:szCs w:val="18"/>
               </w:rPr>
-              <w:t xml:space="preserve">-</w:t>
+              <w:t xml:space="preserve">393926</w:t>
             </w:r>
           </w:p>
         </w:tc>
@@ -23607,7 +23818,7 @@
                 <w:sz w:val="18"/>
                 <w:szCs w:val="18"/>
               </w:rPr>
-              <w:t xml:space="preserve">Rockville Records</w:t>
+              <w:t xml:space="preserve">Columbia Legacy</w:t>
             </w:r>
           </w:p>
         </w:tc>
@@ -23639,7 +23850,7 @@
                 <w:sz w:val="18"/>
                 <w:szCs w:val="18"/>
               </w:rPr>
-              <w:t xml:space="preserve">-</w:t>
+              <w:t xml:space="preserve">697990</w:t>
             </w:r>
           </w:p>
         </w:tc>
@@ -25002,7 +25213,7 @@
           </w:tcPr>
           <w:p>
             <w:pPr>
-              <w:keepNext w:val="false"/>
+              <w:keepNext/>
               <w:spacing w:after="0" w:before="0"/>
             </w:pPr>
             <w:r>
@@ -25037,7 +25248,7 @@
           </w:tcPr>
           <w:p>
             <w:pPr>
-              <w:keepNext w:val="false"/>
+              <w:keepNext/>
               <w:spacing w:after="0" w:before="0"/>
             </w:pPr>
             <w:r>
@@ -25072,7 +25283,7 @@
           </w:tcPr>
           <w:p>
             <w:pPr>
-              <w:keepNext w:val="false"/>
+              <w:keepNext/>
               <w:spacing w:after="0" w:before="0"/>
             </w:pPr>
             <w:r>
@@ -25107,7 +25318,7 @@
           </w:tcPr>
           <w:p>
             <w:pPr>
-              <w:keepNext w:val="false"/>
+              <w:keepNext/>
               <w:spacing w:after="0" w:before="0"/>
             </w:pPr>
             <w:r>
@@ -25140,7 +25351,7 @@
           </w:tcPr>
           <w:p>
             <w:pPr>
-              <w:keepNext w:val="false"/>
+              <w:keepNext/>
               <w:spacing w:after="0" w:before="0"/>
             </w:pPr>
             <w:r>
@@ -25173,7 +25384,7 @@
           </w:tcPr>
           <w:p>
             <w:pPr>
-              <w:keepNext w:val="false"/>
+              <w:keepNext/>
               <w:spacing w:after="0" w:before="0"/>
             </w:pPr>
             <w:r>
@@ -25206,7 +25417,7 @@
           </w:tcPr>
           <w:p>
             <w:pPr>
-              <w:keepNext w:val="false"/>
+              <w:keepNext/>
               <w:spacing w:after="0" w:before="0"/>
             </w:pPr>
             <w:r>
@@ -25239,7 +25450,7 @@
           </w:tcPr>
           <w:p>
             <w:pPr>
-              <w:keepNext w:val="false"/>
+              <w:keepNext/>
               <w:spacing w:after="0" w:before="0"/>
             </w:pPr>
             <w:r>
@@ -25275,7 +25486,7 @@
           </w:tcPr>
           <w:p>
             <w:pPr>
-              <w:keepNext w:val="false"/>
+              <w:keepNext/>
               <w:spacing w:after="0" w:before="0"/>
             </w:pPr>
             <w:r>
@@ -25285,6 +25496,619 @@
                 <w:szCs w:val="16"/>
               </w:rPr>
               <w:t xml:space="preserve">Added by DJ Stace (Air Order, seen Oct. 7). Single from The Burning World (1989), the album Swans made for UNI/MCA.</w:t>
+            </w:r>
+          </w:p>
+        </w:tc>
+      </w:tr>
+      <w:tr>
+        <w:trPr>
+          <w:cantSplit/>
+        </w:trPr>
+        <w:tc>
+          <w:tcPr>
+            <w:tcW w:type="dxa" w:w="450"/>
+            <w:tcBorders>
+              <w:top w:val="single" w:color="B7B7B7" w:sz="4"/>
+              <w:left w:val="single" w:color="B7B7B7" w:sz="4"/>
+              <w:bottom w:val="single" w:color="B7B7B7" w:sz="4"/>
+              <w:right w:val="single" w:color="B7B7B7" w:sz="4"/>
+            </w:tcBorders>
+            <w:tcMar>
+              <w:top w:type="dxa" w:w="50"/>
+              <w:left w:type="dxa" w:w="90"/>
+              <w:bottom w:type="dxa" w:w="50"/>
+              <w:right w:type="dxa" w:w="90"/>
+            </w:tcMar>
+            <w:vAlign w:val="center"/>
+          </w:tcPr>
+          <w:p>
+            <w:pPr>
+              <w:keepNext/>
+              <w:spacing w:after="0" w:before="0"/>
+            </w:pPr>
+            <w:r>
+              <w:rPr>
+                <w:rFonts w:ascii="Arial" w:cs="Arial" w:eastAsia="Arial" w:hAnsi="Arial"/>
+                <w:b/>
+                <w:bCs/>
+                <w:sz w:val="18"/>
+                <w:szCs w:val="18"/>
+              </w:rPr>
+              <w:t xml:space="preserve">43</w:t>
+            </w:r>
+          </w:p>
+        </w:tc>
+        <w:tc>
+          <w:tcPr>
+            <w:tcW w:type="dxa" w:w="1800"/>
+            <w:tcBorders>
+              <w:top w:val="single" w:color="B7B7B7" w:sz="4"/>
+              <w:left w:val="single" w:color="B7B7B7" w:sz="4"/>
+              <w:bottom w:val="single" w:color="B7B7B7" w:sz="4"/>
+              <w:right w:val="single" w:color="B7B7B7" w:sz="4"/>
+            </w:tcBorders>
+            <w:tcMar>
+              <w:top w:type="dxa" w:w="50"/>
+              <w:left w:type="dxa" w:w="90"/>
+              <w:bottom w:type="dxa" w:w="50"/>
+              <w:right w:type="dxa" w:w="90"/>
+            </w:tcMar>
+            <w:vAlign w:val="center"/>
+          </w:tcPr>
+          <w:p>
+            <w:pPr>
+              <w:keepNext/>
+              <w:spacing w:after="0" w:before="0"/>
+            </w:pPr>
+            <w:r>
+              <w:rPr>
+                <w:rFonts w:ascii="Arial" w:cs="Arial" w:eastAsia="Arial" w:hAnsi="Arial"/>
+                <w:b/>
+                <w:bCs/>
+                <w:sz w:val="18"/>
+                <w:szCs w:val="18"/>
+              </w:rPr>
+              <w:t xml:space="preserve">My Morning Jacket</w:t>
+            </w:r>
+          </w:p>
+        </w:tc>
+        <w:tc>
+          <w:tcPr>
+            <w:tcW w:type="dxa" w:w="2600"/>
+            <w:tcBorders>
+              <w:top w:val="single" w:color="B7B7B7" w:sz="4"/>
+              <w:left w:val="single" w:color="B7B7B7" w:sz="4"/>
+              <w:bottom w:val="single" w:color="B7B7B7" w:sz="4"/>
+              <w:right w:val="single" w:color="B7B7B7" w:sz="4"/>
+            </w:tcBorders>
+            <w:tcMar>
+              <w:top w:type="dxa" w:w="50"/>
+              <w:left w:type="dxa" w:w="90"/>
+              <w:bottom w:type="dxa" w:w="50"/>
+              <w:right w:type="dxa" w:w="90"/>
+            </w:tcMar>
+            <w:vAlign w:val="center"/>
+          </w:tcPr>
+          <w:p>
+            <w:pPr>
+              <w:keepNext/>
+              <w:spacing w:after="0" w:before="0"/>
+            </w:pPr>
+            <w:r>
+              <w:rPr>
+                <w:rFonts w:ascii="Arial" w:cs="Arial" w:eastAsia="Arial" w:hAnsi="Arial"/>
+                <w:b/>
+                <w:bCs/>
+                <w:sz w:val="20"/>
+                <w:szCs w:val="20"/>
+              </w:rPr>
+              <w:t xml:space="preserve">Mahgeetah</w:t>
+            </w:r>
+          </w:p>
+        </w:tc>
+        <w:tc>
+          <w:tcPr>
+            <w:tcW w:type="dxa" w:w="2100"/>
+            <w:tcBorders>
+              <w:top w:val="single" w:color="B7B7B7" w:sz="4"/>
+              <w:left w:val="single" w:color="B7B7B7" w:sz="4"/>
+              <w:bottom w:val="single" w:color="B7B7B7" w:sz="4"/>
+              <w:right w:val="single" w:color="B7B7B7" w:sz="4"/>
+            </w:tcBorders>
+            <w:tcMar>
+              <w:top w:type="dxa" w:w="50"/>
+              <w:left w:type="dxa" w:w="90"/>
+              <w:bottom w:type="dxa" w:w="50"/>
+              <w:right w:type="dxa" w:w="90"/>
+            </w:tcMar>
+            <w:vAlign w:val="center"/>
+          </w:tcPr>
+          <w:p>
+            <w:pPr>
+              <w:keepNext/>
+              <w:spacing w:after="0" w:before="0"/>
+            </w:pPr>
+            <w:r>
+              <w:rPr>
+                <w:rFonts w:ascii="Arial" w:cs="Arial" w:eastAsia="Arial" w:hAnsi="Arial"/>
+                <w:sz w:val="18"/>
+                <w:szCs w:val="18"/>
+              </w:rPr>
+              <w:t xml:space="preserve">It Still Moves</w:t>
+            </w:r>
+          </w:p>
+        </w:tc>
+        <w:tc>
+          <w:tcPr>
+            <w:tcW w:type="dxa" w:w="1600"/>
+            <w:tcBorders>
+              <w:top w:val="single" w:color="B7B7B7" w:sz="4"/>
+              <w:left w:val="single" w:color="B7B7B7" w:sz="4"/>
+              <w:bottom w:val="single" w:color="B7B7B7" w:sz="4"/>
+              <w:right w:val="single" w:color="B7B7B7" w:sz="4"/>
+            </w:tcBorders>
+            <w:tcMar>
+              <w:top w:type="dxa" w:w="50"/>
+              <w:left w:type="dxa" w:w="90"/>
+              <w:bottom w:type="dxa" w:w="50"/>
+              <w:right w:type="dxa" w:w="90"/>
+            </w:tcMar>
+            <w:vAlign w:val="center"/>
+          </w:tcPr>
+          <w:p>
+            <w:pPr>
+              <w:keepNext/>
+              <w:spacing w:after="0" w:before="0"/>
+            </w:pPr>
+            <w:r>
+              <w:rPr>
+                <w:rFonts w:ascii="Arial" w:cs="Arial" w:eastAsia="Arial" w:hAnsi="Arial"/>
+                <w:sz w:val="18"/>
+                <w:szCs w:val="18"/>
+              </w:rPr>
+              <w:t xml:space="preserve">Ato Records</w:t>
+            </w:r>
+          </w:p>
+        </w:tc>
+        <w:tc>
+          <w:tcPr>
+            <w:tcW w:type="dxa" w:w="900"/>
+            <w:tcBorders>
+              <w:top w:val="single" w:color="B7B7B7" w:sz="4"/>
+              <w:left w:val="single" w:color="B7B7B7" w:sz="4"/>
+              <w:bottom w:val="single" w:color="B7B7B7" w:sz="4"/>
+              <w:right w:val="single" w:color="B7B7B7" w:sz="4"/>
+            </w:tcBorders>
+            <w:tcMar>
+              <w:top w:type="dxa" w:w="50"/>
+              <w:left w:type="dxa" w:w="90"/>
+              <w:bottom w:type="dxa" w:w="50"/>
+              <w:right w:type="dxa" w:w="90"/>
+            </w:tcMar>
+            <w:vAlign w:val="center"/>
+          </w:tcPr>
+          <w:p>
+            <w:pPr>
+              <w:keepNext/>
+              <w:spacing w:after="0" w:before="0"/>
+            </w:pPr>
+            <w:r>
+              <w:rPr>
+                <w:rFonts w:ascii="Arial" w:cs="Arial" w:eastAsia="Arial" w:hAnsi="Arial"/>
+                <w:sz w:val="18"/>
+                <w:szCs w:val="18"/>
+              </w:rPr>
+              <w:t xml:space="preserve">722281</w:t>
+            </w:r>
+          </w:p>
+        </w:tc>
+        <w:tc>
+          <w:tcPr>
+            <w:tcW w:type="dxa" w:w="650"/>
+            <w:tcBorders>
+              <w:top w:val="single" w:color="B7B7B7" w:sz="4"/>
+              <w:left w:val="single" w:color="B7B7B7" w:sz="4"/>
+              <w:bottom w:val="single" w:color="B7B7B7" w:sz="4"/>
+              <w:right w:val="single" w:color="B7B7B7" w:sz="4"/>
+            </w:tcBorders>
+            <w:tcMar>
+              <w:top w:type="dxa" w:w="50"/>
+              <w:left w:type="dxa" w:w="90"/>
+              <w:bottom w:type="dxa" w:w="50"/>
+              <w:right w:type="dxa" w:w="90"/>
+            </w:tcMar>
+            <w:vAlign w:val="center"/>
+          </w:tcPr>
+          <w:p>
+            <w:pPr>
+              <w:keepNext/>
+              <w:spacing w:after="0" w:before="0"/>
+            </w:pPr>
+            <w:r>
+              <w:rPr>
+                <w:rFonts w:ascii="Arial" w:cs="Arial" w:eastAsia="Arial" w:hAnsi="Arial"/>
+                <w:sz w:val="18"/>
+                <w:szCs w:val="18"/>
+              </w:rPr>
+              <w:t xml:space="preserve">5:57</w:t>
+            </w:r>
+          </w:p>
+        </w:tc>
+        <w:tc>
+          <w:tcPr>
+            <w:tcW w:type="dxa" w:w="1300"/>
+            <w:tcBorders>
+              <w:top w:val="single" w:color="B7B7B7" w:sz="4"/>
+              <w:left w:val="single" w:color="B7B7B7" w:sz="4"/>
+              <w:bottom w:val="single" w:color="B7B7B7" w:sz="4"/>
+              <w:right w:val="single" w:color="B7B7B7" w:sz="4"/>
+            </w:tcBorders>
+            <w:tcMar>
+              <w:top w:type="dxa" w:w="50"/>
+              <w:left w:type="dxa" w:w="90"/>
+              <w:bottom w:type="dxa" w:w="50"/>
+              <w:right w:type="dxa" w:w="90"/>
+            </w:tcMar>
+            <w:vAlign w:val="center"/>
+          </w:tcPr>
+          <w:p>
+            <w:pPr>
+              <w:keepNext/>
+              <w:spacing w:after="0" w:before="0"/>
+            </w:pPr>
+            <w:r>
+              <w:rPr>
+                <w:rFonts w:ascii="Arial" w:cs="Arial" w:eastAsia="Arial" w:hAnsi="Arial"/>
+                <w:b/>
+                <w:bCs/>
+                <w:color w:val="1B7F3B"/>
+                <w:sz w:val="18"/>
+                <w:szCs w:val="18"/>
+              </w:rPr>
+              <w:t xml:space="preserve">CLEAN</w:t>
+            </w:r>
+          </w:p>
+        </w:tc>
+        <w:tc>
+          <w:tcPr>
+            <w:tcW w:type="dxa" w:w="3000"/>
+            <w:tcBorders>
+              <w:top w:val="single" w:color="B7B7B7" w:sz="4"/>
+              <w:left w:val="single" w:color="B7B7B7" w:sz="4"/>
+              <w:bottom w:val="single" w:color="B7B7B7" w:sz="4"/>
+              <w:right w:val="single" w:color="B7B7B7" w:sz="4"/>
+            </w:tcBorders>
+            <w:tcMar>
+              <w:top w:type="dxa" w:w="50"/>
+              <w:left w:type="dxa" w:w="90"/>
+              <w:bottom w:type="dxa" w:w="50"/>
+              <w:right w:type="dxa" w:w="90"/>
+            </w:tcMar>
+            <w:vAlign w:val="center"/>
+          </w:tcPr>
+          <w:p>
+            <w:pPr>
+              <w:keepNext/>
+              <w:spacing w:after="0" w:before="0"/>
+            </w:pPr>
+            <w:r>
+              <w:rPr>
+                <w:rFonts w:ascii="Arial" w:cs="Arial" w:eastAsia="Arial" w:hAnsi="Arial"/>
+                <w:sz w:val="16"/>
+                <w:szCs w:val="16"/>
+              </w:rPr>
+              <w:t xml:space="preserve">Added by DJ Stace (Air Order, seen Oct. 8). MMJ plays the Fillmore, S.F., Oct. 9, 10 and 11.</w:t>
+            </w:r>
+          </w:p>
+        </w:tc>
+      </w:tr>
+      <w:tr>
+        <w:trPr>
+          <w:cantSplit/>
+        </w:trPr>
+        <w:tc>
+          <w:tcPr>
+            <w:tcW w:type="dxa" w:w="450"/>
+            <w:tcBorders>
+              <w:top w:val="single" w:color="B7B7B7" w:sz="4"/>
+              <w:left w:val="single" w:color="B7B7B7" w:sz="4"/>
+              <w:bottom w:val="single" w:color="B7B7B7" w:sz="4"/>
+              <w:right w:val="single" w:color="B7B7B7" w:sz="4"/>
+            </w:tcBorders>
+            <w:shd w:fill="F5F7FA" w:color="auto" w:val="clear"/>
+            <w:tcMar>
+              <w:top w:type="dxa" w:w="50"/>
+              <w:left w:type="dxa" w:w="90"/>
+              <w:bottom w:type="dxa" w:w="50"/>
+              <w:right w:type="dxa" w:w="90"/>
+            </w:tcMar>
+            <w:vAlign w:val="center"/>
+          </w:tcPr>
+          <w:p>
+            <w:pPr>
+              <w:keepNext w:val="false"/>
+              <w:spacing w:after="0" w:before="0"/>
+            </w:pPr>
+            <w:r>
+              <w:rPr>
+                <w:rFonts w:ascii="Arial" w:cs="Arial" w:eastAsia="Arial" w:hAnsi="Arial"/>
+                <w:b/>
+                <w:bCs/>
+                <w:sz w:val="18"/>
+                <w:szCs w:val="18"/>
+              </w:rPr>
+              <w:t xml:space="preserve">44</w:t>
+            </w:r>
+          </w:p>
+        </w:tc>
+        <w:tc>
+          <w:tcPr>
+            <w:tcW w:type="dxa" w:w="1800"/>
+            <w:tcBorders>
+              <w:top w:val="single" w:color="B7B7B7" w:sz="4"/>
+              <w:left w:val="single" w:color="B7B7B7" w:sz="4"/>
+              <w:bottom w:val="single" w:color="B7B7B7" w:sz="4"/>
+              <w:right w:val="single" w:color="B7B7B7" w:sz="4"/>
+            </w:tcBorders>
+            <w:shd w:fill="F5F7FA" w:color="auto" w:val="clear"/>
+            <w:tcMar>
+              <w:top w:type="dxa" w:w="50"/>
+              <w:left w:type="dxa" w:w="90"/>
+              <w:bottom w:type="dxa" w:w="50"/>
+              <w:right w:type="dxa" w:w="90"/>
+            </w:tcMar>
+            <w:vAlign w:val="center"/>
+          </w:tcPr>
+          <w:p>
+            <w:pPr>
+              <w:keepNext w:val="false"/>
+              <w:spacing w:after="0" w:before="0"/>
+            </w:pPr>
+            <w:r>
+              <w:rPr>
+                <w:rFonts w:ascii="Arial" w:cs="Arial" w:eastAsia="Arial" w:hAnsi="Arial"/>
+                <w:b/>
+                <w:bCs/>
+                <w:sz w:val="18"/>
+                <w:szCs w:val="18"/>
+              </w:rPr>
+              <w:t xml:space="preserve">BODEGA</w:t>
+            </w:r>
+          </w:p>
+        </w:tc>
+        <w:tc>
+          <w:tcPr>
+            <w:tcW w:type="dxa" w:w="2600"/>
+            <w:tcBorders>
+              <w:top w:val="single" w:color="B7B7B7" w:sz="4"/>
+              <w:left w:val="single" w:color="B7B7B7" w:sz="4"/>
+              <w:bottom w:val="single" w:color="B7B7B7" w:sz="4"/>
+              <w:right w:val="single" w:color="B7B7B7" w:sz="4"/>
+            </w:tcBorders>
+            <w:shd w:fill="F5F7FA" w:color="auto" w:val="clear"/>
+            <w:tcMar>
+              <w:top w:type="dxa" w:w="50"/>
+              <w:left w:type="dxa" w:w="90"/>
+              <w:bottom w:type="dxa" w:w="50"/>
+              <w:right w:type="dxa" w:w="90"/>
+            </w:tcMar>
+            <w:vAlign w:val="center"/>
+          </w:tcPr>
+          <w:p>
+            <w:pPr>
+              <w:keepNext w:val="false"/>
+              <w:spacing w:after="0" w:before="0"/>
+            </w:pPr>
+            <w:r>
+              <w:rPr>
+                <w:rFonts w:ascii="Arial" w:cs="Arial" w:eastAsia="Arial" w:hAnsi="Arial"/>
+                <w:b/>
+                <w:bCs/>
+                <w:sz w:val="20"/>
+                <w:szCs w:val="20"/>
+              </w:rPr>
+              <w:t xml:space="preserve">Slow Train</w:t>
+            </w:r>
+          </w:p>
+        </w:tc>
+        <w:tc>
+          <w:tcPr>
+            <w:tcW w:type="dxa" w:w="2100"/>
+            <w:tcBorders>
+              <w:top w:val="single" w:color="B7B7B7" w:sz="4"/>
+              <w:left w:val="single" w:color="B7B7B7" w:sz="4"/>
+              <w:bottom w:val="single" w:color="B7B7B7" w:sz="4"/>
+              <w:right w:val="single" w:color="B7B7B7" w:sz="4"/>
+            </w:tcBorders>
+            <w:shd w:fill="F5F7FA" w:color="auto" w:val="clear"/>
+            <w:tcMar>
+              <w:top w:type="dxa" w:w="50"/>
+              <w:left w:type="dxa" w:w="90"/>
+              <w:bottom w:type="dxa" w:w="50"/>
+              <w:right w:type="dxa" w:w="90"/>
+            </w:tcMar>
+            <w:vAlign w:val="center"/>
+          </w:tcPr>
+          <w:p>
+            <w:pPr>
+              <w:keepNext w:val="false"/>
+              <w:spacing w:after="0" w:before="0"/>
+            </w:pPr>
+            <w:r>
+              <w:rPr>
+                <w:rFonts w:ascii="Arial" w:cs="Arial" w:eastAsia="Arial" w:hAnsi="Arial"/>
+                <w:sz w:val="18"/>
+                <w:szCs w:val="18"/>
+              </w:rPr>
+              <w:t xml:space="preserve">All Inside Aquarium</w:t>
+            </w:r>
+          </w:p>
+        </w:tc>
+        <w:tc>
+          <w:tcPr>
+            <w:tcW w:type="dxa" w:w="1600"/>
+            <w:tcBorders>
+              <w:top w:val="single" w:color="B7B7B7" w:sz="4"/>
+              <w:left w:val="single" w:color="B7B7B7" w:sz="4"/>
+              <w:bottom w:val="single" w:color="B7B7B7" w:sz="4"/>
+              <w:right w:val="single" w:color="B7B7B7" w:sz="4"/>
+            </w:tcBorders>
+            <w:shd w:fill="F5F7FA" w:color="auto" w:val="clear"/>
+            <w:tcMar>
+              <w:top w:type="dxa" w:w="50"/>
+              <w:left w:type="dxa" w:w="90"/>
+              <w:bottom w:type="dxa" w:w="50"/>
+              <w:right w:type="dxa" w:w="90"/>
+            </w:tcMar>
+            <w:vAlign w:val="center"/>
+          </w:tcPr>
+          <w:p>
+            <w:pPr>
+              <w:keepNext w:val="false"/>
+              <w:spacing w:after="0" w:before="0"/>
+            </w:pPr>
+            <w:r>
+              <w:rPr>
+                <w:rFonts w:ascii="Arial" w:cs="Arial" w:eastAsia="Arial" w:hAnsi="Arial"/>
+                <w:sz w:val="18"/>
+                <w:szCs w:val="18"/>
+              </w:rPr>
+              <w:t xml:space="preserve">Chrysalis Records</w:t>
+            </w:r>
+          </w:p>
+        </w:tc>
+        <w:tc>
+          <w:tcPr>
+            <w:tcW w:type="dxa" w:w="900"/>
+            <w:tcBorders>
+              <w:top w:val="single" w:color="B7B7B7" w:sz="4"/>
+              <w:left w:val="single" w:color="B7B7B7" w:sz="4"/>
+              <w:bottom w:val="single" w:color="B7B7B7" w:sz="4"/>
+              <w:right w:val="single" w:color="B7B7B7" w:sz="4"/>
+            </w:tcBorders>
+            <w:shd w:fill="F5F7FA" w:color="auto" w:val="clear"/>
+            <w:tcMar>
+              <w:top w:type="dxa" w:w="50"/>
+              <w:left w:type="dxa" w:w="90"/>
+              <w:bottom w:type="dxa" w:w="50"/>
+              <w:right w:type="dxa" w:w="90"/>
+            </w:tcMar>
+            <w:vAlign w:val="center"/>
+          </w:tcPr>
+          <w:p>
+            <w:pPr>
+              <w:keepNext w:val="false"/>
+              <w:spacing w:after="0" w:before="0"/>
+            </w:pPr>
+            <w:r>
+              <w:rPr>
+                <w:rFonts w:ascii="Arial" w:cs="Arial" w:eastAsia="Arial" w:hAnsi="Arial"/>
+                <w:sz w:val="18"/>
+                <w:szCs w:val="18"/>
+              </w:rPr>
+              <w:t xml:space="preserve">-</w:t>
+            </w:r>
+          </w:p>
+        </w:tc>
+        <w:tc>
+          <w:tcPr>
+            <w:tcW w:type="dxa" w:w="650"/>
+            <w:tcBorders>
+              <w:top w:val="single" w:color="B7B7B7" w:sz="4"/>
+              <w:left w:val="single" w:color="B7B7B7" w:sz="4"/>
+              <w:bottom w:val="single" w:color="B7B7B7" w:sz="4"/>
+              <w:right w:val="single" w:color="B7B7B7" w:sz="4"/>
+            </w:tcBorders>
+            <w:shd w:fill="F5F7FA" w:color="auto" w:val="clear"/>
+            <w:tcMar>
+              <w:top w:type="dxa" w:w="50"/>
+              <w:left w:type="dxa" w:w="90"/>
+              <w:bottom w:type="dxa" w:w="50"/>
+              <w:right w:type="dxa" w:w="90"/>
+            </w:tcMar>
+            <w:vAlign w:val="center"/>
+          </w:tcPr>
+          <w:p>
+            <w:pPr>
+              <w:keepNext w:val="false"/>
+              <w:spacing w:after="0" w:before="0"/>
+            </w:pPr>
+            <w:r>
+              <w:rPr>
+                <w:rFonts w:ascii="Arial" w:cs="Arial" w:eastAsia="Arial" w:hAnsi="Arial"/>
+                <w:sz w:val="18"/>
+                <w:szCs w:val="18"/>
+              </w:rPr>
+              <w:t xml:space="preserve">3:52</w:t>
+            </w:r>
+          </w:p>
+        </w:tc>
+        <w:tc>
+          <w:tcPr>
+            <w:tcW w:type="dxa" w:w="1300"/>
+            <w:tcBorders>
+              <w:top w:val="single" w:color="B7B7B7" w:sz="4"/>
+              <w:left w:val="single" w:color="B7B7B7" w:sz="4"/>
+              <w:bottom w:val="single" w:color="B7B7B7" w:sz="4"/>
+              <w:right w:val="single" w:color="B7B7B7" w:sz="4"/>
+            </w:tcBorders>
+            <w:shd w:fill="FFF3CD" w:color="auto" w:val="clear"/>
+            <w:tcMar>
+              <w:top w:type="dxa" w:w="50"/>
+              <w:left w:type="dxa" w:w="90"/>
+              <w:bottom w:type="dxa" w:w="50"/>
+              <w:right w:type="dxa" w:w="90"/>
+            </w:tcMar>
+            <w:vAlign w:val="center"/>
+          </w:tcPr>
+          <w:p>
+            <w:pPr>
+              <w:keepNext w:val="false"/>
+              <w:spacing w:after="0" w:before="0"/>
+            </w:pPr>
+            <w:r>
+              <w:rPr>
+                <w:rFonts w:ascii="Arial" w:cs="Arial" w:eastAsia="Arial" w:hAnsi="Arial"/>
+                <w:b/>
+                <w:bCs/>
+                <w:color w:val="8A6100"/>
+                <w:sz w:val="18"/>
+                <w:szCs w:val="18"/>
+              </w:rPr>
+              <w:t xml:space="preserve">LISTEN FIRST</w:t>
+            </w:r>
+          </w:p>
+        </w:tc>
+        <w:tc>
+          <w:tcPr>
+            <w:tcW w:type="dxa" w:w="3000"/>
+            <w:tcBorders>
+              <w:top w:val="single" w:color="B7B7B7" w:sz="4"/>
+              <w:left w:val="single" w:color="B7B7B7" w:sz="4"/>
+              <w:bottom w:val="single" w:color="B7B7B7" w:sz="4"/>
+              <w:right w:val="single" w:color="B7B7B7" w:sz="4"/>
+            </w:tcBorders>
+            <w:shd w:fill="F5F7FA" w:color="auto" w:val="clear"/>
+            <w:tcMar>
+              <w:top w:type="dxa" w:w="50"/>
+              <w:left w:type="dxa" w:w="90"/>
+              <w:bottom w:type="dxa" w:w="50"/>
+              <w:right w:type="dxa" w:w="90"/>
+            </w:tcMar>
+            <w:vAlign w:val="center"/>
+          </w:tcPr>
+          <w:p>
+            <w:pPr>
+              <w:keepNext w:val="false"/>
+              <w:spacing w:after="0" w:before="0"/>
+            </w:pPr>
+            <w:r>
+              <w:rPr>
+                <w:rFonts w:ascii="Arial" w:cs="Arial" w:eastAsia="Arial" w:hAnsi="Arial"/>
+                <w:sz w:val="16"/>
+                <w:szCs w:val="16"/>
+              </w:rPr>
+              <w:t xml:space="preserve">Added by DJ Stace (Air Order, seen Oct. 8). Cover of Bob Dylan's "Slow Train" (1979). Album out Fri. Oct. 9.</w:t>
             </w:r>
           </w:p>
         </w:tc>
@@ -26173,10 +26997,12 @@
             <w:r>
               <w:rPr>
                 <w:rFonts w:ascii="Arial" w:cs="Arial" w:eastAsia="Arial" w:hAnsi="Arial"/>
-                <w:sz w:val="18"/>
-                <w:szCs w:val="18"/>
-              </w:rPr>
-              <w:t xml:space="preserve">Bodega, All Inside Aquarium</w:t>
+                <w:b/>
+                <w:bCs/>
+                <w:sz w:val="18"/>
+                <w:szCs w:val="18"/>
+              </w:rPr>
+              <w:t xml:space="preserve">Bodega, Slow Train</w:t>
             </w:r>
           </w:p>
         </w:tc>
@@ -26205,11 +27031,13 @@
             <w:r>
               <w:rPr>
                 <w:rFonts w:ascii="Arial" w:cs="Arial" w:eastAsia="Arial" w:hAnsi="Arial"/>
-                <w:color w:val="B00020"/>
-                <w:sz w:val="18"/>
-                <w:szCs w:val="18"/>
-              </w:rPr>
-              <w:t xml:space="preserve">fuck x2</w:t>
+                <w:b/>
+                <w:bCs/>
+                <w:color w:val="8A6100"/>
+                <w:sz w:val="18"/>
+                <w:szCs w:val="18"/>
+              </w:rPr>
+              <w:t xml:space="preserve">LISTEN FIRST</w:t>
             </w:r>
           </w:p>
         </w:tc>
@@ -26241,7 +27069,7 @@
                 <w:sz w:val="18"/>
                 <w:szCs w:val="18"/>
               </w:rPr>
-              <w:t xml:space="preserve">FCC Edit Needed</w:t>
+              <w:t xml:space="preserve">#44</w:t>
             </w:r>
           </w:p>
         </w:tc>
@@ -26273,7 +27101,7 @@
                 <w:sz w:val="18"/>
                 <w:szCs w:val="18"/>
               </w:rPr>
-              <w:t xml:space="preserve">Not airable as is.</w:t>
+              <w:t xml:space="preserve">Cover of Dylan's "Slow Train". Dylan's lyrics are clean; BODEGA's are not posted (album out Oct. 9).</w:t>
             </w:r>
           </w:p>
         </w:tc>
@@ -26309,7 +27137,7 @@
                 <w:sz w:val="18"/>
                 <w:szCs w:val="18"/>
               </w:rPr>
-              <w:t xml:space="preserve">Queens of the Stone Age, Easy Street</w:t>
+              <w:t xml:space="preserve">Bodega, All Inside Aquarium</w:t>
             </w:r>
           </w:p>
         </w:tc>
@@ -26341,7 +27169,7 @@
                 <w:sz w:val="18"/>
                 <w:szCs w:val="18"/>
               </w:rPr>
-              <w:t xml:space="preserve">fuck x1</w:t>
+              <w:t xml:space="preserve">fuck x2</w:t>
             </w:r>
           </w:p>
         </w:tc>
@@ -26403,7 +27231,7 @@
                 <w:sz w:val="18"/>
                 <w:szCs w:val="18"/>
               </w:rPr>
-              <w:t xml:space="preserve">Not airable as is.</w:t>
+              <w:t xml:space="preserve">Not airable as is. Slow Train replaces it in tonight's set.</w:t>
             </w:r>
           </w:p>
         </w:tc>
@@ -26440,7 +27268,7 @@
                 <w:sz w:val="18"/>
                 <w:szCs w:val="18"/>
               </w:rPr>
-              <w:t xml:space="preserve">Greg Freeman, Cahokia</w:t>
+              <w:t xml:space="preserve">Queens of the Stone Age, Easy Street</w:t>
             </w:r>
           </w:p>
         </w:tc>
@@ -26473,7 +27301,7 @@
                 <w:sz w:val="18"/>
                 <w:szCs w:val="18"/>
               </w:rPr>
-              <w:t xml:space="preserve">FCC</w:t>
+              <w:t xml:space="preserve">fuck x1</w:t>
             </w:r>
           </w:p>
         </w:tc>
@@ -26537,7 +27365,7 @@
                 <w:sz w:val="18"/>
                 <w:szCs w:val="18"/>
               </w:rPr>
-              <w:t xml:space="preserve">Added Oct. 4. Not airable as is.</w:t>
+              <w:t xml:space="preserve">Not airable as is.</w:t>
             </w:r>
           </w:p>
         </w:tc>
@@ -26573,7 +27401,7 @@
                 <w:sz w:val="18"/>
                 <w:szCs w:val="18"/>
               </w:rPr>
-              <w:t xml:space="preserve">Fontaines D.C., Tongue</w:t>
+              <w:t xml:space="preserve">Greg Freeman, Cahokia</w:t>
             </w:r>
           </w:p>
         </w:tc>
@@ -26605,7 +27433,7 @@
                 <w:sz w:val="18"/>
                 <w:szCs w:val="18"/>
               </w:rPr>
-              <w:t xml:space="preserve">shit x10 (Refrain)</w:t>
+              <w:t xml:space="preserve">FCC</w:t>
             </w:r>
           </w:p>
         </w:tc>
@@ -26667,7 +27495,7 @@
                 <w:sz w:val="18"/>
                 <w:szCs w:val="18"/>
               </w:rPr>
-              <w:t xml:space="preserve">Not airable as is.</w:t>
+              <w:t xml:space="preserve">Added Oct. 4. Not airable as is.</w:t>
             </w:r>
           </w:p>
         </w:tc>
@@ -26704,7 +27532,7 @@
                 <w:sz w:val="18"/>
                 <w:szCs w:val="18"/>
               </w:rPr>
-              <w:t xml:space="preserve">DIIV, Trillions</w:t>
+              <w:t xml:space="preserve">Fontaines D.C., Tongue</w:t>
             </w:r>
           </w:p>
         </w:tc>
@@ -26737,7 +27565,7 @@
                 <w:sz w:val="18"/>
                 <w:szCs w:val="18"/>
               </w:rPr>
-              <w:t xml:space="preserve">fucking x1</w:t>
+              <w:t xml:space="preserve">shit x10 (Refrain)</w:t>
             </w:r>
           </w:p>
         </w:tc>
@@ -26837,6 +27665,137 @@
                 <w:sz w:val="18"/>
                 <w:szCs w:val="18"/>
               </w:rPr>
+              <w:t xml:space="preserve">DIIV, Trillions</w:t>
+            </w:r>
+          </w:p>
+        </w:tc>
+        <w:tc>
+          <w:tcPr>
+            <w:tcW w:type="dxa" w:w="3200"/>
+            <w:tcBorders>
+              <w:top w:val="single" w:color="B7B7B7" w:sz="4"/>
+              <w:left w:val="single" w:color="B7B7B7" w:sz="4"/>
+              <w:bottom w:val="single" w:color="B7B7B7" w:sz="4"/>
+              <w:right w:val="single" w:color="B7B7B7" w:sz="4"/>
+            </w:tcBorders>
+            <w:tcMar>
+              <w:top w:type="dxa" w:w="50"/>
+              <w:left w:type="dxa" w:w="90"/>
+              <w:bottom w:type="dxa" w:w="50"/>
+              <w:right w:type="dxa" w:w="90"/>
+            </w:tcMar>
+            <w:vAlign w:val="center"/>
+          </w:tcPr>
+          <w:p>
+            <w:pPr>
+              <w:spacing w:after="0" w:before="0"/>
+            </w:pPr>
+            <w:r>
+              <w:rPr>
+                <w:rFonts w:ascii="Arial" w:cs="Arial" w:eastAsia="Arial" w:hAnsi="Arial"/>
+                <w:color w:val="B00020"/>
+                <w:sz w:val="18"/>
+                <w:szCs w:val="18"/>
+              </w:rPr>
+              <w:t xml:space="preserve">fucking x1</w:t>
+            </w:r>
+          </w:p>
+        </w:tc>
+        <w:tc>
+          <w:tcPr>
+            <w:tcW w:type="dxa" w:w="1900"/>
+            <w:tcBorders>
+              <w:top w:val="single" w:color="B7B7B7" w:sz="4"/>
+              <w:left w:val="single" w:color="B7B7B7" w:sz="4"/>
+              <w:bottom w:val="single" w:color="B7B7B7" w:sz="4"/>
+              <w:right w:val="single" w:color="B7B7B7" w:sz="4"/>
+            </w:tcBorders>
+            <w:tcMar>
+              <w:top w:type="dxa" w:w="50"/>
+              <w:left w:type="dxa" w:w="90"/>
+              <w:bottom w:type="dxa" w:w="50"/>
+              <w:right w:type="dxa" w:w="90"/>
+            </w:tcMar>
+            <w:vAlign w:val="center"/>
+          </w:tcPr>
+          <w:p>
+            <w:pPr>
+              <w:spacing w:after="0" w:before="0"/>
+            </w:pPr>
+            <w:r>
+              <w:rPr>
+                <w:rFonts w:ascii="Arial" w:cs="Arial" w:eastAsia="Arial" w:hAnsi="Arial"/>
+                <w:sz w:val="18"/>
+                <w:szCs w:val="18"/>
+              </w:rPr>
+              <w:t xml:space="preserve">FCC Edit Needed</w:t>
+            </w:r>
+          </w:p>
+        </w:tc>
+        <w:tc>
+          <w:tcPr>
+            <w:tcW w:type="dxa" w:w="6500"/>
+            <w:tcBorders>
+              <w:top w:val="single" w:color="B7B7B7" w:sz="4"/>
+              <w:left w:val="single" w:color="B7B7B7" w:sz="4"/>
+              <w:bottom w:val="single" w:color="B7B7B7" w:sz="4"/>
+              <w:right w:val="single" w:color="B7B7B7" w:sz="4"/>
+            </w:tcBorders>
+            <w:tcMar>
+              <w:top w:type="dxa" w:w="50"/>
+              <w:left w:type="dxa" w:w="90"/>
+              <w:bottom w:type="dxa" w:w="50"/>
+              <w:right w:type="dxa" w:w="90"/>
+            </w:tcMar>
+            <w:vAlign w:val="center"/>
+          </w:tcPr>
+          <w:p>
+            <w:pPr>
+              <w:spacing w:after="0" w:before="0"/>
+            </w:pPr>
+            <w:r>
+              <w:rPr>
+                <w:rFonts w:ascii="Arial" w:cs="Arial" w:eastAsia="Arial" w:hAnsi="Arial"/>
+                <w:sz w:val="18"/>
+                <w:szCs w:val="18"/>
+              </w:rPr>
+              <w:t xml:space="preserve">Not airable as is.</w:t>
+            </w:r>
+          </w:p>
+        </w:tc>
+      </w:tr>
+      <w:tr>
+        <w:trPr>
+          <w:cantSplit/>
+        </w:trPr>
+        <w:tc>
+          <w:tcPr>
+            <w:tcW w:type="dxa" w:w="2800"/>
+            <w:tcBorders>
+              <w:top w:val="single" w:color="B7B7B7" w:sz="4"/>
+              <w:left w:val="single" w:color="B7B7B7" w:sz="4"/>
+              <w:bottom w:val="single" w:color="B7B7B7" w:sz="4"/>
+              <w:right w:val="single" w:color="B7B7B7" w:sz="4"/>
+            </w:tcBorders>
+            <w:shd w:fill="F5F7FA" w:color="auto" w:val="clear"/>
+            <w:tcMar>
+              <w:top w:type="dxa" w:w="50"/>
+              <w:left w:type="dxa" w:w="90"/>
+              <w:bottom w:type="dxa" w:w="50"/>
+              <w:right w:type="dxa" w:w="90"/>
+            </w:tcMar>
+            <w:vAlign w:val="center"/>
+          </w:tcPr>
+          <w:p>
+            <w:pPr>
+              <w:spacing w:after="0" w:before="0"/>
+            </w:pPr>
+            <w:r>
+              <w:rPr>
+                <w:rFonts w:ascii="Arial" w:cs="Arial" w:eastAsia="Arial" w:hAnsi="Arial"/>
+                <w:sz w:val="18"/>
+                <w:szCs w:val="18"/>
+              </w:rPr>
               <w:t xml:space="preserve">Spanish Love Songs, Doom Tripping</w:t>
             </w:r>
           </w:p>
@@ -26850,6 +27809,7 @@
               <w:bottom w:val="single" w:color="B7B7B7" w:sz="4"/>
               <w:right w:val="single" w:color="B7B7B7" w:sz="4"/>
             </w:tcBorders>
+            <w:shd w:fill="F5F7FA" w:color="auto" w:val="clear"/>
             <w:tcMar>
               <w:top w:type="dxa" w:w="50"/>
               <w:left w:type="dxa" w:w="90"/>
@@ -26882,6 +27842,7 @@
               <w:bottom w:val="single" w:color="B7B7B7" w:sz="4"/>
               <w:right w:val="single" w:color="B7B7B7" w:sz="4"/>
             </w:tcBorders>
+            <w:shd w:fill="F5F7FA" w:color="auto" w:val="clear"/>
             <w:tcMar>
               <w:top w:type="dxa" w:w="50"/>
               <w:left w:type="dxa" w:w="90"/>
@@ -26913,6 +27874,7 @@
               <w:bottom w:val="single" w:color="B7B7B7" w:sz="4"/>
               <w:right w:val="single" w:color="B7B7B7" w:sz="4"/>
             </w:tcBorders>
+            <w:shd w:fill="F5F7FA" w:color="auto" w:val="clear"/>
             <w:tcMar>
               <w:top w:type="dxa" w:w="50"/>
               <w:left w:type="dxa" w:w="90"/>

</xml_diff>